<commit_message>
Handleidingen: H1 als documenttitel, geen dubbele inhoudsopgave, harde regelbreuk bij Waar/Wie
</commit_message>
<xml_diff>
--- a/docs/handleiding/word/handleiding_penningmeester.docx
+++ b/docs/handleiding/word/handleiding_penningmeester.docx
@@ -10,47 +10,6 @@
         <w:rPr>
           <w:lang w:val="nl"/>
         </w:rPr>
-        <w:t xml:space="preserve">Handleiding penningmeester</w:t>
-      </w:r>
-    </w:p>
-    <w:sdt>
-      <w:sdtPr>
-        <w:docPartObj>
-          <w:docPartGallery w:val="Table of Contents"/>
-          <w:docPartUnique/>
-        </w:docPartObj>
-      </w:sdtPr>
-      <w:sdtContent>
-        <w:p>
-          <w:pPr>
-            <w:pStyle w:val="TOCHeading"/>
-          </w:pPr>
-          <w:r>
-            <w:rPr>
-              <w:lang w:val="nl"/>
-            </w:rPr>
-            <w:t xml:space="preserve">Table of Contents</w:t>
-          </w:r>
-        </w:p>
-        <w:p>
-          <w:r>
-            <w:fldChar w:fldCharType="begin" w:dirty="true"/>
-            <w:instrText xml:space="preserve">TOC \o "1-2" \h \z \u</w:instrText>
-            <w:fldChar w:fldCharType="separate"/>
-            <w:fldChar w:fldCharType="end"/>
-          </w:r>
-        </w:p>
-      </w:sdtContent>
-    </w:sdt>
-    <w:bookmarkStart w:id="20" w:name="handleiding-penningmeester--loondossiers"/>
-    <w:p>
-      <w:pPr>
-        <w:pStyle w:val="Heading1"/>
-      </w:pPr>
-      <w:r>
-        <w:rPr>
-          <w:lang w:val="nl"/>
-        </w:rPr>
         <w:t xml:space="preserve">Handleiding penningmeester — Loondossiers</w:t>
       </w:r>
     </w:p>
@@ -123,7 +82,7 @@
     <w:bookmarkStart w:id="9" w:name="inhoud"/>
     <w:p>
       <w:pPr>
-        <w:pStyle w:val="Heading2"/>
+        <w:pStyle w:val="Heading1"/>
       </w:pPr>
       <w:r>
         <w:rPr>
@@ -323,7 +282,7 @@
     <w:bookmarkStart w:id="10" w:name="inloggen"/>
     <w:p>
       <w:pPr>
-        <w:pStyle w:val="Heading2"/>
+        <w:pStyle w:val="Heading1"/>
       </w:pPr>
       <w:r>
         <w:rPr>
@@ -358,10 +317,7 @@
         <w:t xml:space="preserve">https://sollicitatie.paal13.com/admin/</w:t>
       </w:r>
       <w:r>
-        <w:rPr>
-          <w:lang w:val="nl"/>
-        </w:rPr>
-        <w:t xml:space="preserve"> </w:t>
+        <w:br/>
       </w:r>
       <w:r>
         <w:rPr>
@@ -488,7 +444,7 @@
     <w:bookmarkStart w:id="11" w:name="wat-er-in-een-loondossier-zit"/>
     <w:p>
       <w:pPr>
-        <w:pStyle w:val="Heading2"/>
+        <w:pStyle w:val="Heading1"/>
       </w:pPr>
       <w:r>
         <w:rPr>
@@ -796,7 +752,7 @@
     <w:bookmarkStart w:id="12" w:name="wanneer-je-een-melding-krijgt"/>
     <w:p>
       <w:pPr>
-        <w:pStyle w:val="Heading2"/>
+        <w:pStyle w:val="Heading1"/>
       </w:pPr>
       <w:r>
         <w:rPr>
@@ -893,7 +849,7 @@
     <w:bookmarkStart w:id="13" w:name="het-scherm-loondossiers"/>
     <w:p>
       <w:pPr>
-        <w:pStyle w:val="Heading2"/>
+        <w:pStyle w:val="Heading1"/>
       </w:pPr>
       <w:r>
         <w:rPr>
@@ -1087,7 +1043,7 @@
     <w:bookmarkStart w:id="14" w:name="stukken-downloaden"/>
     <w:p>
       <w:pPr>
-        <w:pStyle w:val="Heading2"/>
+        <w:pStyle w:val="Heading1"/>
       </w:pPr>
       <w:r>
         <w:rPr>
@@ -1233,7 +1189,7 @@
     <w:bookmarkStart w:id="15" w:name="een-dossier-verwerken"/>
     <w:p>
       <w:pPr>
-        <w:pStyle w:val="Heading2"/>
+        <w:pStyle w:val="Heading1"/>
       </w:pPr>
       <w:r>
         <w:rPr>
@@ -1425,7 +1381,7 @@
     <w:bookmarkStart w:id="16" w:name="bankpas-vernietigen"/>
     <w:p>
       <w:pPr>
-        <w:pStyle w:val="Heading2"/>
+        <w:pStyle w:val="Heading1"/>
       </w:pPr>
       <w:r>
         <w:rPr>
@@ -1487,7 +1443,7 @@
     <w:bookmarkStart w:id="17" w:name="bewaartermijnen-en-verwijderen"/>
     <w:p>
       <w:pPr>
-        <w:pStyle w:val="Heading2"/>
+        <w:pStyle w:val="Heading1"/>
       </w:pPr>
       <w:r>
         <w:rPr>
@@ -1693,7 +1649,7 @@
     <w:bookmarkStart w:id="18" w:name="wat-je-nooit-doet"/>
     <w:p>
       <w:pPr>
-        <w:pStyle w:val="Heading2"/>
+        <w:pStyle w:val="Heading1"/>
       </w:pPr>
       <w:r>
         <w:rPr>
@@ -1766,7 +1722,7 @@
     <w:bookmarkStart w:id="19" w:name="veelgestelde-vragen"/>
     <w:p>
       <w:pPr>
-        <w:pStyle w:val="Heading2"/>
+        <w:pStyle w:val="Heading1"/>
       </w:pPr>
       <w:r>
         <w:rPr>
@@ -1997,7 +1953,6 @@
       </w:r>
     </w:p>
     <w:bookmarkEnd w:id="19"/>
-    <w:bookmarkEnd w:id="20"/>
     <w:sectPr>
       <w:footnotePr>
         <w:numRestart w:val="eachSect"/>

</xml_diff>

<commit_message>
Handleidingen: regelbreuken in FAQ, loondossiers tonen alleen het actieve seizoen
</commit_message>
<xml_diff>
--- a/docs/handleiding/word/handleiding_penningmeester.docx
+++ b/docs/handleiding/word/handleiding_penningmeester.docx
@@ -1744,10 +1744,7 @@
         <w:t xml:space="preserve">Een dossier blijft oranje terwijl de strandwacht zegt dat alles is geüpload.</w:t>
       </w:r>
       <w:r>
-        <w:rPr>
-          <w:lang w:val="nl"/>
-        </w:rPr>
-        <w:t xml:space="preserve"> </w:t>
+        <w:br/>
       </w:r>
       <w:r>
         <w:rPr>
@@ -1781,10 +1778,7 @@
         <w:t xml:space="preserve">De strandwacht krijgt geen verificatiecode.</w:t>
       </w:r>
       <w:r>
-        <w:rPr>
-          <w:lang w:val="nl"/>
-        </w:rPr>
-        <w:t xml:space="preserve"> </w:t>
+        <w:br/>
       </w:r>
       <w:r>
         <w:rPr>
@@ -1830,10 +1824,7 @@
         <w:t xml:space="preserve">Ik zie een watermerk op de ID-kopie. Kan dat weg?</w:t>
       </w:r>
       <w:r>
-        <w:rPr>
-          <w:lang w:val="nl"/>
-        </w:rPr>
-        <w:t xml:space="preserve"> </w:t>
+        <w:br/>
       </w:r>
       <w:r>
         <w:rPr>
@@ -1867,28 +1858,25 @@
         <w:t xml:space="preserve">Het formulier van vorig jaar staat er niet meer.</w:t>
       </w:r>
       <w:r>
-        <w:rPr>
-          <w:lang w:val="nl"/>
-        </w:rPr>
-        <w:t xml:space="preserve"> </w:t>
-      </w:r>
-      <w:r>
-        <w:rPr>
-          <w:lang w:val="nl"/>
-        </w:rPr>
-        <w:t xml:space="preserve">Loondossiers staan per seizoen. Oudere seizoenen ziet de admin via het seizoenfilter; na de</w:t>
-      </w:r>
-      <w:r>
-        <w:rPr>
-          <w:lang w:val="nl"/>
-        </w:rPr>
-        <w:t xml:space="preserve"> </w:t>
-      </w:r>
-      <w:r>
-        <w:rPr>
-          <w:lang w:val="nl"/>
-        </w:rPr>
-        <w:t xml:space="preserve">bewaartermijn zijn ze definitief weg.</w:t>
+        <w:br/>
+      </w:r>
+      <w:r>
+        <w:rPr>
+          <w:lang w:val="nl"/>
+        </w:rPr>
+        <w:t xml:space="preserve">Het scherm toont het actieve seizoen. Stukken van eerdere seizoenen blijven in de kluis tot de</w:t>
+      </w:r>
+      <w:r>
+        <w:rPr>
+          <w:lang w:val="nl"/>
+        </w:rPr>
+        <w:t xml:space="preserve"> </w:t>
+      </w:r>
+      <w:r>
+        <w:rPr>
+          <w:lang w:val="nl"/>
+        </w:rPr>
+        <w:t xml:space="preserve">bewaartermijn is verstreken; vraag de admin als je ze nodig hebt.</w:t>
       </w:r>
     </w:p>
     <w:p>
@@ -1904,10 +1892,7 @@
         <w:t xml:space="preserve">Is de PDF echt door de strandwacht ondertekend?</w:t>
       </w:r>
       <w:r>
-        <w:rPr>
-          <w:lang w:val="nl"/>
-        </w:rPr>
-        <w:t xml:space="preserve"> </w:t>
+        <w:br/>
       </w:r>
       <w:r>
         <w:rPr>

</xml_diff>

<commit_message>
Handleidingen bijgewerkt naar 2.100 (2.100.0)
Alle vijf nagelopen tegen de code. Beheer: nieuwe hoofdstukken Aan de slag, Het seizoen in stappen,
Het dossier, Trainingsweekend, Bewaartermijnen, Woordenlijst; elk hoofdstuk begint met 'In het kort'.
Penningmeester, sollicitant (B1), wervingspagina's en runbook (onderhoudskalender, datalek) bijgewerkt.
HTML + Word opnieuw gegenereerd.
</commit_message>
<xml_diff>
--- a/docs/handleiding/word/handleiding_penningmeester.docx
+++ b/docs/handleiding/word/handleiding_penningmeester.docx
@@ -21,7 +21,7 @@
         <w:rPr>
           <w:lang w:val="nl"/>
         </w:rPr>
-        <w:t xml:space="preserve">Versie 2.94.0 · september 2026</w:t>
+        <w:t xml:space="preserve">Versie 2.99 · september 2026</w:t>
       </w:r>
     </w:p>
     <w:p>
@@ -32,7 +32,7 @@
         <w:rPr>
           <w:lang w:val="nl"/>
         </w:rPr>
-        <w:t xml:space="preserve">Deze handleiding is voor de penningmeester. Je gebruikt één scherm in het beheer:</w:t>
+        <w:t xml:space="preserve">Deze handleiding is voor de penningmeester. Je werkt vooral op één scherm in het beheer:</w:t>
       </w:r>
       <w:r>
         <w:rPr>
@@ -52,31 +52,31 @@
         <w:rPr>
           <w:lang w:val="nl"/>
         </w:rPr>
-        <w:t xml:space="preserve">.</w:t>
-      </w:r>
-      <w:r>
-        <w:rPr>
-          <w:lang w:val="nl"/>
-        </w:rPr>
-        <w:t xml:space="preserve"> </w:t>
-      </w:r>
-      <w:r>
-        <w:rPr>
-          <w:lang w:val="nl"/>
-        </w:rPr>
-        <w:t xml:space="preserve">Daar staat per aangenomen strandwacht alles wat de loonadministratie nodig heeft. De rest van het</w:t>
-      </w:r>
-      <w:r>
-        <w:rPr>
-          <w:lang w:val="nl"/>
-        </w:rPr>
-        <w:t xml:space="preserve"> </w:t>
-      </w:r>
-      <w:r>
-        <w:rPr>
-          <w:lang w:val="nl"/>
-        </w:rPr>
-        <w:t xml:space="preserve">beheer zie je niet, en dat is de bedoeling: alleen jij en de admin kunnen deze stukken inzien.</w:t>
+        <w:t xml:space="preserve">. Daar staat per aangenomen strandwacht alles wat de loonadministratie nodig</w:t>
+      </w:r>
+      <w:r>
+        <w:rPr>
+          <w:lang w:val="nl"/>
+        </w:rPr>
+        <w:t xml:space="preserve"> </w:t>
+      </w:r>
+      <w:r>
+        <w:rPr>
+          <w:lang w:val="nl"/>
+        </w:rPr>
+        <w:t xml:space="preserve">heeft. Alleen de penningmeester en de admin kunnen deze stukken inzien; het bestuur ziet dit</w:t>
+      </w:r>
+      <w:r>
+        <w:rPr>
+          <w:lang w:val="nl"/>
+        </w:rPr>
+        <w:t xml:space="preserve"> </w:t>
+      </w:r>
+      <w:r>
+        <w:rPr>
+          <w:lang w:val="nl"/>
+        </w:rPr>
+        <w:t xml:space="preserve">scherm niet.</w:t>
       </w:r>
     </w:p>
     <w:bookmarkStart w:id="9" w:name="inhoud"/>
@@ -90,6 +90,24 @@
         </w:rPr>
         <w:t xml:space="preserve">Inhoud</w:t>
       </w:r>
+    </w:p>
+    <w:p>
+      <w:pPr>
+        <w:pStyle w:val="Compact"/>
+        <w:numPr>
+          <w:ilvl w:val="0"/>
+          <w:numId w:val="1001"/>
+        </w:numPr>
+      </w:pPr>
+      <w:hyperlink w:anchor="aan-de-slag">
+        <w:r>
+          <w:rPr>
+            <w:rStyle w:val="Hyperlink"/>
+            <w:lang w:val="nl"/>
+          </w:rPr>
+          <w:t xml:space="preserve">Aan de slag</w:t>
+        </w:r>
+      </w:hyperlink>
     </w:p>
     <w:p>
       <w:pPr>
@@ -279,7 +297,7 @@
       </w:r>
     </w:p>
     <w:bookmarkEnd w:id="9"/>
-    <w:bookmarkStart w:id="10" w:name="inloggen"/>
+    <w:bookmarkStart w:id="10" w:name="aan-de-slag"/>
     <w:p>
       <w:pPr>
         <w:pStyle w:val="Heading1"/>
@@ -288,11 +306,707 @@
         <w:rPr>
           <w:lang w:val="nl"/>
         </w:rPr>
+        <w:t xml:space="preserve">Aan de slag</w:t>
+      </w:r>
+    </w:p>
+    <w:p>
+      <w:pPr>
+        <w:pStyle w:val="BlockText"/>
+      </w:pPr>
+      <w:r>
+        <w:rPr>
+          <w:b/>
+          <w:bCs/>
+          <w:lang w:val="nl"/>
+        </w:rPr>
+        <w:t xml:space="preserve">In het kort:</w:t>
+      </w:r>
+      <w:r>
+        <w:rPr>
+          <w:lang w:val="nl"/>
+        </w:rPr>
+        <w:t xml:space="preserve"> </w:t>
+      </w:r>
+      <w:r>
+        <w:rPr>
+          <w:lang w:val="nl"/>
+        </w:rPr>
+        <w:t xml:space="preserve">jij zet de gegevens van aangenomen strandwachten in de loonadministratie. Je</w:t>
+      </w:r>
+      <w:r>
+        <w:rPr>
+          <w:lang w:val="nl"/>
+        </w:rPr>
+        <w:t xml:space="preserve"> </w:t>
+      </w:r>
+      <w:r>
+        <w:rPr>
+          <w:lang w:val="nl"/>
+        </w:rPr>
+        <w:t xml:space="preserve">downloadt de stukken uit Loondossiers, verwerkt ze en markeert het dossier als verwerkt. De rest</w:t>
+      </w:r>
+      <w:r>
+        <w:rPr>
+          <w:lang w:val="nl"/>
+        </w:rPr>
+        <w:t xml:space="preserve"> </w:t>
+      </w:r>
+      <w:r>
+        <w:rPr>
+          <w:lang w:val="nl"/>
+        </w:rPr>
+        <w:t xml:space="preserve">gaat automatisch.</w:t>
+      </w:r>
+    </w:p>
+    <w:p>
+      <w:pPr>
+        <w:pStyle w:val="FirstParagraph"/>
+      </w:pPr>
+      <w:r>
+        <w:rPr>
+          <w:b/>
+          <w:bCs/>
+          <w:lang w:val="nl"/>
+        </w:rPr>
+        <w:t xml:space="preserve">Jouw rol.</w:t>
+      </w:r>
+      <w:r>
+        <w:rPr>
+          <w:lang w:val="nl"/>
+        </w:rPr>
+        <w:t xml:space="preserve"> </w:t>
+      </w:r>
+      <w:r>
+        <w:rPr>
+          <w:lang w:val="nl"/>
+        </w:rPr>
+        <w:t xml:space="preserve">Na het trainingsweekend neemt het bestuur strandwachten aan. Vanaf dat moment</w:t>
+      </w:r>
+      <w:r>
+        <w:rPr>
+          <w:lang w:val="nl"/>
+        </w:rPr>
+        <w:t xml:space="preserve"> </w:t>
+      </w:r>
+      <w:r>
+        <w:rPr>
+          <w:lang w:val="nl"/>
+        </w:rPr>
+        <w:t xml:space="preserve">leveren zij in het portaal hun loonheffingsformulier, een kopie van hun identiteitsbewijs en een</w:t>
+      </w:r>
+      <w:r>
+        <w:rPr>
+          <w:lang w:val="nl"/>
+        </w:rPr>
+        <w:t xml:space="preserve"> </w:t>
+      </w:r>
+      <w:r>
+        <w:rPr>
+          <w:lang w:val="nl"/>
+        </w:rPr>
+        <w:t xml:space="preserve">kopie van hun bankpas in. Jij haalt die stukken op, zet ze in de loonadministratie en markeert</w:t>
+      </w:r>
+      <w:r>
+        <w:rPr>
+          <w:lang w:val="nl"/>
+        </w:rPr>
+        <w:t xml:space="preserve"> </w:t>
+      </w:r>
+      <w:r>
+        <w:rPr>
+          <w:lang w:val="nl"/>
+        </w:rPr>
+        <w:t xml:space="preserve">het dossier daarna als verwerkt. Je beslist niet over aannemen of afwijzen; dat doet het bestuur.</w:t>
+      </w:r>
+    </w:p>
+    <w:p>
+      <w:pPr>
+        <w:pStyle w:val="BodyText"/>
+      </w:pPr>
+      <w:r>
+        <w:rPr>
+          <w:b/>
+          <w:bCs/>
+          <w:lang w:val="nl"/>
+        </w:rPr>
+        <w:t xml:space="preserve">Wat je doet, en wanneer:</w:t>
+      </w:r>
+    </w:p>
+    <w:p>
+      <w:pPr>
+        <w:pStyle w:val="Compact"/>
+        <w:numPr>
+          <w:ilvl w:val="0"/>
+          <w:numId w:val="1002"/>
+        </w:numPr>
+      </w:pPr>
+      <w:r>
+        <w:rPr>
+          <w:b/>
+          <w:bCs/>
+          <w:lang w:val="nl"/>
+        </w:rPr>
+        <w:t xml:space="preserve">Vóór het seizoen:</w:t>
+      </w:r>
+      <w:r>
+        <w:rPr>
+          <w:lang w:val="nl"/>
+        </w:rPr>
+        <w:t xml:space="preserve"> </w:t>
+      </w:r>
+      <w:r>
+        <w:rPr>
+          <w:lang w:val="nl"/>
+        </w:rPr>
+        <w:t xml:space="preserve">log één keer in (zie</w:t>
+      </w:r>
+      <w:r>
+        <w:rPr>
+          <w:lang w:val="nl"/>
+        </w:rPr>
+        <w:t xml:space="preserve"> </w:t>
+      </w:r>
+      <w:hyperlink w:anchor="inloggen">
+        <w:r>
+          <w:rPr>
+            <w:rStyle w:val="Hyperlink"/>
+            <w:lang w:val="nl"/>
+          </w:rPr>
+          <w:t xml:space="preserve">Inloggen</w:t>
+        </w:r>
+      </w:hyperlink>
+      <w:r>
+        <w:rPr>
+          <w:lang w:val="nl"/>
+        </w:rPr>
+        <w:t xml:space="preserve">) en controleer dat je</w:t>
+      </w:r>
+      <w:r>
+        <w:rPr>
+          <w:lang w:val="nl"/>
+        </w:rPr>
+        <w:t xml:space="preserve"> </w:t>
+      </w:r>
+      <w:r>
+        <w:rPr>
+          <w:lang w:val="nl"/>
+        </w:rPr>
+        <w:t xml:space="preserve">het menu-item Loondossiers ziet. Vraag het bestuur om jouw e-mailadres in te vullen als</w:t>
+      </w:r>
+      <w:r>
+        <w:rPr>
+          <w:lang w:val="nl"/>
+        </w:rPr>
+        <w:t xml:space="preserve"> </w:t>
+      </w:r>
+      <w:r>
+        <w:rPr>
+          <w:lang w:val="nl"/>
+        </w:rPr>
+        <w:t xml:space="preserve">penningmeester-adres (Instellingen › Afzender &amp; adressen). Anders gaan de meldingen naar het</w:t>
+      </w:r>
+      <w:r>
+        <w:rPr>
+          <w:lang w:val="nl"/>
+        </w:rPr>
+        <w:t xml:space="preserve"> </w:t>
+      </w:r>
+      <w:r>
+        <w:rPr>
+          <w:lang w:val="nl"/>
+        </w:rPr>
+        <w:t xml:space="preserve">bestuursadres.</w:t>
+      </w:r>
+    </w:p>
+    <w:p>
+      <w:pPr>
+        <w:pStyle w:val="Compact"/>
+        <w:numPr>
+          <w:ilvl w:val="0"/>
+          <w:numId w:val="1003"/>
+        </w:numPr>
+      </w:pPr>
+      <w:r>
+        <w:rPr>
+          <w:b/>
+          <w:bCs/>
+          <w:lang w:val="nl"/>
+        </w:rPr>
+        <w:t xml:space="preserve">Na het trainingsweekend (de aannames):</w:t>
+      </w:r>
+      <w:r>
+        <w:rPr>
+          <w:lang w:val="nl"/>
+        </w:rPr>
+        <w:t xml:space="preserve"> </w:t>
+      </w:r>
+      <w:r>
+        <w:rPr>
+          <w:lang w:val="nl"/>
+        </w:rPr>
+        <w:t xml:space="preserve">open Loondossiers. Elke aangenomen strandwacht</w:t>
+      </w:r>
+      <w:r>
+        <w:rPr>
+          <w:lang w:val="nl"/>
+        </w:rPr>
+        <w:t xml:space="preserve"> </w:t>
+      </w:r>
+      <w:r>
+        <w:rPr>
+          <w:lang w:val="nl"/>
+        </w:rPr>
+        <w:t xml:space="preserve">staat er, ook als er nog niets is ingeleverd.</w:t>
+      </w:r>
+    </w:p>
+    <w:p>
+      <w:pPr>
+        <w:pStyle w:val="Compact"/>
+        <w:numPr>
+          <w:ilvl w:val="0"/>
+          <w:numId w:val="1004"/>
+        </w:numPr>
+      </w:pPr>
+      <w:r>
+        <w:rPr>
+          <w:b/>
+          <w:bCs/>
+          <w:lang w:val="nl"/>
+        </w:rPr>
+        <w:t xml:space="preserve">Zodra er een mail "Loondossier compleet" komt:</w:t>
+      </w:r>
+      <w:r>
+        <w:rPr>
+          <w:lang w:val="nl"/>
+        </w:rPr>
+        <w:t xml:space="preserve"> </w:t>
+      </w:r>
+      <w:r>
+        <w:rPr>
+          <w:lang w:val="nl"/>
+        </w:rPr>
+        <w:t xml:space="preserve">klik op de knop in de mail. Je komt direct</w:t>
+      </w:r>
+      <w:r>
+        <w:rPr>
+          <w:lang w:val="nl"/>
+        </w:rPr>
+        <w:t xml:space="preserve"> </w:t>
+      </w:r>
+      <w:r>
+        <w:rPr>
+          <w:lang w:val="nl"/>
+        </w:rPr>
+        <w:t xml:space="preserve">bij het juiste dossier. Download de stukken en zet ze in de loonadministratie.</w:t>
+      </w:r>
+    </w:p>
+    <w:p>
+      <w:pPr>
+        <w:pStyle w:val="Compact"/>
+        <w:numPr>
+          <w:ilvl w:val="0"/>
+          <w:numId w:val="1005"/>
+        </w:numPr>
+      </w:pPr>
+      <w:r>
+        <w:rPr>
+          <w:b/>
+          <w:bCs/>
+          <w:lang w:val="nl"/>
+        </w:rPr>
+        <w:t xml:space="preserve">Direct daarna:</w:t>
+      </w:r>
+      <w:r>
+        <w:rPr>
+          <w:lang w:val="nl"/>
+        </w:rPr>
+        <w:t xml:space="preserve"> </w:t>
+      </w:r>
+      <w:r>
+        <w:rPr>
+          <w:lang w:val="nl"/>
+        </w:rPr>
+        <w:t xml:space="preserve">markeer het dossier als verwerkt en verwijder de gedownloade bestanden</w:t>
+      </w:r>
+      <w:r>
+        <w:rPr>
+          <w:lang w:val="nl"/>
+        </w:rPr>
+        <w:t xml:space="preserve"> </w:t>
+      </w:r>
+      <w:r>
+        <w:rPr>
+          <w:lang w:val="nl"/>
+        </w:rPr>
+        <w:t xml:space="preserve">van je computer.</w:t>
+      </w:r>
+    </w:p>
+    <w:p>
+      <w:pPr>
+        <w:pStyle w:val="Compact"/>
+        <w:numPr>
+          <w:ilvl w:val="0"/>
+          <w:numId w:val="1006"/>
+        </w:numPr>
+      </w:pPr>
+      <w:r>
+        <w:rPr>
+          <w:b/>
+          <w:bCs/>
+          <w:lang w:val="nl"/>
+        </w:rPr>
+        <w:t xml:space="preserve">Elke week, tot alles verwerkt is:</w:t>
+      </w:r>
+      <w:r>
+        <w:rPr>
+          <w:lang w:val="nl"/>
+        </w:rPr>
+        <w:t xml:space="preserve"> </w:t>
+      </w:r>
+      <w:r>
+        <w:rPr>
+          <w:lang w:val="nl"/>
+        </w:rPr>
+        <w:t xml:space="preserve">kijk in Loondossiers. De balk bovenaan zegt hoeveel</w:t>
+      </w:r>
+      <w:r>
+        <w:rPr>
+          <w:lang w:val="nl"/>
+        </w:rPr>
+        <w:t xml:space="preserve"> </w:t>
+      </w:r>
+      <w:r>
+        <w:rPr>
+          <w:lang w:val="nl"/>
+        </w:rPr>
+        <w:t xml:space="preserve">dossiers nog op verwerking wachten. Staat een dossier lang op oranje, laat het bestuur de</w:t>
+      </w:r>
+      <w:r>
+        <w:rPr>
+          <w:lang w:val="nl"/>
+        </w:rPr>
+        <w:t xml:space="preserve"> </w:t>
+      </w:r>
+      <w:r>
+        <w:rPr>
+          <w:lang w:val="nl"/>
+        </w:rPr>
+        <w:t xml:space="preserve">strandwacht dan herinneren.</w:t>
+      </w:r>
+    </w:p>
+    <w:p>
+      <w:pPr>
+        <w:pStyle w:val="Compact"/>
+        <w:numPr>
+          <w:ilvl w:val="0"/>
+          <w:numId w:val="1007"/>
+        </w:numPr>
+      </w:pPr>
+      <w:r>
+        <w:rPr>
+          <w:b/>
+          <w:bCs/>
+          <w:lang w:val="nl"/>
+        </w:rPr>
+        <w:t xml:space="preserve">Na het seizoen:</w:t>
+      </w:r>
+      <w:r>
+        <w:rPr>
+          <w:lang w:val="nl"/>
+        </w:rPr>
+        <w:t xml:space="preserve"> </w:t>
+      </w:r>
+      <w:r>
+        <w:rPr>
+          <w:lang w:val="nl"/>
+        </w:rPr>
+        <w:t xml:space="preserve">niets. Het bewaren en vernietigen gaat automatisch (zie</w:t>
+      </w:r>
+      <w:r>
+        <w:rPr>
+          <w:lang w:val="nl"/>
+        </w:rPr>
+        <w:t xml:space="preserve"> </w:t>
+      </w:r>
+      <w:hyperlink w:anchor="bewaartermijnen-en-verwijderen">
+        <w:r>
+          <w:rPr>
+            <w:rStyle w:val="Hyperlink"/>
+            <w:lang w:val="nl"/>
+          </w:rPr>
+          <w:t xml:space="preserve">Bewaartermijnen en verwijderen</w:t>
+        </w:r>
+      </w:hyperlink>
+      <w:r>
+        <w:rPr>
+          <w:lang w:val="nl"/>
+        </w:rPr>
+        <w:t xml:space="preserve">).</w:t>
+      </w:r>
+    </w:p>
+    <w:p>
+      <w:pPr>
+        <w:pStyle w:val="FirstParagraph"/>
+      </w:pPr>
+      <w:r>
+        <w:rPr>
+          <w:b/>
+          <w:bCs/>
+          <w:lang w:val="nl"/>
+        </w:rPr>
+        <w:t xml:space="preserve">Rondleiding.</w:t>
+      </w:r>
+      <w:r>
+        <w:rPr>
+          <w:lang w:val="nl"/>
+        </w:rPr>
+        <w:t xml:space="preserve"> </w:t>
+      </w:r>
+      <w:r>
+        <w:rPr>
+          <w:lang w:val="nl"/>
+        </w:rPr>
+        <w:t xml:space="preserve">In het beheer staat een interactieve rondleiding "Penningmeester: loondossiers".</w:t>
+      </w:r>
+      <w:r>
+        <w:rPr>
+          <w:lang w:val="nl"/>
+        </w:rPr>
+        <w:t xml:space="preserve"> </w:t>
+      </w:r>
+      <w:r>
+        <w:rPr>
+          <w:lang w:val="nl"/>
+        </w:rPr>
+        <w:t xml:space="preserve">Die loopt met je langs de echte schermen en wijst aan wat waar staat en wat jij moet doen. De</w:t>
+      </w:r>
+      <w:r>
+        <w:rPr>
+          <w:lang w:val="nl"/>
+        </w:rPr>
+        <w:t xml:space="preserve"> </w:t>
+      </w:r>
+      <w:r>
+        <w:rPr>
+          <w:lang w:val="nl"/>
+        </w:rPr>
+        <w:t xml:space="preserve">eerste keer staat hij op Vandaag klaar in het blok</w:t>
+      </w:r>
+      <w:r>
+        <w:rPr>
+          <w:lang w:val="nl"/>
+        </w:rPr>
+        <w:t xml:space="preserve"> </w:t>
+      </w:r>
+      <w:r>
+        <w:rPr>
+          <w:b/>
+          <w:bCs/>
+          <w:lang w:val="nl"/>
+        </w:rPr>
+        <w:t xml:space="preserve">Nieuw in het beheer?</w:t>
+      </w:r>
+      <w:r>
+        <w:rPr>
+          <w:lang w:val="nl"/>
+        </w:rPr>
+        <w:t xml:space="preserve">; daarna vind je hem</w:t>
+      </w:r>
+      <w:r>
+        <w:rPr>
+          <w:lang w:val="nl"/>
+        </w:rPr>
+        <w:t xml:space="preserve"> </w:t>
+      </w:r>
+      <w:r>
+        <w:rPr>
+          <w:lang w:val="nl"/>
+        </w:rPr>
+        <w:t xml:space="preserve">onder</w:t>
+      </w:r>
+      <w:r>
+        <w:rPr>
+          <w:lang w:val="nl"/>
+        </w:rPr>
+        <w:t xml:space="preserve"> </w:t>
+      </w:r>
+      <w:r>
+        <w:rPr>
+          <w:b/>
+          <w:bCs/>
+          <w:lang w:val="nl"/>
+        </w:rPr>
+        <w:t xml:space="preserve">Hulp en handleidingen</w:t>
+      </w:r>
+      <w:r>
+        <w:rPr>
+          <w:lang w:val="nl"/>
+        </w:rPr>
+        <w:t xml:space="preserve"> </w:t>
+      </w:r>
+      <w:r>
+        <w:rPr>
+          <w:lang w:val="nl"/>
+        </w:rPr>
+        <w:t xml:space="preserve">onderin het menu (of via het vraagteken rechtsboven ›</w:t>
+      </w:r>
+      <w:r>
+        <w:rPr>
+          <w:lang w:val="nl"/>
+        </w:rPr>
+        <w:t xml:space="preserve"> </w:t>
+      </w:r>
+      <w:r>
+        <w:rPr>
+          <w:b/>
+          <w:bCs/>
+          <w:lang w:val="nl"/>
+        </w:rPr>
+        <w:t xml:space="preserve">Alle</w:t>
+      </w:r>
+      <w:r>
+        <w:rPr>
+          <w:b/>
+          <w:bCs/>
+          <w:lang w:val="nl"/>
+        </w:rPr>
+        <w:t xml:space="preserve"> </w:t>
+      </w:r>
+      <w:r>
+        <w:rPr>
+          <w:b/>
+          <w:bCs/>
+          <w:lang w:val="nl"/>
+        </w:rPr>
+        <w:t xml:space="preserve">rondleidingen</w:t>
+      </w:r>
+      <w:r>
+        <w:rPr>
+          <w:lang w:val="nl"/>
+        </w:rPr>
+        <w:t xml:space="preserve">). Op het scherm Loondossiers kun je in het vraagteken ook</w:t>
+      </w:r>
+      <w:r>
+        <w:rPr>
+          <w:lang w:val="nl"/>
+        </w:rPr>
+        <w:t xml:space="preserve"> </w:t>
+      </w:r>
+      <w:r>
+        <w:rPr>
+          <w:b/>
+          <w:bCs/>
+          <w:lang w:val="nl"/>
+        </w:rPr>
+        <w:t xml:space="preserve">Rondleiding van dit</w:t>
+      </w:r>
+      <w:r>
+        <w:rPr>
+          <w:b/>
+          <w:bCs/>
+          <w:lang w:val="nl"/>
+        </w:rPr>
+        <w:t xml:space="preserve"> </w:t>
+      </w:r>
+      <w:r>
+        <w:rPr>
+          <w:b/>
+          <w:bCs/>
+          <w:lang w:val="nl"/>
+        </w:rPr>
+        <w:t xml:space="preserve">scherm</w:t>
+      </w:r>
+      <w:r>
+        <w:rPr>
+          <w:lang w:val="nl"/>
+        </w:rPr>
+        <w:t xml:space="preserve"> </w:t>
+      </w:r>
+      <w:r>
+        <w:rPr>
+          <w:lang w:val="nl"/>
+        </w:rPr>
+        <w:t xml:space="preserve">kiezen. Stoppen kan altijd met</w:t>
+      </w:r>
+      <w:r>
+        <w:rPr>
+          <w:lang w:val="nl"/>
+        </w:rPr>
+        <w:t xml:space="preserve"> </w:t>
+      </w:r>
+      <w:r>
+        <w:rPr>
+          <w:b/>
+          <w:bCs/>
+          <w:lang w:val="nl"/>
+        </w:rPr>
+        <w:t xml:space="preserve">Stoppen</w:t>
+      </w:r>
+      <w:r>
+        <w:rPr>
+          <w:lang w:val="nl"/>
+        </w:rPr>
+        <w:t xml:space="preserve"> </w:t>
+      </w:r>
+      <w:r>
+        <w:rPr>
+          <w:lang w:val="nl"/>
+        </w:rPr>
+        <w:t xml:space="preserve">of Esc.</w:t>
+      </w:r>
+    </w:p>
+    <w:bookmarkEnd w:id="10"/>
+    <w:bookmarkStart w:id="11" w:name="inloggen"/>
+    <w:p>
+      <w:pPr>
+        <w:pStyle w:val="Heading1"/>
+      </w:pPr>
+      <w:r>
+        <w:rPr>
+          <w:lang w:val="nl"/>
+        </w:rPr>
         <w:t xml:space="preserve">Inloggen</w:t>
       </w:r>
     </w:p>
     <w:p>
       <w:pPr>
+        <w:pStyle w:val="BlockText"/>
+      </w:pPr>
+      <w:r>
+        <w:rPr>
+          <w:b/>
+          <w:bCs/>
+          <w:lang w:val="nl"/>
+        </w:rPr>
+        <w:t xml:space="preserve">In het kort:</w:t>
+      </w:r>
+      <w:r>
+        <w:rPr>
+          <w:lang w:val="nl"/>
+        </w:rPr>
+        <w:t xml:space="preserve"> </w:t>
+      </w:r>
+      <w:r>
+        <w:rPr>
+          <w:lang w:val="nl"/>
+        </w:rPr>
+        <w:t xml:space="preserve">log in via Authentik op het beheer. Je ziet drie menu-items: Vandaag,</w:t>
+      </w:r>
+      <w:r>
+        <w:rPr>
+          <w:lang w:val="nl"/>
+        </w:rPr>
+        <w:t xml:space="preserve"> </w:t>
+      </w:r>
+      <w:r>
+        <w:rPr>
+          <w:lang w:val="nl"/>
+        </w:rPr>
+        <w:t xml:space="preserve">Sollicitanten en Loondossiers.</w:t>
+      </w:r>
+    </w:p>
+    <w:p>
+      <w:pPr>
         <w:pStyle w:val="FirstParagraph"/>
       </w:pPr>
       <w:r>
@@ -367,14 +1081,63 @@
         <w:rPr>
           <w:lang w:val="nl"/>
         </w:rPr>
-        <w:t xml:space="preserve">Kies "Inloggen via Authentik". Je komt in het beheer met alleen het menu-item</w:t>
-      </w:r>
-      <w:r>
-        <w:rPr>
-          <w:lang w:val="nl"/>
-        </w:rPr>
-        <w:t xml:space="preserve"> </w:t>
-      </w:r>
+        <w:t xml:space="preserve">Kies "Inloggen via Authentik". In het menu zie je:</w:t>
+      </w:r>
+    </w:p>
+    <w:p>
+      <w:pPr>
+        <w:pStyle w:val="Compact"/>
+        <w:numPr>
+          <w:ilvl w:val="0"/>
+          <w:numId w:val="1008"/>
+        </w:numPr>
+      </w:pPr>
+      <w:r>
+        <w:rPr>
+          <w:b/>
+          <w:bCs/>
+          <w:lang w:val="nl"/>
+        </w:rPr>
+        <w:t xml:space="preserve">Vandaag</w:t>
+      </w:r>
+      <w:r>
+        <w:rPr>
+          <w:lang w:val="nl"/>
+        </w:rPr>
+        <w:t xml:space="preserve">: het startscherm met de stand van het seizoen;</w:t>
+      </w:r>
+    </w:p>
+    <w:p>
+      <w:pPr>
+        <w:pStyle w:val="Compact"/>
+        <w:numPr>
+          <w:ilvl w:val="0"/>
+          <w:numId w:val="1008"/>
+        </w:numPr>
+      </w:pPr>
+      <w:r>
+        <w:rPr>
+          <w:b/>
+          <w:bCs/>
+          <w:lang w:val="nl"/>
+        </w:rPr>
+        <w:t xml:space="preserve">Sollicitanten</w:t>
+      </w:r>
+      <w:r>
+        <w:rPr>
+          <w:lang w:val="nl"/>
+        </w:rPr>
+        <w:t xml:space="preserve">: alleen lezen, zodat je bij een dossier kunt kijken wie iemand is;</w:t>
+      </w:r>
+    </w:p>
+    <w:p>
+      <w:pPr>
+        <w:pStyle w:val="Compact"/>
+        <w:numPr>
+          <w:ilvl w:val="0"/>
+          <w:numId w:val="1008"/>
+        </w:numPr>
+      </w:pPr>
       <w:r>
         <w:rPr>
           <w:b/>
@@ -387,61 +1150,34 @@
         <w:rPr>
           <w:lang w:val="nl"/>
         </w:rPr>
-        <w:t xml:space="preserve"> </w:t>
-      </w:r>
-      <w:r>
-        <w:rPr>
-          <w:lang w:val="nl"/>
-        </w:rPr>
-        <w:t xml:space="preserve">en</w:t>
-      </w:r>
-      <w:r>
-        <w:rPr>
-          <w:lang w:val="nl"/>
-        </w:rPr>
-        <w:t xml:space="preserve"> </w:t>
-      </w:r>
-      <w:r>
-        <w:rPr>
-          <w:lang w:val="nl"/>
-        </w:rPr>
-        <w:t xml:space="preserve">(alleen lezen)</w:t>
-      </w:r>
-      <w:r>
-        <w:rPr>
-          <w:lang w:val="nl"/>
-        </w:rPr>
-        <w:t xml:space="preserve"> </w:t>
-      </w:r>
-      <w:r>
-        <w:rPr>
-          <w:b/>
-          <w:bCs/>
-          <w:lang w:val="nl"/>
-        </w:rPr>
-        <w:t xml:space="preserve">Sollicitanten</w:t>
-      </w:r>
-      <w:r>
-        <w:rPr>
-          <w:lang w:val="nl"/>
-        </w:rPr>
-        <w:t xml:space="preserve">. Zie je meer of minder, dan klopt je groep in Authentik niet; meld</w:t>
-      </w:r>
-      <w:r>
-        <w:rPr>
-          <w:lang w:val="nl"/>
-        </w:rPr>
-        <w:t xml:space="preserve"> </w:t>
-      </w:r>
-      <w:r>
-        <w:rPr>
-          <w:lang w:val="nl"/>
-        </w:rPr>
-        <w:t xml:space="preserve">dat bij de admin.</w:t>
-      </w:r>
-    </w:p>
-    <w:bookmarkEnd w:id="10"/>
-    <w:bookmarkStart w:id="11" w:name="wat-er-in-een-loondossier-zit"/>
+        <w:t xml:space="preserve">: jouw werkscherm.</w:t>
+      </w:r>
+    </w:p>
+    <w:p>
+      <w:pPr>
+        <w:pStyle w:val="FirstParagraph"/>
+      </w:pPr>
+      <w:r>
+        <w:rPr>
+          <w:lang w:val="nl"/>
+        </w:rPr>
+        <w:t xml:space="preserve">Zie je meer of minder, dan staat je account in Authentik in de verkeerde groep. Meld dat bij de</w:t>
+      </w:r>
+      <w:r>
+        <w:rPr>
+          <w:lang w:val="nl"/>
+        </w:rPr>
+        <w:t xml:space="preserve"> </w:t>
+      </w:r>
+      <w:r>
+        <w:rPr>
+          <w:lang w:val="nl"/>
+        </w:rPr>
+        <w:t xml:space="preserve">admin.</w:t>
+      </w:r>
+    </w:p>
+    <w:bookmarkEnd w:id="11"/>
+    <w:bookmarkStart w:id="12" w:name="wat-er-in-een-loondossier-zit"/>
     <w:p>
       <w:pPr>
         <w:pStyle w:val="Heading1"/>
@@ -451,6 +1187,55 @@
           <w:lang w:val="nl"/>
         </w:rPr>
         <w:t xml:space="preserve">Wat er in een loondossier zit</w:t>
+      </w:r>
+    </w:p>
+    <w:p>
+      <w:pPr>
+        <w:pStyle w:val="BlockText"/>
+      </w:pPr>
+      <w:r>
+        <w:rPr>
+          <w:b/>
+          <w:bCs/>
+          <w:lang w:val="nl"/>
+        </w:rPr>
+        <w:t xml:space="preserve">In het kort:</w:t>
+      </w:r>
+      <w:r>
+        <w:rPr>
+          <w:lang w:val="nl"/>
+        </w:rPr>
+        <w:t xml:space="preserve"> </w:t>
+      </w:r>
+      <w:r>
+        <w:rPr>
+          <w:lang w:val="nl"/>
+        </w:rPr>
+        <w:t xml:space="preserve">het loonheffingsformulier, een kopie van het identiteitsbewijs en een kopie van</w:t>
+      </w:r>
+      <w:r>
+        <w:rPr>
+          <w:lang w:val="nl"/>
+        </w:rPr>
+        <w:t xml:space="preserve"> </w:t>
+      </w:r>
+      <w:r>
+        <w:rPr>
+          <w:lang w:val="nl"/>
+        </w:rPr>
+        <w:t xml:space="preserve">de bankpas. Het dossier is compleet als die drie binnen zijn. De inschrijving als lid staat er ter</w:t>
+      </w:r>
+      <w:r>
+        <w:rPr>
+          <w:lang w:val="nl"/>
+        </w:rPr>
+        <w:t xml:space="preserve"> </w:t>
+      </w:r>
+      <w:r>
+        <w:rPr>
+          <w:lang w:val="nl"/>
+        </w:rPr>
+        <w:t xml:space="preserve">informatie bij.</w:t>
       </w:r>
     </w:p>
     <w:p>
@@ -547,7 +1332,7 @@
               <w:rPr>
                 <w:lang w:val="nl"/>
               </w:rPr>
-              <w:t xml:space="preserve">De strandwacht vult het officiële Belastingdienst-formulier in het portaal in en ondertekent digitaal met een verificatiecode (sms/WhatsApp/e-mail)</w:t>
+              <w:t xml:space="preserve">De strandwacht vult het officiële formulier van de Belastingdienst in het portaal in en ondertekent digitaal met een verificatiecode</w:t>
             </w:r>
           </w:p>
         </w:tc>
@@ -561,7 +1346,7 @@
               <w:rPr>
                 <w:lang w:val="nl"/>
               </w:rPr>
-              <w:t xml:space="preserve">Verzegelde PDF; het BSN staat alleen in de PDF en in de kluis, nergens anders</w:t>
+              <w:t xml:space="preserve">Verzegelde PDF; het BSN staat alleen in de PDF en versleuteld in de kluis</w:t>
             </w:r>
           </w:p>
         </w:tc>
@@ -591,7 +1376,7 @@
               <w:rPr>
                 <w:lang w:val="nl"/>
               </w:rPr>
-              <w:t xml:space="preserve">Foto of scan; bij een ID-kaart voor- én achterkant, bij een paspoort alleen de fotopagina</w:t>
+              <w:t xml:space="preserve">Foto of scan (JPG, PNG of PDF). Bij een identiteitskaart voor- én achterkant, bij een paspoort alleen de fotopagina</w:t>
             </w:r>
           </w:p>
         </w:tc>
@@ -605,7 +1390,7 @@
               <w:rPr>
                 <w:lang w:val="nl"/>
               </w:rPr>
-              <w:t xml:space="preserve">Wettelijk verplicht, volledig en onafgeschermd</w:t>
+              <w:t xml:space="preserve">Wettelijk verplicht, volledig en niet afgeschermd</w:t>
             </w:r>
           </w:p>
         </w:tc>
@@ -635,7 +1420,7 @@
               <w:rPr>
                 <w:lang w:val="nl"/>
               </w:rPr>
-              <w:t xml:space="preserve">Foto van de voorkant (naam en IBAN)</w:t>
+              <w:t xml:space="preserve">Foto van de voorkant (naam en rekeningnummer)</w:t>
             </w:r>
           </w:p>
         </w:tc>
@@ -665,7 +1450,7 @@
               <w:rPr>
                 <w:lang w:val="nl"/>
               </w:rPr>
-              <w:t xml:space="preserve">Inschrijving lidmaatschap</w:t>
+              <w:t xml:space="preserve">Inschrijving als lid</w:t>
             </w:r>
           </w:p>
         </w:tc>
@@ -679,7 +1464,7 @@
               <w:rPr>
                 <w:lang w:val="nl"/>
               </w:rPr>
-              <w:t xml:space="preserve">Alleen voor wie nog geen verenigingsaccount heeft; gaat als PDF naar de ledenservice</w:t>
+              <w:t xml:space="preserve">Alleen voor wie nog geen Paal 13-account heeft; gaat na het ondertekenen als PDF naar de ledenservice</w:t>
             </w:r>
           </w:p>
         </w:tc>
@@ -693,7 +1478,7 @@
               <w:rPr>
                 <w:lang w:val="nl"/>
               </w:rPr>
-              <w:t xml:space="preserve">Staat ter info in het dossier</w:t>
+              <w:t xml:space="preserve">Ter informatie. Telt niet mee voor "compleet"</w:t>
             </w:r>
           </w:p>
         </w:tc>
@@ -733,23 +1518,23 @@
         <w:rPr>
           <w:lang w:val="nl"/>
         </w:rPr>
-        <w:t xml:space="preserve">als loonheffingsformulier, kopie ID</w:t>
-      </w:r>
-      <w:r>
-        <w:rPr>
-          <w:lang w:val="nl"/>
-        </w:rPr>
-        <w:t xml:space="preserve"> </w:t>
-      </w:r>
-      <w:r>
-        <w:rPr>
-          <w:lang w:val="nl"/>
-        </w:rPr>
-        <w:t xml:space="preserve">en kopie bankpas binnen zijn.</w:t>
-      </w:r>
-    </w:p>
-    <w:bookmarkEnd w:id="11"/>
-    <w:bookmarkStart w:id="12" w:name="wanneer-je-een-melding-krijgt"/>
+        <w:t xml:space="preserve">als het loonheffingsformulier is</w:t>
+      </w:r>
+      <w:r>
+        <w:rPr>
+          <w:lang w:val="nl"/>
+        </w:rPr>
+        <w:t xml:space="preserve"> </w:t>
+      </w:r>
+      <w:r>
+        <w:rPr>
+          <w:lang w:val="nl"/>
+        </w:rPr>
+        <w:t xml:space="preserve">ondertekend en de kopie van het identiteitsbewijs en de kopie van de bankpas binnen zijn.</w:t>
+      </w:r>
+    </w:p>
+    <w:bookmarkEnd w:id="12"/>
+    <w:bookmarkStart w:id="13" w:name="wanneer-je-een-melding-krijgt"/>
     <w:p>
       <w:pPr>
         <w:pStyle w:val="Heading1"/>
@@ -763,25 +1548,85 @@
     </w:p>
     <w:p>
       <w:pPr>
+        <w:pStyle w:val="BlockText"/>
+      </w:pPr>
+      <w:r>
+        <w:rPr>
+          <w:b/>
+          <w:bCs/>
+          <w:lang w:val="nl"/>
+        </w:rPr>
+        <w:t xml:space="preserve">In het kort:</w:t>
+      </w:r>
+      <w:r>
+        <w:rPr>
+          <w:lang w:val="nl"/>
+        </w:rPr>
+        <w:t xml:space="preserve"> </w:t>
+      </w:r>
+      <w:r>
+        <w:rPr>
+          <w:lang w:val="nl"/>
+        </w:rPr>
+        <w:t xml:space="preserve">je krijgt één mail "Loondossier compleet" als alle stukken binnen zijn. De</w:t>
+      </w:r>
+      <w:r>
+        <w:rPr>
+          <w:lang w:val="nl"/>
+        </w:rPr>
+        <w:t xml:space="preserve"> </w:t>
+      </w:r>
+      <w:r>
+        <w:rPr>
+          <w:lang w:val="nl"/>
+        </w:rPr>
+        <w:t xml:space="preserve">stukken zitten niet in die mail. Komt er geen mail, kijk dan zelf in Loondossiers.</w:t>
+      </w:r>
+    </w:p>
+    <w:p>
+      <w:pPr>
         <w:pStyle w:val="FirstParagraph"/>
       </w:pPr>
       <w:r>
         <w:rPr>
           <w:lang w:val="nl"/>
         </w:rPr>
-        <w:t xml:space="preserve">Zodra een dossier compleet is, krijg je één e-mail "Loondossier compleet" op het adres dat bij</w:t>
-      </w:r>
-      <w:r>
-        <w:rPr>
-          <w:lang w:val="nl"/>
-        </w:rPr>
-        <w:t xml:space="preserve"> </w:t>
-      </w:r>
-      <w:r>
-        <w:rPr>
-          <w:lang w:val="nl"/>
-        </w:rPr>
-        <w:t xml:space="preserve">Instellingen › Algemeen als penningmeester-adres staat. De stukken zitten</w:t>
+        <w:t xml:space="preserve">De mail gaat naar het penningmeester-adres uit Instellingen › Afzender &amp; adressen (is dat leeg,</w:t>
+      </w:r>
+      <w:r>
+        <w:rPr>
+          <w:lang w:val="nl"/>
+        </w:rPr>
+        <w:t xml:space="preserve"> </w:t>
+      </w:r>
+      <w:r>
+        <w:rPr>
+          <w:lang w:val="nl"/>
+        </w:rPr>
+        <w:t xml:space="preserve">dan naar het bestuursadres). In de mail staat welke stukken er zijn, met een knop "Openen in het</w:t>
+      </w:r>
+      <w:r>
+        <w:rPr>
+          <w:lang w:val="nl"/>
+        </w:rPr>
+        <w:t xml:space="preserve"> </w:t>
+      </w:r>
+      <w:r>
+        <w:rPr>
+          <w:lang w:val="nl"/>
+        </w:rPr>
+        <w:t xml:space="preserve">beheer" die direct het juiste dossier openklapt.</w:t>
+      </w:r>
+    </w:p>
+    <w:p>
+      <w:pPr>
+        <w:pStyle w:val="BodyText"/>
+      </w:pPr>
+      <w:r>
+        <w:rPr>
+          <w:lang w:val="nl"/>
+        </w:rPr>
+        <w:t xml:space="preserve">De stukken zitten standaard</w:t>
       </w:r>
       <w:r>
         <w:rPr>
@@ -807,19 +1652,31 @@
         <w:rPr>
           <w:lang w:val="nl"/>
         </w:rPr>
-        <w:t xml:space="preserve">in die mail; je</w:t>
-      </w:r>
-      <w:r>
-        <w:rPr>
-          <w:lang w:val="nl"/>
-        </w:rPr>
-        <w:t xml:space="preserve"> </w:t>
-      </w:r>
-      <w:r>
-        <w:rPr>
-          <w:lang w:val="nl"/>
-        </w:rPr>
-        <w:t xml:space="preserve">haalt ze op via het beheer. (Het bestuur kan instellen dat ze wél meegaan, maar dat raden we af.)</w:t>
+        <w:t xml:space="preserve">in de mail; je haalt ze op via het beheer. Het bestuur kan</w:t>
+      </w:r>
+      <w:r>
+        <w:rPr>
+          <w:lang w:val="nl"/>
+        </w:rPr>
+        <w:t xml:space="preserve"> </w:t>
+      </w:r>
+      <w:r>
+        <w:rPr>
+          <w:lang w:val="nl"/>
+        </w:rPr>
+        <w:t xml:space="preserve">instellen dat ze wél meegaan, maar dan gaan een BSN en een kopie identiteitsbewijs onversleuteld</w:t>
+      </w:r>
+      <w:r>
+        <w:rPr>
+          <w:lang w:val="nl"/>
+        </w:rPr>
+        <w:t xml:space="preserve"> </w:t>
+      </w:r>
+      <w:r>
+        <w:rPr>
+          <w:lang w:val="nl"/>
+        </w:rPr>
+        <w:t xml:space="preserve">per e-mail. Dat raden we af.</w:t>
       </w:r>
     </w:p>
     <w:p>
@@ -828,25 +1685,106 @@
       </w:pPr>
       <w:r>
         <w:rPr>
-          <w:lang w:val="nl"/>
-        </w:rPr>
-        <w:t xml:space="preserve">Krijg je de melding niet, dan kan een beheerder hem opnieuw sturen met de knop</w:t>
-      </w:r>
-      <w:r>
-        <w:rPr>
-          <w:lang w:val="nl"/>
-        </w:rPr>
-        <w:t xml:space="preserve"> </w:t>
-      </w:r>
-      <w:r>
-        <w:rPr>
-          <w:lang w:val="nl"/>
-        </w:rPr>
-        <w:t xml:space="preserve">"Melding opnieuw naar de penningmeester".</w:t>
-      </w:r>
-    </w:p>
-    <w:bookmarkEnd w:id="12"/>
-    <w:bookmarkStart w:id="13" w:name="het-scherm-loondossiers"/>
+          <w:b/>
+          <w:bCs/>
+          <w:lang w:val="nl"/>
+        </w:rPr>
+        <w:t xml:space="preserve">Let op:</w:t>
+      </w:r>
+      <w:r>
+        <w:rPr>
+          <w:lang w:val="nl"/>
+        </w:rPr>
+        <w:t xml:space="preserve"> </w:t>
+      </w:r>
+      <w:r>
+        <w:rPr>
+          <w:lang w:val="nl"/>
+        </w:rPr>
+        <w:t xml:space="preserve">de mail wordt verstuurd op het moment dat de strandwacht het loonheffingsformulier</w:t>
+      </w:r>
+      <w:r>
+        <w:rPr>
+          <w:lang w:val="nl"/>
+        </w:rPr>
+        <w:t xml:space="preserve"> </w:t>
+      </w:r>
+      <w:r>
+        <w:rPr>
+          <w:lang w:val="nl"/>
+        </w:rPr>
+        <w:t xml:space="preserve">ondertekent. Uploadt iemand de kopie van het identiteitsbewijs of de bankpas pas daarna, dan komt</w:t>
+      </w:r>
+      <w:r>
+        <w:rPr>
+          <w:lang w:val="nl"/>
+        </w:rPr>
+        <w:t xml:space="preserve"> </w:t>
+      </w:r>
+      <w:r>
+        <w:rPr>
+          <w:lang w:val="nl"/>
+        </w:rPr>
+        <w:t xml:space="preserve">er geen automatische mail, ook al is het dossier dan wel compleet. Kijk daarom ook zelf af en toe</w:t>
+      </w:r>
+      <w:r>
+        <w:rPr>
+          <w:lang w:val="nl"/>
+        </w:rPr>
+        <w:t xml:space="preserve"> </w:t>
+      </w:r>
+      <w:r>
+        <w:rPr>
+          <w:lang w:val="nl"/>
+        </w:rPr>
+        <w:t xml:space="preserve">in Loondossiers.</w:t>
+      </w:r>
+    </w:p>
+    <w:p>
+      <w:pPr>
+        <w:pStyle w:val="BodyText"/>
+      </w:pPr>
+      <w:r>
+        <w:rPr>
+          <w:lang w:val="nl"/>
+        </w:rPr>
+        <w:t xml:space="preserve">Mail kwijt of niet gekregen? Klik in het dossier op</w:t>
+      </w:r>
+      <w:r>
+        <w:rPr>
+          <w:lang w:val="nl"/>
+        </w:rPr>
+        <w:t xml:space="preserve"> </w:t>
+      </w:r>
+      <w:r>
+        <w:rPr>
+          <w:b/>
+          <w:bCs/>
+          <w:lang w:val="nl"/>
+        </w:rPr>
+        <w:t xml:space="preserve">Melding opnieuw naar de penningmeester</w:t>
+      </w:r>
+      <w:r>
+        <w:rPr>
+          <w:lang w:val="nl"/>
+        </w:rPr>
+        <w:t xml:space="preserve">.</w:t>
+      </w:r>
+      <w:r>
+        <w:rPr>
+          <w:lang w:val="nl"/>
+        </w:rPr>
+        <w:t xml:space="preserve"> </w:t>
+      </w:r>
+      <w:r>
+        <w:rPr>
+          <w:lang w:val="nl"/>
+        </w:rPr>
+        <w:t xml:space="preserve">Die knop staat er zodra het dossier compleet is.</w:t>
+      </w:r>
+    </w:p>
+    <w:bookmarkEnd w:id="13"/>
+    <w:bookmarkStart w:id="14" w:name="het-scherm-loondossiers"/>
     <w:p>
       <w:pPr>
         <w:pStyle w:val="Heading1"/>
@@ -860,6 +1798,43 @@
     </w:p>
     <w:p>
       <w:pPr>
+        <w:pStyle w:val="BlockText"/>
+      </w:pPr>
+      <w:r>
+        <w:rPr>
+          <w:b/>
+          <w:bCs/>
+          <w:lang w:val="nl"/>
+        </w:rPr>
+        <w:t xml:space="preserve">In het kort:</w:t>
+      </w:r>
+      <w:r>
+        <w:rPr>
+          <w:lang w:val="nl"/>
+        </w:rPr>
+        <w:t xml:space="preserve"> </w:t>
+      </w:r>
+      <w:r>
+        <w:rPr>
+          <w:lang w:val="nl"/>
+        </w:rPr>
+        <w:t xml:space="preserve">bovenaan de regels voor deze stukken en de stand, daaronder per strandwacht een</w:t>
+      </w:r>
+      <w:r>
+        <w:rPr>
+          <w:lang w:val="nl"/>
+        </w:rPr>
+        <w:t xml:space="preserve"> </w:t>
+      </w:r>
+      <w:r>
+        <w:rPr>
+          <w:lang w:val="nl"/>
+        </w:rPr>
+        <w:t xml:space="preserve">kaart die je openklapt. Oranje is nog niet compleet, groen wacht op jou, grijs is verwerkt.</w:t>
+      </w:r>
+    </w:p>
+    <w:p>
+      <w:pPr>
         <w:pStyle w:val="FirstParagraph"/>
       </w:pPr>
       <w:r>
@@ -880,7 +1855,7 @@
         <w:rPr>
           <w:lang w:val="nl"/>
         </w:rPr>
-        <w:t xml:space="preserve">Beheer › Loondossiers.</w:t>
+        <w:t xml:space="preserve">Beheer › Loondossiers (in de menugroep Inzet &amp; loon).</w:t>
       </w:r>
     </w:p>
     <w:p>
@@ -891,7 +1866,116 @@
         <w:rPr>
           <w:lang w:val="nl"/>
         </w:rPr>
-        <w:t xml:space="preserve">Bovenaan drie tellers: aangenomen, compleet, verwerkt. Daaronder per strandwacht een kaart:</w:t>
+        <w:t xml:space="preserve">Het scherm toont de aangenomen strandwachten van het actieve seizoen.</w:t>
+      </w:r>
+    </w:p>
+    <w:p>
+      <w:pPr>
+        <w:pStyle w:val="BodyText"/>
+      </w:pPr>
+      <w:r>
+        <w:rPr>
+          <w:b/>
+          <w:bCs/>
+          <w:lang w:val="nl"/>
+        </w:rPr>
+        <w:t xml:space="preserve">Bovenaan</w:t>
+      </w:r>
+      <w:r>
+        <w:rPr>
+          <w:lang w:val="nl"/>
+        </w:rPr>
+        <w:t xml:space="preserve"> </w:t>
+      </w:r>
+      <w:r>
+        <w:rPr>
+          <w:lang w:val="nl"/>
+        </w:rPr>
+        <w:t xml:space="preserve">staat een vast kader met de regels: hier staan een BSN en kopieën van</w:t>
+      </w:r>
+      <w:r>
+        <w:rPr>
+          <w:lang w:val="nl"/>
+        </w:rPr>
+        <w:t xml:space="preserve"> </w:t>
+      </w:r>
+      <w:r>
+        <w:rPr>
+          <w:lang w:val="nl"/>
+        </w:rPr>
+        <w:t xml:space="preserve">identiteitsbewijzen, elke download wordt vastgelegd, en de bewaartermijnen. Dat kader staat er</w:t>
+      </w:r>
+      <w:r>
+        <w:rPr>
+          <w:lang w:val="nl"/>
+        </w:rPr>
+        <w:t xml:space="preserve"> </w:t>
+      </w:r>
+      <w:r>
+        <w:rPr>
+          <w:lang w:val="nl"/>
+        </w:rPr>
+        <w:t xml:space="preserve">altijd; het is geen waarschuwing.</w:t>
+      </w:r>
+    </w:p>
+    <w:p>
+      <w:pPr>
+        <w:pStyle w:val="BodyText"/>
+      </w:pPr>
+      <w:r>
+        <w:rPr>
+          <w:lang w:val="nl"/>
+        </w:rPr>
+        <w:t xml:space="preserve">Daaronder de stand, bijvoorbeeld "2 dossiers wachten op verwerking", met de tellers aangenomen,</w:t>
+      </w:r>
+      <w:r>
+        <w:rPr>
+          <w:lang w:val="nl"/>
+        </w:rPr>
+        <w:t xml:space="preserve"> </w:t>
+      </w:r>
+      <w:r>
+        <w:rPr>
+          <w:lang w:val="nl"/>
+        </w:rPr>
+        <w:t xml:space="preserve">compleet en verwerkt.</w:t>
+      </w:r>
+    </w:p>
+    <w:p>
+      <w:pPr>
+        <w:pStyle w:val="BodyText"/>
+      </w:pPr>
+      <w:r>
+        <w:rPr>
+          <w:b/>
+          <w:bCs/>
+          <w:lang w:val="nl"/>
+        </w:rPr>
+        <w:t xml:space="preserve">Per strandwacht</w:t>
+      </w:r>
+      <w:r>
+        <w:rPr>
+          <w:lang w:val="nl"/>
+        </w:rPr>
+        <w:t xml:space="preserve"> </w:t>
+      </w:r>
+      <w:r>
+        <w:rPr>
+          <w:lang w:val="nl"/>
+        </w:rPr>
+        <w:t xml:space="preserve">een kaart. Klik op de naam om hem open of dicht te klappen. Rechts van de naam</w:t>
+      </w:r>
+      <w:r>
+        <w:rPr>
+          <w:lang w:val="nl"/>
+        </w:rPr>
+        <w:t xml:space="preserve"> </w:t>
+      </w:r>
+      <w:r>
+        <w:rPr>
+          <w:lang w:val="nl"/>
+        </w:rPr>
+        <w:t xml:space="preserve">staat de status:</w:t>
       </w:r>
     </w:p>
     <w:p>
@@ -899,7 +1983,7 @@
         <w:pStyle w:val="Compact"/>
         <w:numPr>
           <w:ilvl w:val="0"/>
-          <w:numId w:val="1002"/>
+          <w:numId w:val="1009"/>
         </w:numPr>
       </w:pPr>
       <w:r>
@@ -908,19 +1992,19 @@
           <w:bCs/>
           <w:lang w:val="nl"/>
         </w:rPr>
-        <w:t xml:space="preserve">Oranje rand:</w:t>
-      </w:r>
-      <w:r>
-        <w:rPr>
-          <w:lang w:val="nl"/>
-        </w:rPr>
-        <w:t xml:space="preserve"> </w:t>
-      </w:r>
-      <w:r>
-        <w:rPr>
-          <w:lang w:val="nl"/>
-        </w:rPr>
-        <w:t xml:space="preserve">dossier nog niet compleet; er ontbreken stukken.</w:t>
+        <w:t xml:space="preserve">Oranje, "Ontbreekt nog: …":</w:t>
+      </w:r>
+      <w:r>
+        <w:rPr>
+          <w:lang w:val="nl"/>
+        </w:rPr>
+        <w:t xml:space="preserve"> </w:t>
+      </w:r>
+      <w:r>
+        <w:rPr>
+          <w:lang w:val="nl"/>
+        </w:rPr>
+        <w:t xml:space="preserve">er ontbreken stukken; je ziet welke.</w:t>
       </w:r>
     </w:p>
     <w:p>
@@ -928,7 +2012,7 @@
         <w:pStyle w:val="Compact"/>
         <w:numPr>
           <w:ilvl w:val="0"/>
-          <w:numId w:val="1002"/>
+          <w:numId w:val="1009"/>
         </w:numPr>
       </w:pPr>
       <w:r>
@@ -937,19 +2021,19 @@
           <w:bCs/>
           <w:lang w:val="nl"/>
         </w:rPr>
-        <w:t xml:space="preserve">Groene rand:</w:t>
-      </w:r>
-      <w:r>
-        <w:rPr>
-          <w:lang w:val="nl"/>
-        </w:rPr>
-        <w:t xml:space="preserve"> </w:t>
-      </w:r>
-      <w:r>
-        <w:rPr>
-          <w:lang w:val="nl"/>
-        </w:rPr>
-        <w:t xml:space="preserve">compleet, wacht op verwerking. Deze kaarten staan standaard opengeklapt.</w:t>
+        <w:t xml:space="preserve">Groen, "Compleet — klaar om te verwerken":</w:t>
+      </w:r>
+      <w:r>
+        <w:rPr>
+          <w:lang w:val="nl"/>
+        </w:rPr>
+        <w:t xml:space="preserve"> </w:t>
+      </w:r>
+      <w:r>
+        <w:rPr>
+          <w:lang w:val="nl"/>
+        </w:rPr>
+        <w:t xml:space="preserve">wacht op jou. Deze kaarten staan standaard open.</w:t>
       </w:r>
     </w:p>
     <w:p>
@@ -957,7 +2041,7 @@
         <w:pStyle w:val="Compact"/>
         <w:numPr>
           <w:ilvl w:val="0"/>
-          <w:numId w:val="1002"/>
+          <w:numId w:val="1009"/>
         </w:numPr>
       </w:pPr>
       <w:r>
@@ -966,19 +2050,19 @@
           <w:bCs/>
           <w:lang w:val="nl"/>
         </w:rPr>
-        <w:t xml:space="preserve">Grijze rand:</w:t>
-      </w:r>
-      <w:r>
-        <w:rPr>
-          <w:lang w:val="nl"/>
-        </w:rPr>
-        <w:t xml:space="preserve"> </w:t>
-      </w:r>
-      <w:r>
-        <w:rPr>
-          <w:lang w:val="nl"/>
-        </w:rPr>
-        <w:t xml:space="preserve">verwerkt.</w:t>
+        <w:t xml:space="preserve">Grijs, "Verwerkt" met datum:</w:t>
+      </w:r>
+      <w:r>
+        <w:rPr>
+          <w:lang w:val="nl"/>
+        </w:rPr>
+        <w:t xml:space="preserve"> </w:t>
+      </w:r>
+      <w:r>
+        <w:rPr>
+          <w:lang w:val="nl"/>
+        </w:rPr>
+        <w:t xml:space="preserve">klaar.</w:t>
       </w:r>
     </w:p>
     <w:p>
@@ -989,67 +2073,7 @@
         <w:rPr>
           <w:lang w:val="nl"/>
         </w:rPr>
-        <w:t xml:space="preserve">In een kaart zie je per stuk de bestandsnaam, de uploaddatum, de grootte en wanneer het voor het</w:t>
-      </w:r>
-      <w:r>
-        <w:rPr>
-          <w:lang w:val="nl"/>
-        </w:rPr>
-        <w:t xml:space="preserve"> </w:t>
-      </w:r>
-      <w:r>
-        <w:rPr>
-          <w:lang w:val="nl"/>
-        </w:rPr>
-        <w:t xml:space="preserve">laatst is gedownload. Onder "Tijdlijn loonheffing" staat het bewijsspoor van de ondertekening:</w:t>
-      </w:r>
-      <w:r>
-        <w:rPr>
-          <w:lang w:val="nl"/>
-        </w:rPr>
-        <w:t xml:space="preserve"> </w:t>
-      </w:r>
-      <w:r>
-        <w:rPr>
-          <w:lang w:val="nl"/>
-        </w:rPr>
-        <w:t xml:space="preserve">geopend, code verstuurd, code geaccepteerd, ondertekend, verzegeld, met tijdstip en kanaal.</w:t>
-      </w:r>
-    </w:p>
-    <w:p>
-      <w:pPr>
-        <w:pStyle w:val="BodyText"/>
-      </w:pPr>
-      <w:r>
-        <w:rPr>
-          <w:lang w:val="nl"/>
-        </w:rPr>
-        <w:t xml:space="preserve">Staat er bovenaan een rode melding over de kluis of het zegel, dan werkt het systeem niet goed;</w:t>
-      </w:r>
-      <w:r>
-        <w:rPr>
-          <w:lang w:val="nl"/>
-        </w:rPr>
-        <w:t xml:space="preserve"> </w:t>
-      </w:r>
-      <w:r>
-        <w:rPr>
-          <w:lang w:val="nl"/>
-        </w:rPr>
-        <w:t xml:space="preserve">waarschuw de admin. Zolang die melding staat kunnen strandwachten niets uploaden.</w:t>
-      </w:r>
-    </w:p>
-    <w:bookmarkEnd w:id="13"/>
-    <w:bookmarkStart w:id="14" w:name="stukken-downloaden"/>
-    <w:p>
-      <w:pPr>
-        <w:pStyle w:val="Heading1"/>
-      </w:pPr>
-      <w:r>
-        <w:rPr>
-          <w:lang w:val="nl"/>
-        </w:rPr>
-        <w:t xml:space="preserve">Stukken downloaden</w:t>
+        <w:t xml:space="preserve">In een opengeklapte kaart zie je:</w:t>
       </w:r>
     </w:p>
     <w:p>
@@ -1057,40 +2081,34 @@
         <w:pStyle w:val="Compact"/>
         <w:numPr>
           <w:ilvl w:val="0"/>
-          <w:numId w:val="1003"/>
+          <w:numId w:val="1010"/>
         </w:numPr>
       </w:pPr>
       <w:r>
         <w:rPr>
           <w:lang w:val="nl"/>
         </w:rPr>
-        <w:t xml:space="preserve">Klik op</w:t>
-      </w:r>
-      <w:r>
-        <w:rPr>
-          <w:lang w:val="nl"/>
-        </w:rPr>
-        <w:t xml:space="preserve"> </w:t>
-      </w:r>
-      <w:r>
-        <w:rPr>
-          <w:b/>
-          <w:bCs/>
-          <w:lang w:val="nl"/>
-        </w:rPr>
-        <w:t xml:space="preserve">Download</w:t>
-      </w:r>
-      <w:r>
-        <w:rPr>
-          <w:lang w:val="nl"/>
-        </w:rPr>
-        <w:t xml:space="preserve"> </w:t>
-      </w:r>
-      <w:r>
-        <w:rPr>
-          <w:lang w:val="nl"/>
-        </w:rPr>
-        <w:t xml:space="preserve">achter het stuk.</w:t>
+        <w:t xml:space="preserve">een link</w:t>
+      </w:r>
+      <w:r>
+        <w:rPr>
+          <w:lang w:val="nl"/>
+        </w:rPr>
+        <w:t xml:space="preserve"> </w:t>
+      </w:r>
+      <w:r>
+        <w:rPr>
+          <w:b/>
+          <w:bCs/>
+          <w:lang w:val="nl"/>
+        </w:rPr>
+        <w:t xml:space="preserve">Naar het dossier van …</w:t>
+      </w:r>
+      <w:r>
+        <w:rPr>
+          <w:lang w:val="nl"/>
+        </w:rPr>
+        <w:t xml:space="preserve">, als je meer over de persoon wilt weten;</w:t>
       </w:r>
     </w:p>
     <w:p>
@@ -1098,26 +2116,66 @@
         <w:pStyle w:val="Compact"/>
         <w:numPr>
           <w:ilvl w:val="0"/>
-          <w:numId w:val="1003"/>
+          <w:numId w:val="1010"/>
         </w:numPr>
       </w:pPr>
       <w:r>
         <w:rPr>
           <w:lang w:val="nl"/>
         </w:rPr>
-        <w:t xml:space="preserve">Op ID-kopieën en de bankpas staat een watermerk met je naam en de datum. Dat is bedoeld om</w:t>
-      </w:r>
-      <w:r>
-        <w:rPr>
-          <w:lang w:val="nl"/>
-        </w:rPr>
-        <w:t xml:space="preserve"> </w:t>
-      </w:r>
-      <w:r>
-        <w:rPr>
-          <w:lang w:val="nl"/>
-        </w:rPr>
-        <w:t xml:space="preserve">doorsturen te ontmoedigen; verwijder het niet.</w:t>
+        <w:t xml:space="preserve">het</w:t>
+      </w:r>
+      <w:r>
+        <w:rPr>
+          <w:lang w:val="nl"/>
+        </w:rPr>
+        <w:t xml:space="preserve"> </w:t>
+      </w:r>
+      <w:r>
+        <w:rPr>
+          <w:b/>
+          <w:bCs/>
+          <w:lang w:val="nl"/>
+        </w:rPr>
+        <w:t xml:space="preserve">loonheffingsformulier</w:t>
+      </w:r>
+      <w:r>
+        <w:rPr>
+          <w:lang w:val="nl"/>
+        </w:rPr>
+        <w:t xml:space="preserve">: wanneer het is ondertekend, hoe (verificatiecode, naar welk</w:t>
+      </w:r>
+      <w:r>
+        <w:rPr>
+          <w:lang w:val="nl"/>
+        </w:rPr>
+        <w:t xml:space="preserve"> </w:t>
+      </w:r>
+      <w:r>
+        <w:rPr>
+          <w:lang w:val="nl"/>
+        </w:rPr>
+        <w:t xml:space="preserve">nummer) en een vingerafdruk van het bestand (sha256), met de knop</w:t>
+      </w:r>
+      <w:r>
+        <w:rPr>
+          <w:lang w:val="nl"/>
+        </w:rPr>
+        <w:t xml:space="preserve"> </w:t>
+      </w:r>
+      <w:r>
+        <w:rPr>
+          <w:b/>
+          <w:bCs/>
+          <w:lang w:val="nl"/>
+        </w:rPr>
+        <w:t xml:space="preserve">PDF</w:t>
+      </w:r>
+      <w:r>
+        <w:rPr>
+          <w:lang w:val="nl"/>
+        </w:rPr>
+        <w:t xml:space="preserve">;</w:t>
       </w:r>
     </w:p>
     <w:p>
@@ -1125,26 +2183,118 @@
         <w:pStyle w:val="Compact"/>
         <w:numPr>
           <w:ilvl w:val="0"/>
-          <w:numId w:val="1003"/>
+          <w:numId w:val="1010"/>
         </w:numPr>
       </w:pPr>
       <w:r>
         <w:rPr>
-          <w:lang w:val="nl"/>
-        </w:rPr>
-        <w:t xml:space="preserve">Elke download wordt vastgelegd (wie, wanneer, welk stuk) en het bestuur krijgt daar standaard</w:t>
-      </w:r>
-      <w:r>
-        <w:rPr>
-          <w:lang w:val="nl"/>
-        </w:rPr>
-        <w:t xml:space="preserve"> </w:t>
-      </w:r>
-      <w:r>
-        <w:rPr>
-          <w:lang w:val="nl"/>
-        </w:rPr>
-        <w:t xml:space="preserve">een melding van. Dat is normaal en hoort zo.</w:t>
+          <w:b/>
+          <w:bCs/>
+          <w:lang w:val="nl"/>
+        </w:rPr>
+        <w:t xml:space="preserve">identiteitsbewijs voorkant</w:t>
+      </w:r>
+      <w:r>
+        <w:rPr>
+          <w:lang w:val="nl"/>
+        </w:rPr>
+        <w:t xml:space="preserve"> </w:t>
+      </w:r>
+      <w:r>
+        <w:rPr>
+          <w:lang w:val="nl"/>
+        </w:rPr>
+        <w:t xml:space="preserve">(met paspoort of identiteitskaart),</w:t>
+      </w:r>
+      <w:r>
+        <w:rPr>
+          <w:lang w:val="nl"/>
+        </w:rPr>
+        <w:t xml:space="preserve"> </w:t>
+      </w:r>
+      <w:r>
+        <w:rPr>
+          <w:b/>
+          <w:bCs/>
+          <w:lang w:val="nl"/>
+        </w:rPr>
+        <w:t xml:space="preserve">achterkant</w:t>
+      </w:r>
+      <w:r>
+        <w:rPr>
+          <w:lang w:val="nl"/>
+        </w:rPr>
+        <w:t xml:space="preserve"> </w:t>
+      </w:r>
+      <w:r>
+        <w:rPr>
+          <w:lang w:val="nl"/>
+        </w:rPr>
+        <w:t xml:space="preserve">("Niet nodig</w:t>
+      </w:r>
+      <w:r>
+        <w:rPr>
+          <w:lang w:val="nl"/>
+        </w:rPr>
+        <w:t xml:space="preserve"> </w:t>
+      </w:r>
+      <w:r>
+        <w:rPr>
+          <w:lang w:val="nl"/>
+        </w:rPr>
+        <w:t xml:space="preserve">bij een paspoort") en</w:t>
+      </w:r>
+      <w:r>
+        <w:rPr>
+          <w:lang w:val="nl"/>
+        </w:rPr>
+        <w:t xml:space="preserve"> </w:t>
+      </w:r>
+      <w:r>
+        <w:rPr>
+          <w:b/>
+          <w:bCs/>
+          <w:lang w:val="nl"/>
+        </w:rPr>
+        <w:t xml:space="preserve">kopie bankpas</w:t>
+      </w:r>
+      <w:r>
+        <w:rPr>
+          <w:lang w:val="nl"/>
+        </w:rPr>
+        <w:t xml:space="preserve">: per stuk de bestandsnaam, de uploaddatum, de grootte en</w:t>
+      </w:r>
+      <w:r>
+        <w:rPr>
+          <w:lang w:val="nl"/>
+        </w:rPr>
+        <w:t xml:space="preserve"> </w:t>
+      </w:r>
+      <w:r>
+        <w:rPr>
+          <w:lang w:val="nl"/>
+        </w:rPr>
+        <w:t xml:space="preserve">wanneer het voor het laatst is ingezien, met de knop</w:t>
+      </w:r>
+      <w:r>
+        <w:rPr>
+          <w:lang w:val="nl"/>
+        </w:rPr>
+        <w:t xml:space="preserve"> </w:t>
+      </w:r>
+      <w:r>
+        <w:rPr>
+          <w:b/>
+          <w:bCs/>
+          <w:lang w:val="nl"/>
+        </w:rPr>
+        <w:t xml:space="preserve">Download</w:t>
+      </w:r>
+      <w:r>
+        <w:rPr>
+          <w:lang w:val="nl"/>
+        </w:rPr>
+        <w:t xml:space="preserve">;</w:t>
       </w:r>
     </w:p>
     <w:p>
@@ -1152,61 +2302,42 @@
         <w:pStyle w:val="Compact"/>
         <w:numPr>
           <w:ilvl w:val="0"/>
-          <w:numId w:val="1003"/>
+          <w:numId w:val="1010"/>
         </w:numPr>
       </w:pPr>
       <w:r>
         <w:rPr>
-          <w:lang w:val="nl"/>
-        </w:rPr>
-        <w:t xml:space="preserve">Er geldt een grens van 30 downloads per uur.</w:t>
-      </w:r>
-    </w:p>
-    <w:p>
-      <w:pPr>
-        <w:pStyle w:val="FirstParagraph"/>
-      </w:pPr>
-      <w:r>
-        <w:rPr>
-          <w:lang w:val="nl"/>
-        </w:rPr>
-        <w:t xml:space="preserve">Download alleen op een vertrouwd apparaat. Zet de stukken direct in de loonadministratie en</w:t>
-      </w:r>
-      <w:r>
-        <w:rPr>
-          <w:lang w:val="nl"/>
-        </w:rPr>
-        <w:t xml:space="preserve"> </w:t>
-      </w:r>
-      <w:r>
-        <w:rPr>
-          <w:lang w:val="nl"/>
-        </w:rPr>
-        <w:t xml:space="preserve">verwijder de gedownloade bestanden daarna van je computer en uit je downloadmap.</w:t>
-      </w:r>
-    </w:p>
-    <w:bookmarkEnd w:id="14"/>
-    <w:bookmarkStart w:id="15" w:name="een-dossier-verwerken"/>
-    <w:p>
-      <w:pPr>
-        <w:pStyle w:val="Heading1"/>
-      </w:pPr>
-      <w:r>
-        <w:rPr>
-          <w:lang w:val="nl"/>
-        </w:rPr>
-        <w:t xml:space="preserve">Een dossier verwerken</w:t>
-      </w:r>
-    </w:p>
-    <w:p>
-      <w:pPr>
-        <w:pStyle w:val="FirstParagraph"/>
-      </w:pPr>
-      <w:r>
-        <w:rPr>
-          <w:lang w:val="nl"/>
-        </w:rPr>
-        <w:t xml:space="preserve">Zodra de gegevens in de loonadministratie staan:</w:t>
+          <w:b/>
+          <w:bCs/>
+          <w:lang w:val="nl"/>
+        </w:rPr>
+        <w:t xml:space="preserve">lid van de vereniging</w:t>
+      </w:r>
+      <w:r>
+        <w:rPr>
+          <w:lang w:val="nl"/>
+        </w:rPr>
+        <w:t xml:space="preserve">: wanneer de inschrijving naar de ledenservice is gemaild, met de knop</w:t>
+      </w:r>
+      <w:r>
+        <w:rPr>
+          <w:lang w:val="nl"/>
+        </w:rPr>
+        <w:t xml:space="preserve"> </w:t>
+      </w:r>
+      <w:r>
+        <w:rPr>
+          <w:b/>
+          <w:bCs/>
+          <w:lang w:val="nl"/>
+        </w:rPr>
+        <w:t xml:space="preserve">PDF</w:t>
+      </w:r>
+      <w:r>
+        <w:rPr>
+          <w:lang w:val="nl"/>
+        </w:rPr>
+        <w:t xml:space="preserve">, of "Niet van toepassing" als iemand al een verenigingsaccount heeft;</w:t>
       </w:r>
     </w:p>
     <w:p>
@@ -1214,14 +2345,14 @@
         <w:pStyle w:val="Compact"/>
         <w:numPr>
           <w:ilvl w:val="0"/>
-          <w:numId w:val="1004"/>
+          <w:numId w:val="1010"/>
         </w:numPr>
       </w:pPr>
       <w:r>
         <w:rPr>
           <w:lang w:val="nl"/>
         </w:rPr>
-        <w:t xml:space="preserve">Klik in de kaart op</w:t>
+        <w:t xml:space="preserve">onderaan de knoppen</w:t>
       </w:r>
       <w:r>
         <w:rPr>
@@ -1241,7 +2372,257 @@
         <w:rPr>
           <w:lang w:val="nl"/>
         </w:rPr>
-        <w:t xml:space="preserve">.</w:t>
+        <w:t xml:space="preserve"> </w:t>
+      </w:r>
+      <w:r>
+        <w:rPr>
+          <w:lang w:val="nl"/>
+        </w:rPr>
+        <w:t xml:space="preserve">en</w:t>
+      </w:r>
+      <w:r>
+        <w:rPr>
+          <w:lang w:val="nl"/>
+        </w:rPr>
+        <w:t xml:space="preserve"> </w:t>
+      </w:r>
+      <w:r>
+        <w:rPr>
+          <w:b/>
+          <w:bCs/>
+          <w:lang w:val="nl"/>
+        </w:rPr>
+        <w:t xml:space="preserve">Melding opnieuw naar de</w:t>
+      </w:r>
+      <w:r>
+        <w:rPr>
+          <w:b/>
+          <w:bCs/>
+          <w:lang w:val="nl"/>
+        </w:rPr>
+        <w:t xml:space="preserve"> </w:t>
+      </w:r>
+      <w:r>
+        <w:rPr>
+          <w:b/>
+          <w:bCs/>
+          <w:lang w:val="nl"/>
+        </w:rPr>
+        <w:t xml:space="preserve">penningmeester</w:t>
+      </w:r>
+      <w:r>
+        <w:rPr>
+          <w:lang w:val="nl"/>
+        </w:rPr>
+        <w:t xml:space="preserve">, en de uitklapbare</w:t>
+      </w:r>
+      <w:r>
+        <w:rPr>
+          <w:lang w:val="nl"/>
+        </w:rPr>
+        <w:t xml:space="preserve"> </w:t>
+      </w:r>
+      <w:r>
+        <w:rPr>
+          <w:b/>
+          <w:bCs/>
+          <w:lang w:val="nl"/>
+        </w:rPr>
+        <w:t xml:space="preserve">Tijdlijn van de ondertekening</w:t>
+      </w:r>
+      <w:r>
+        <w:rPr>
+          <w:lang w:val="nl"/>
+        </w:rPr>
+        <w:t xml:space="preserve">. Daarin staat het</w:t>
+      </w:r>
+      <w:r>
+        <w:rPr>
+          <w:lang w:val="nl"/>
+        </w:rPr>
+        <w:t xml:space="preserve"> </w:t>
+      </w:r>
+      <w:r>
+        <w:rPr>
+          <w:lang w:val="nl"/>
+        </w:rPr>
+        <w:t xml:space="preserve">bewijsspoor: klaargezet, geopend, verificatiecode verstuurd, code geaccepteerd, ondertekend,</w:t>
+      </w:r>
+      <w:r>
+        <w:rPr>
+          <w:lang w:val="nl"/>
+        </w:rPr>
+        <w:t xml:space="preserve"> </w:t>
+      </w:r>
+      <w:r>
+        <w:rPr>
+          <w:lang w:val="nl"/>
+        </w:rPr>
+        <w:t xml:space="preserve">PDF verzegeld, gedownload en verwerkt, met tijdstip en IP-adres.</w:t>
+      </w:r>
+    </w:p>
+    <w:p>
+      <w:pPr>
+        <w:pStyle w:val="FirstParagraph"/>
+      </w:pPr>
+      <w:r>
+        <w:rPr>
+          <w:lang w:val="nl"/>
+        </w:rPr>
+        <w:t xml:space="preserve">Staat er bovenaan een</w:t>
+      </w:r>
+      <w:r>
+        <w:rPr>
+          <w:lang w:val="nl"/>
+        </w:rPr>
+        <w:t xml:space="preserve"> </w:t>
+      </w:r>
+      <w:r>
+        <w:rPr>
+          <w:b/>
+          <w:bCs/>
+          <w:lang w:val="nl"/>
+        </w:rPr>
+        <w:t xml:space="preserve">rode melding</w:t>
+      </w:r>
+      <w:r>
+        <w:rPr>
+          <w:lang w:val="nl"/>
+        </w:rPr>
+        <w:t xml:space="preserve"> </w:t>
+      </w:r>
+      <w:r>
+        <w:rPr>
+          <w:lang w:val="nl"/>
+        </w:rPr>
+        <w:t xml:space="preserve">"De kluis is niet bereikbaar", dan kunnen strandwachten</w:t>
+      </w:r>
+      <w:r>
+        <w:rPr>
+          <w:lang w:val="nl"/>
+        </w:rPr>
+        <w:t xml:space="preserve"> </w:t>
+      </w:r>
+      <w:r>
+        <w:rPr>
+          <w:lang w:val="nl"/>
+        </w:rPr>
+        <w:t xml:space="preserve">niets uploaden en geen loonheffingsformulier ondertekenen. Waarschuw de admin. Een</w:t>
+      </w:r>
+      <w:r>
+        <w:rPr>
+          <w:lang w:val="nl"/>
+        </w:rPr>
+        <w:t xml:space="preserve"> </w:t>
+      </w:r>
+      <w:r>
+        <w:rPr>
+          <w:b/>
+          <w:bCs/>
+          <w:lang w:val="nl"/>
+        </w:rPr>
+        <w:t xml:space="preserve">oranje</w:t>
+      </w:r>
+      <w:r>
+        <w:rPr>
+          <w:b/>
+          <w:bCs/>
+          <w:lang w:val="nl"/>
+        </w:rPr>
+        <w:t xml:space="preserve"> </w:t>
+      </w:r>
+      <w:r>
+        <w:rPr>
+          <w:b/>
+          <w:bCs/>
+          <w:lang w:val="nl"/>
+        </w:rPr>
+        <w:t xml:space="preserve">melding</w:t>
+      </w:r>
+      <w:r>
+        <w:rPr>
+          <w:lang w:val="nl"/>
+        </w:rPr>
+        <w:t xml:space="preserve"> </w:t>
+      </w:r>
+      <w:r>
+        <w:rPr>
+          <w:lang w:val="nl"/>
+        </w:rPr>
+        <w:t xml:space="preserve">"Het documentzegel werkt niet" betekent dat nieuwe PDF's geen digitaal zegel krijgen;</w:t>
+      </w:r>
+      <w:r>
+        <w:rPr>
+          <w:lang w:val="nl"/>
+        </w:rPr>
+        <w:t xml:space="preserve"> </w:t>
+      </w:r>
+      <w:r>
+        <w:rPr>
+          <w:lang w:val="nl"/>
+        </w:rPr>
+        <w:t xml:space="preserve">bestaande documenten blijven geldig. Ook dan de admin waarschuwen.</w:t>
+      </w:r>
+    </w:p>
+    <w:p>
+      <w:pPr>
+        <w:pStyle w:val="BodyText"/>
+      </w:pPr>
+      <w:r>
+        <w:rPr>
+          <w:lang w:val="nl"/>
+        </w:rPr>
+        <w:t xml:space="preserve">Staat er nog niemand op "Aangenomen", dan zie je "Nog geen loondossiers".</w:t>
+      </w:r>
+    </w:p>
+    <w:bookmarkEnd w:id="14"/>
+    <w:bookmarkStart w:id="15" w:name="stukken-downloaden"/>
+    <w:p>
+      <w:pPr>
+        <w:pStyle w:val="Heading1"/>
+      </w:pPr>
+      <w:r>
+        <w:rPr>
+          <w:lang w:val="nl"/>
+        </w:rPr>
+        <w:t xml:space="preserve">Stukken downloaden</w:t>
+      </w:r>
+    </w:p>
+    <w:p>
+      <w:pPr>
+        <w:pStyle w:val="BlockText"/>
+      </w:pPr>
+      <w:r>
+        <w:rPr>
+          <w:b/>
+          <w:bCs/>
+          <w:lang w:val="nl"/>
+        </w:rPr>
+        <w:t xml:space="preserve">In het kort:</w:t>
+      </w:r>
+      <w:r>
+        <w:rPr>
+          <w:lang w:val="nl"/>
+        </w:rPr>
+        <w:t xml:space="preserve"> </w:t>
+      </w:r>
+      <w:r>
+        <w:rPr>
+          <w:lang w:val="nl"/>
+        </w:rPr>
+        <w:t xml:space="preserve">download via de knoppen in de kaart, alleen op een vertrouwd apparaat. Elke</w:t>
+      </w:r>
+      <w:r>
+        <w:rPr>
+          <w:lang w:val="nl"/>
+        </w:rPr>
+        <w:t xml:space="preserve"> </w:t>
+      </w:r>
+      <w:r>
+        <w:rPr>
+          <w:lang w:val="nl"/>
+        </w:rPr>
+        <w:t xml:space="preserve">download wordt vastgelegd en foto's krijgen een watermerk met jouw naam.</w:t>
       </w:r>
     </w:p>
     <w:p>
@@ -1249,25 +2630,66 @@
         <w:pStyle w:val="Compact"/>
         <w:numPr>
           <w:ilvl w:val="0"/>
-          <w:numId w:val="1004"/>
+          <w:numId w:val="1011"/>
         </w:numPr>
       </w:pPr>
       <w:r>
         <w:rPr>
           <w:lang w:val="nl"/>
         </w:rPr>
-        <w:t xml:space="preserve">Bevestig.</w:t>
-      </w:r>
-    </w:p>
-    <w:p>
-      <w:pPr>
-        <w:pStyle w:val="FirstParagraph"/>
-      </w:pPr>
-      <w:r>
-        <w:rPr>
-          <w:lang w:val="nl"/>
-        </w:rPr>
-        <w:t xml:space="preserve">Wat er dan gebeurt:</w:t>
+        <w:t xml:space="preserve">Klik op</w:t>
+      </w:r>
+      <w:r>
+        <w:rPr>
+          <w:lang w:val="nl"/>
+        </w:rPr>
+        <w:t xml:space="preserve"> </w:t>
+      </w:r>
+      <w:r>
+        <w:rPr>
+          <w:b/>
+          <w:bCs/>
+          <w:lang w:val="nl"/>
+        </w:rPr>
+        <w:t xml:space="preserve">Download</w:t>
+      </w:r>
+      <w:r>
+        <w:rPr>
+          <w:lang w:val="nl"/>
+        </w:rPr>
+        <w:t xml:space="preserve"> </w:t>
+      </w:r>
+      <w:r>
+        <w:rPr>
+          <w:lang w:val="nl"/>
+        </w:rPr>
+        <w:t xml:space="preserve">of</w:t>
+      </w:r>
+      <w:r>
+        <w:rPr>
+          <w:lang w:val="nl"/>
+        </w:rPr>
+        <w:t xml:space="preserve"> </w:t>
+      </w:r>
+      <w:r>
+        <w:rPr>
+          <w:b/>
+          <w:bCs/>
+          <w:lang w:val="nl"/>
+        </w:rPr>
+        <w:t xml:space="preserve">PDF</w:t>
+      </w:r>
+      <w:r>
+        <w:rPr>
+          <w:lang w:val="nl"/>
+        </w:rPr>
+        <w:t xml:space="preserve"> </w:t>
+      </w:r>
+      <w:r>
+        <w:rPr>
+          <w:lang w:val="nl"/>
+        </w:rPr>
+        <w:t xml:space="preserve">achter het stuk.</w:t>
       </w:r>
     </w:p>
     <w:p>
@@ -1275,14 +2697,38 @@
         <w:pStyle w:val="Compact"/>
         <w:numPr>
           <w:ilvl w:val="0"/>
-          <w:numId w:val="1005"/>
+          <w:numId w:val="1011"/>
         </w:numPr>
       </w:pPr>
       <w:r>
         <w:rPr>
           <w:lang w:val="nl"/>
         </w:rPr>
-        <w:t xml:space="preserve">De strandwacht kan de stukken niet meer wijzigen of verwijderen.</w:t>
+        <w:t xml:space="preserve">Op foto's (JPG of PNG) van het identiteitsbewijs en de bankpas staat een watermerk: "Kopie voor</w:t>
+      </w:r>
+      <w:r>
+        <w:rPr>
+          <w:lang w:val="nl"/>
+        </w:rPr>
+        <w:t xml:space="preserve"> </w:t>
+      </w:r>
+      <w:r>
+        <w:rPr>
+          <w:lang w:val="nl"/>
+        </w:rPr>
+        <w:t xml:space="preserve">loonadministratie Reddingsbrigade Paal 13", de datum en jouw naam. Het origineel in de kluis</w:t>
+      </w:r>
+      <w:r>
+        <w:rPr>
+          <w:lang w:val="nl"/>
+        </w:rPr>
+        <w:t xml:space="preserve"> </w:t>
+      </w:r>
+      <w:r>
+        <w:rPr>
+          <w:lang w:val="nl"/>
+        </w:rPr>
+        <w:t xml:space="preserve">blijft ongewijzigd. Een kopie die als PDF is geüpload krijgt geen watermerk.</w:t>
       </w:r>
     </w:p>
     <w:p>
@@ -1290,14 +2736,38 @@
         <w:pStyle w:val="Compact"/>
         <w:numPr>
           <w:ilvl w:val="0"/>
-          <w:numId w:val="1005"/>
+          <w:numId w:val="1011"/>
         </w:numPr>
       </w:pPr>
       <w:r>
         <w:rPr>
           <w:lang w:val="nl"/>
         </w:rPr>
-        <w:t xml:space="preserve">De bankpasfoto wordt na de ingestelde termijn (standaard 30 dagen) automatisch vernietigd.</w:t>
+        <w:t xml:space="preserve">Elke download wordt vastgelegd (wie, wanneer, welk stuk). Bij het identiteitsbewijs, de bankpas</w:t>
+      </w:r>
+      <w:r>
+        <w:rPr>
+          <w:lang w:val="nl"/>
+        </w:rPr>
+        <w:t xml:space="preserve"> </w:t>
+      </w:r>
+      <w:r>
+        <w:rPr>
+          <w:lang w:val="nl"/>
+        </w:rPr>
+        <w:t xml:space="preserve">en het loonheffingsformulier krijgt het bestuur standaard een mail dat jij iets hebt gedownload.</w:t>
+      </w:r>
+      <w:r>
+        <w:rPr>
+          <w:lang w:val="nl"/>
+        </w:rPr>
+        <w:t xml:space="preserve"> </w:t>
+      </w:r>
+      <w:r>
+        <w:rPr>
+          <w:lang w:val="nl"/>
+        </w:rPr>
+        <w:t xml:space="preserve">Dat is normaal en hoort zo.</w:t>
       </w:r>
     </w:p>
     <w:p>
@@ -1305,26 +2775,14 @@
         <w:pStyle w:val="Compact"/>
         <w:numPr>
           <w:ilvl w:val="0"/>
-          <w:numId w:val="1005"/>
+          <w:numId w:val="1011"/>
         </w:numPr>
       </w:pPr>
       <w:r>
         <w:rPr>
           <w:lang w:val="nl"/>
         </w:rPr>
-        <w:t xml:space="preserve">Het loonheffingsformulier en de ID-kopie blijven bewaard tot de wettelijke termijn is verstreken</w:t>
-      </w:r>
-      <w:r>
-        <w:rPr>
-          <w:lang w:val="nl"/>
-        </w:rPr>
-        <w:t xml:space="preserve"> </w:t>
-      </w:r>
-      <w:r>
-        <w:rPr>
-          <w:lang w:val="nl"/>
-        </w:rPr>
-        <w:t xml:space="preserve">(standaard 5 jaar na het einde van het dienstjaar) en worden dan automatisch vernietigd.</w:t>
+        <w:t xml:space="preserve">Je kunt maximaal 30 stukken per uur downloaden.</w:t>
       </w:r>
     </w:p>
     <w:p>
@@ -1332,26 +2790,14 @@
         <w:pStyle w:val="Compact"/>
         <w:numPr>
           <w:ilvl w:val="0"/>
-          <w:numId w:val="1005"/>
+          <w:numId w:val="1011"/>
         </w:numPr>
       </w:pPr>
       <w:r>
         <w:rPr>
           <w:lang w:val="nl"/>
         </w:rPr>
-        <w:t xml:space="preserve">De strandwacht kan zijn account niet meer zelf verwijderen (wettelijke bewaarplicht gaat voor);</w:t>
-      </w:r>
-      <w:r>
-        <w:rPr>
-          <w:lang w:val="nl"/>
-        </w:rPr>
-        <w:t xml:space="preserve"> </w:t>
-      </w:r>
-      <w:r>
-        <w:rPr>
-          <w:lang w:val="nl"/>
-        </w:rPr>
-        <w:t xml:space="preserve">het portaal legt dat uit.</w:t>
+        <w:t xml:space="preserve">Een downloadlink werkt alleen vanuit het beheer. Een link doorsturen heeft geen zin.</w:t>
       </w:r>
     </w:p>
     <w:p>
@@ -1362,7 +2808,278 @@
         <w:rPr>
           <w:lang w:val="nl"/>
         </w:rPr>
-        <w:t xml:space="preserve">Markeer een dossier pas als verwerkt als het écht verwerkt is. Terugdraaien kan niet zelf; vraag</w:t>
+        <w:t xml:space="preserve">Zet de stukken direct in de loonadministratie. Verwijder daarna de gedownloade bestanden van je</w:t>
+      </w:r>
+      <w:r>
+        <w:rPr>
+          <w:lang w:val="nl"/>
+        </w:rPr>
+        <w:t xml:space="preserve"> </w:t>
+      </w:r>
+      <w:r>
+        <w:rPr>
+          <w:lang w:val="nl"/>
+        </w:rPr>
+        <w:t xml:space="preserve">computer, ook uit je downloadmap en de prullenbak.</w:t>
+      </w:r>
+    </w:p>
+    <w:bookmarkEnd w:id="15"/>
+    <w:bookmarkStart w:id="16" w:name="een-dossier-verwerken"/>
+    <w:p>
+      <w:pPr>
+        <w:pStyle w:val="Heading1"/>
+      </w:pPr>
+      <w:r>
+        <w:rPr>
+          <w:lang w:val="nl"/>
+        </w:rPr>
+        <w:t xml:space="preserve">Een dossier verwerken</w:t>
+      </w:r>
+    </w:p>
+    <w:p>
+      <w:pPr>
+        <w:pStyle w:val="BlockText"/>
+      </w:pPr>
+      <w:r>
+        <w:rPr>
+          <w:b/>
+          <w:bCs/>
+          <w:lang w:val="nl"/>
+        </w:rPr>
+        <w:t xml:space="preserve">In het kort:</w:t>
+      </w:r>
+      <w:r>
+        <w:rPr>
+          <w:lang w:val="nl"/>
+        </w:rPr>
+        <w:t xml:space="preserve"> </w:t>
+      </w:r>
+      <w:r>
+        <w:rPr>
+          <w:lang w:val="nl"/>
+        </w:rPr>
+        <w:t xml:space="preserve">staan de gegevens in de loonadministratie, klik dan op "Verwerkt in de</w:t>
+      </w:r>
+      <w:r>
+        <w:rPr>
+          <w:lang w:val="nl"/>
+        </w:rPr>
+        <w:t xml:space="preserve"> </w:t>
+      </w:r>
+      <w:r>
+        <w:rPr>
+          <w:lang w:val="nl"/>
+        </w:rPr>
+        <w:t xml:space="preserve">loonadministratie" en bevestig. Dat is niet terug te draaien.</w:t>
+      </w:r>
+    </w:p>
+    <w:p>
+      <w:pPr>
+        <w:pStyle w:val="Compact"/>
+        <w:numPr>
+          <w:ilvl w:val="0"/>
+          <w:numId w:val="1012"/>
+        </w:numPr>
+      </w:pPr>
+      <w:r>
+        <w:rPr>
+          <w:lang w:val="nl"/>
+        </w:rPr>
+        <w:t xml:space="preserve">Klik in de kaart op</w:t>
+      </w:r>
+      <w:r>
+        <w:rPr>
+          <w:lang w:val="nl"/>
+        </w:rPr>
+        <w:t xml:space="preserve"> </w:t>
+      </w:r>
+      <w:r>
+        <w:rPr>
+          <w:b/>
+          <w:bCs/>
+          <w:lang w:val="nl"/>
+        </w:rPr>
+        <w:t xml:space="preserve">Verwerkt in de loonadministratie</w:t>
+      </w:r>
+      <w:r>
+        <w:rPr>
+          <w:lang w:val="nl"/>
+        </w:rPr>
+        <w:t xml:space="preserve">. Die knop staat er alleen bij een</w:t>
+      </w:r>
+      <w:r>
+        <w:rPr>
+          <w:lang w:val="nl"/>
+        </w:rPr>
+        <w:t xml:space="preserve"> </w:t>
+      </w:r>
+      <w:r>
+        <w:rPr>
+          <w:lang w:val="nl"/>
+        </w:rPr>
+        <w:t xml:space="preserve">compleet dossier.</w:t>
+      </w:r>
+    </w:p>
+    <w:p>
+      <w:pPr>
+        <w:pStyle w:val="Compact"/>
+        <w:numPr>
+          <w:ilvl w:val="0"/>
+          <w:numId w:val="1012"/>
+        </w:numPr>
+      </w:pPr>
+      <w:r>
+        <w:rPr>
+          <w:lang w:val="nl"/>
+        </w:rPr>
+        <w:t xml:space="preserve">Je krijgt een apart scherm dat uitlegt wat er gebeurt. Klik op</w:t>
+      </w:r>
+      <w:r>
+        <w:rPr>
+          <w:lang w:val="nl"/>
+        </w:rPr>
+        <w:t xml:space="preserve"> </w:t>
+      </w:r>
+      <w:r>
+        <w:rPr>
+          <w:b/>
+          <w:bCs/>
+          <w:lang w:val="nl"/>
+        </w:rPr>
+        <w:t xml:space="preserve">Ja, verwerkt</w:t>
+      </w:r>
+      <w:r>
+        <w:rPr>
+          <w:lang w:val="nl"/>
+        </w:rPr>
+        <w:t xml:space="preserve">.</w:t>
+      </w:r>
+    </w:p>
+    <w:p>
+      <w:pPr>
+        <w:pStyle w:val="FirstParagraph"/>
+      </w:pPr>
+      <w:r>
+        <w:rPr>
+          <w:lang w:val="nl"/>
+        </w:rPr>
+        <w:t xml:space="preserve">Wat er dan gebeurt:</w:t>
+      </w:r>
+    </w:p>
+    <w:p>
+      <w:pPr>
+        <w:pStyle w:val="Compact"/>
+        <w:numPr>
+          <w:ilvl w:val="0"/>
+          <w:numId w:val="1013"/>
+        </w:numPr>
+      </w:pPr>
+      <w:r>
+        <w:rPr>
+          <w:lang w:val="nl"/>
+        </w:rPr>
+        <w:t xml:space="preserve">De strandwacht kan de stukken niet meer vervangen of verwijderen.</w:t>
+      </w:r>
+    </w:p>
+    <w:p>
+      <w:pPr>
+        <w:pStyle w:val="Compact"/>
+        <w:numPr>
+          <w:ilvl w:val="0"/>
+          <w:numId w:val="1013"/>
+        </w:numPr>
+      </w:pPr>
+      <w:r>
+        <w:rPr>
+          <w:lang w:val="nl"/>
+        </w:rPr>
+        <w:t xml:space="preserve">De kopie van de bankpas wordt na de bewaartermijn (standaard 30 dagen) automatisch vernietigd.</w:t>
+      </w:r>
+    </w:p>
+    <w:p>
+      <w:pPr>
+        <w:pStyle w:val="Compact"/>
+        <w:numPr>
+          <w:ilvl w:val="0"/>
+          <w:numId w:val="1013"/>
+        </w:numPr>
+      </w:pPr>
+      <w:r>
+        <w:rPr>
+          <w:lang w:val="nl"/>
+        </w:rPr>
+        <w:t xml:space="preserve">Het loonheffingsformulier en de kopie van het identiteitsbewijs blijven bewaard tot de wettelijke</w:t>
+      </w:r>
+      <w:r>
+        <w:rPr>
+          <w:lang w:val="nl"/>
+        </w:rPr>
+        <w:t xml:space="preserve"> </w:t>
+      </w:r>
+      <w:r>
+        <w:rPr>
+          <w:lang w:val="nl"/>
+        </w:rPr>
+        <w:t xml:space="preserve">termijn voorbij is (zie</w:t>
+      </w:r>
+      <w:r>
+        <w:rPr>
+          <w:lang w:val="nl"/>
+        </w:rPr>
+        <w:t xml:space="preserve"> </w:t>
+      </w:r>
+      <w:hyperlink w:anchor="bewaartermijnen-en-verwijderen">
+        <w:r>
+          <w:rPr>
+            <w:rStyle w:val="Hyperlink"/>
+            <w:lang w:val="nl"/>
+          </w:rPr>
+          <w:t xml:space="preserve">Bewaartermijnen en verwijderen</w:t>
+        </w:r>
+      </w:hyperlink>
+      <w:r>
+        <w:rPr>
+          <w:lang w:val="nl"/>
+        </w:rPr>
+        <w:t xml:space="preserve">).</w:t>
+      </w:r>
+    </w:p>
+    <w:p>
+      <w:pPr>
+        <w:pStyle w:val="Compact"/>
+        <w:numPr>
+          <w:ilvl w:val="0"/>
+          <w:numId w:val="1013"/>
+        </w:numPr>
+      </w:pPr>
+      <w:r>
+        <w:rPr>
+          <w:lang w:val="nl"/>
+        </w:rPr>
+        <w:t xml:space="preserve">De strandwacht kan het account niet meer zelf verwijderen, omdat de wettelijke bewaarplicht</w:t>
+      </w:r>
+      <w:r>
+        <w:rPr>
+          <w:lang w:val="nl"/>
+        </w:rPr>
+        <w:t xml:space="preserve"> </w:t>
+      </w:r>
+      <w:r>
+        <w:rPr>
+          <w:lang w:val="nl"/>
+        </w:rPr>
+        <w:t xml:space="preserve">voorgaat. Het portaal legt dat uit.</w:t>
+      </w:r>
+    </w:p>
+    <w:p>
+      <w:pPr>
+        <w:pStyle w:val="FirstParagraph"/>
+      </w:pPr>
+      <w:r>
+        <w:rPr>
+          <w:lang w:val="nl"/>
+        </w:rPr>
+        <w:t xml:space="preserve">Markeer een dossier pas als verwerkt als het echt verwerkt is. Zelf terugdraaien kan niet; vraag</w:t>
       </w:r>
       <w:r>
         <w:rPr>
@@ -1377,8 +3094,8 @@
         <w:t xml:space="preserve">dan de admin.</w:t>
       </w:r>
     </w:p>
-    <w:bookmarkEnd w:id="15"/>
-    <w:bookmarkStart w:id="16" w:name="bankpas-vernietigen"/>
+    <w:bookmarkEnd w:id="16"/>
+    <w:bookmarkStart w:id="17" w:name="bankpas-vernietigen"/>
     <w:p>
       <w:pPr>
         <w:pStyle w:val="Heading1"/>
@@ -1392,13 +3109,50 @@
     </w:p>
     <w:p>
       <w:pPr>
+        <w:pStyle w:val="BlockText"/>
+      </w:pPr>
+      <w:r>
+        <w:rPr>
+          <w:b/>
+          <w:bCs/>
+          <w:lang w:val="nl"/>
+        </w:rPr>
+        <w:t xml:space="preserve">In het kort:</w:t>
+      </w:r>
+      <w:r>
+        <w:rPr>
+          <w:lang w:val="nl"/>
+        </w:rPr>
+        <w:t xml:space="preserve"> </w:t>
+      </w:r>
+      <w:r>
+        <w:rPr>
+          <w:lang w:val="nl"/>
+        </w:rPr>
+        <w:t xml:space="preserve">de bankpasfoto verdwijnt normaal vanzelf. Moet hij eerder weg, klik dan op</w:t>
+      </w:r>
+      <w:r>
+        <w:rPr>
+          <w:lang w:val="nl"/>
+        </w:rPr>
+        <w:t xml:space="preserve"> </w:t>
+      </w:r>
+      <w:r>
+        <w:rPr>
+          <w:lang w:val="nl"/>
+        </w:rPr>
+        <w:t xml:space="preserve">"Vernietigen" en bevestig.</w:t>
+      </w:r>
+    </w:p>
+    <w:p>
+      <w:pPr>
         <w:pStyle w:val="FirstParagraph"/>
       </w:pPr>
       <w:r>
         <w:rPr>
           <w:lang w:val="nl"/>
         </w:rPr>
-        <w:t xml:space="preserve">Wil je de bankpasfoto eerder weg dan de automatische termijn, klik dan op</w:t>
+        <w:t xml:space="preserve">Klik op</w:t>
       </w:r>
       <w:r>
         <w:rPr>
@@ -1424,23 +3178,78 @@
         <w:rPr>
           <w:lang w:val="nl"/>
         </w:rPr>
-        <w:t xml:space="preserve">achter de</w:t>
-      </w:r>
-      <w:r>
-        <w:rPr>
-          <w:lang w:val="nl"/>
-        </w:rPr>
-        <w:t xml:space="preserve"> </w:t>
-      </w:r>
-      <w:r>
-        <w:rPr>
-          <w:lang w:val="nl"/>
-        </w:rPr>
-        <w:t xml:space="preserve">bankpas en bevestig. Dit kan alleen voor de bankpas; de andere stukken vallen onder de bewaarplicht.</w:t>
-      </w:r>
-    </w:p>
-    <w:bookmarkEnd w:id="16"/>
-    <w:bookmarkStart w:id="17" w:name="bewaartermijnen-en-verwijderen"/>
+        <w:t xml:space="preserve">achter de kopie van de bankpas. Op het volgende scherm lees je wat er</w:t>
+      </w:r>
+      <w:r>
+        <w:rPr>
+          <w:lang w:val="nl"/>
+        </w:rPr>
+        <w:t xml:space="preserve"> </w:t>
+      </w:r>
+      <w:r>
+        <w:rPr>
+          <w:lang w:val="nl"/>
+        </w:rPr>
+        <w:t xml:space="preserve">gebeurt en klik je op</w:t>
+      </w:r>
+      <w:r>
+        <w:rPr>
+          <w:lang w:val="nl"/>
+        </w:rPr>
+        <w:t xml:space="preserve"> </w:t>
+      </w:r>
+      <w:r>
+        <w:rPr>
+          <w:b/>
+          <w:bCs/>
+          <w:lang w:val="nl"/>
+        </w:rPr>
+        <w:t xml:space="preserve">Ja, vernietigen</w:t>
+      </w:r>
+      <w:r>
+        <w:rPr>
+          <w:lang w:val="nl"/>
+        </w:rPr>
+        <w:t xml:space="preserve">. Het bestand wordt uit de kluis gewist en is niet terug</w:t>
+      </w:r>
+      <w:r>
+        <w:rPr>
+          <w:lang w:val="nl"/>
+        </w:rPr>
+        <w:t xml:space="preserve"> </w:t>
+      </w:r>
+      <w:r>
+        <w:rPr>
+          <w:lang w:val="nl"/>
+        </w:rPr>
+        <w:t xml:space="preserve">te halen. Dat het er was en wie het vernietigde, blijft in het logboek staan. De rest van het</w:t>
+      </w:r>
+      <w:r>
+        <w:rPr>
+          <w:lang w:val="nl"/>
+        </w:rPr>
+        <w:t xml:space="preserve"> </w:t>
+      </w:r>
+      <w:r>
+        <w:rPr>
+          <w:lang w:val="nl"/>
+        </w:rPr>
+        <w:t xml:space="preserve">dossier blijft ongemoeid.</w:t>
+      </w:r>
+    </w:p>
+    <w:p>
+      <w:pPr>
+        <w:pStyle w:val="BodyText"/>
+      </w:pPr>
+      <w:r>
+        <w:rPr>
+          <w:lang w:val="nl"/>
+        </w:rPr>
+        <w:t xml:space="preserve">Dit kan alleen bij de bankpas; de andere stukken vallen onder de bewaarplicht.</w:t>
+      </w:r>
+    </w:p>
+    <w:bookmarkEnd w:id="17"/>
+    <w:bookmarkStart w:id="18" w:name="bewaartermijnen-en-verwijderen"/>
     <w:p>
       <w:pPr>
         <w:pStyle w:val="Heading1"/>
@@ -1450,6 +3259,55 @@
           <w:lang w:val="nl"/>
         </w:rPr>
         <w:t xml:space="preserve">Bewaartermijnen en verwijderen</w:t>
+      </w:r>
+    </w:p>
+    <w:p>
+      <w:pPr>
+        <w:pStyle w:val="BlockText"/>
+      </w:pPr>
+      <w:r>
+        <w:rPr>
+          <w:b/>
+          <w:bCs/>
+          <w:lang w:val="nl"/>
+        </w:rPr>
+        <w:t xml:space="preserve">In het kort:</w:t>
+      </w:r>
+      <w:r>
+        <w:rPr>
+          <w:lang w:val="nl"/>
+        </w:rPr>
+        <w:t xml:space="preserve"> </w:t>
+      </w:r>
+      <w:r>
+        <w:rPr>
+          <w:lang w:val="nl"/>
+        </w:rPr>
+        <w:t xml:space="preserve">loonheffing en kopie ID blijven 5 jaar na het einde van het dienstjaar, de</w:t>
+      </w:r>
+      <w:r>
+        <w:rPr>
+          <w:lang w:val="nl"/>
+        </w:rPr>
+        <w:t xml:space="preserve"> </w:t>
+      </w:r>
+      <w:r>
+        <w:rPr>
+          <w:lang w:val="nl"/>
+        </w:rPr>
+        <w:t xml:space="preserve">bankpasfoto 30 dagen na verwerking. Het systeem ruimt dat automatisch op, maar alleen als het</w:t>
+      </w:r>
+      <w:r>
+        <w:rPr>
+          <w:lang w:val="nl"/>
+        </w:rPr>
+        <w:t xml:space="preserve"> </w:t>
+      </w:r>
+      <w:r>
+        <w:rPr>
+          <w:lang w:val="nl"/>
+        </w:rPr>
+        <w:t xml:space="preserve">bestuur het automatisch opschonen heeft aangezet.</w:t>
       </w:r>
     </w:p>
     <w:tbl>
@@ -1505,7 +3363,7 @@
               <w:rPr>
                 <w:lang w:val="nl"/>
               </w:rPr>
-              <w:t xml:space="preserve">Wie stelt in</w:t>
+              <w:t xml:space="preserve">Grond</w:t>
             </w:r>
           </w:p>
         </w:tc>
@@ -1521,7 +3379,7 @@
               <w:rPr>
                 <w:lang w:val="nl"/>
               </w:rPr>
-              <w:t xml:space="preserve">Loonheffingsformulier en kopie ID</w:t>
+              <w:t xml:space="preserve">Loonheffingsformulier en kopie identiteitsbewijs</w:t>
             </w:r>
           </w:p>
         </w:tc>
@@ -1535,7 +3393,7 @@
               <w:rPr>
                 <w:lang w:val="nl"/>
               </w:rPr>
-              <w:t xml:space="preserve">5 jaar na einde van het dienstjaar</w:t>
+              <w:t xml:space="preserve">5 jaar na het einde van het kalenderjaar waarin de strandwacht werkte</w:t>
             </w:r>
           </w:p>
         </w:tc>
@@ -1549,7 +3407,7 @@
               <w:rPr>
                 <w:lang w:val="nl"/>
               </w:rPr>
-              <w:t xml:space="preserve">Bestuur, Instellingen › Bewaartermijnen</w:t>
+              <w:t xml:space="preserve">Wettelijke bewaarplicht loonadministratie</w:t>
             </w:r>
           </w:p>
         </w:tc>
@@ -1579,7 +3437,7 @@
               <w:rPr>
                 <w:lang w:val="nl"/>
               </w:rPr>
-              <w:t xml:space="preserve">30 dagen na "verwerkt"</w:t>
+              <w:t xml:space="preserve">30 dagen nadat jij het dossier als verwerkt hebt gemarkeerd</w:t>
             </w:r>
           </w:p>
         </w:tc>
@@ -1593,7 +3451,51 @@
               <w:rPr>
                 <w:lang w:val="nl"/>
               </w:rPr>
-              <w:t xml:space="preserve">Bestuur, Instellingen › Bewaartermijnen</w:t>
+              <w:t xml:space="preserve">Alleen nodig om het rekeningnummer over te nemen</w:t>
+            </w:r>
+          </w:p>
+        </w:tc>
+      </w:tr>
+      <w:tr>
+        <w:tc>
+          <w:tcPr/>
+          <w:p>
+            <w:pPr>
+              <w:pStyle w:val="Compact"/>
+            </w:pPr>
+            <w:r>
+              <w:rPr>
+                <w:lang w:val="nl"/>
+              </w:rPr>
+              <w:t xml:space="preserve">Inschrijving als lid</w:t>
+            </w:r>
+          </w:p>
+        </w:tc>
+        <w:tc>
+          <w:tcPr/>
+          <w:p>
+            <w:pPr>
+              <w:pStyle w:val="Compact"/>
+            </w:pPr>
+            <w:r>
+              <w:rPr>
+                <w:lang w:val="nl"/>
+              </w:rPr>
+              <w:t xml:space="preserve">Volgt het dossier: 2 jaar na het laatste seizoen</w:t>
+            </w:r>
+          </w:p>
+        </w:tc>
+        <w:tc>
+          <w:tcPr/>
+          <w:p>
+            <w:pPr>
+              <w:pStyle w:val="Compact"/>
+            </w:pPr>
+            <w:r>
+              <w:rPr>
+                <w:lang w:val="nl"/>
+              </w:rPr>
+              <w:t xml:space="preserve">Geen wettelijke termijn</w:t>
             </w:r>
           </w:p>
         </w:tc>
@@ -1607,7 +3509,61 @@
         <w:rPr>
           <w:lang w:val="nl"/>
         </w:rPr>
-        <w:t xml:space="preserve">De opschoning draait automatisch. Wat is vernietigd staat in het Logboek onder "opschoning".</w:t>
+        <w:t xml:space="preserve">Het opruimen gebeurt één keer per dag automatisch,</w:t>
+      </w:r>
+      <w:r>
+        <w:rPr>
+          <w:lang w:val="nl"/>
+        </w:rPr>
+        <w:t xml:space="preserve"> </w:t>
+      </w:r>
+      <w:r>
+        <w:rPr>
+          <w:b/>
+          <w:bCs/>
+          <w:lang w:val="nl"/>
+        </w:rPr>
+        <w:t xml:space="preserve">maar alleen als "Automatisch opschonen</w:t>
+      </w:r>
+      <w:r>
+        <w:rPr>
+          <w:b/>
+          <w:bCs/>
+          <w:lang w:val="nl"/>
+        </w:rPr>
+        <w:t xml:space="preserve"> </w:t>
+      </w:r>
+      <w:r>
+        <w:rPr>
+          <w:b/>
+          <w:bCs/>
+          <w:lang w:val="nl"/>
+        </w:rPr>
+        <w:t xml:space="preserve">inschakelen" aan staat</w:t>
+      </w:r>
+      <w:r>
+        <w:rPr>
+          <w:lang w:val="nl"/>
+        </w:rPr>
+        <w:t xml:space="preserve"> </w:t>
+      </w:r>
+      <w:r>
+        <w:rPr>
+          <w:lang w:val="nl"/>
+        </w:rPr>
+        <w:t xml:space="preserve">bij Instellingen › Bewaren &amp; opschonen. Dat staat standaard uit. Vraag</w:t>
+      </w:r>
+      <w:r>
+        <w:rPr>
+          <w:lang w:val="nl"/>
+        </w:rPr>
+        <w:t xml:space="preserve"> </w:t>
+      </w:r>
+      <w:r>
+        <w:rPr>
+          <w:lang w:val="nl"/>
+        </w:rPr>
+        <w:t xml:space="preserve">het bestuur of dat aan staat; anders blijft alles staan, ook de bankpasfoto's.</w:t>
       </w:r>
     </w:p>
     <w:p>
@@ -1618,35 +3574,108 @@
         <w:rPr>
           <w:lang w:val="nl"/>
         </w:rPr>
-        <w:t xml:space="preserve">Trekt een strandwacht zich terug vóórdat het dossier verwerkt is, dan kan hij zijn gegevens zelf</w:t>
-      </w:r>
-      <w:r>
-        <w:rPr>
-          <w:lang w:val="nl"/>
-        </w:rPr>
-        <w:t xml:space="preserve"> </w:t>
-      </w:r>
-      <w:r>
-        <w:rPr>
-          <w:lang w:val="nl"/>
-        </w:rPr>
-        <w:t xml:space="preserve">verwijderen en verdwijnen de stukken mee. Gaat het dienstverband niet door nádat je het dossier</w:t>
-      </w:r>
-      <w:r>
-        <w:rPr>
-          <w:lang w:val="nl"/>
-        </w:rPr>
-        <w:t xml:space="preserve"> </w:t>
-      </w:r>
-      <w:r>
-        <w:rPr>
-          <w:lang w:val="nl"/>
-        </w:rPr>
-        <w:t xml:space="preserve">verwerkt hebt, dan kan alleen een beheerder het dossier verwijderen, met een aparte bevestiging.</w:t>
-      </w:r>
-    </w:p>
-    <w:bookmarkEnd w:id="17"/>
-    <w:bookmarkStart w:id="18" w:name="wat-je-nooit-doet"/>
+        <w:t xml:space="preserve">De termijnen van 5 jaar en 30 dagen zijn standaardwaarden. Ze staan niet als veld op het scherm</w:t>
+      </w:r>
+      <w:r>
+        <w:rPr>
+          <w:lang w:val="nl"/>
+        </w:rPr>
+        <w:t xml:space="preserve"> </w:t>
+      </w:r>
+      <w:r>
+        <w:rPr>
+          <w:lang w:val="nl"/>
+        </w:rPr>
+        <w:t xml:space="preserve">Bewaren &amp; opschonen; aanpassen kan alleen de technisch beheerder. Wat er is vernietigd, ziet de</w:t>
+      </w:r>
+      <w:r>
+        <w:rPr>
+          <w:lang w:val="nl"/>
+        </w:rPr>
+        <w:t xml:space="preserve"> </w:t>
+      </w:r>
+      <w:r>
+        <w:rPr>
+          <w:lang w:val="nl"/>
+        </w:rPr>
+        <w:t xml:space="preserve">admin in het Logboek.</w:t>
+      </w:r>
+    </w:p>
+    <w:p>
+      <w:pPr>
+        <w:pStyle w:val="BodyText"/>
+      </w:pPr>
+      <w:r>
+        <w:rPr>
+          <w:b/>
+          <w:bCs/>
+          <w:lang w:val="nl"/>
+        </w:rPr>
+        <w:t xml:space="preserve">Terugtrekken.</w:t>
+      </w:r>
+      <w:r>
+        <w:rPr>
+          <w:lang w:val="nl"/>
+        </w:rPr>
+        <w:t xml:space="preserve"> </w:t>
+      </w:r>
+      <w:r>
+        <w:rPr>
+          <w:lang w:val="nl"/>
+        </w:rPr>
+        <w:t xml:space="preserve">Trekt een strandwacht zich terug vóórdat het dossier verwerkt is, dan kan die</w:t>
+      </w:r>
+      <w:r>
+        <w:rPr>
+          <w:lang w:val="nl"/>
+        </w:rPr>
+        <w:t xml:space="preserve"> </w:t>
+      </w:r>
+      <w:r>
+        <w:rPr>
+          <w:lang w:val="nl"/>
+        </w:rPr>
+        <w:t xml:space="preserve">de gegevens zelf verwijderen in het portaal; de stukken worden dan meteen vernietigd. Is het</w:t>
+      </w:r>
+      <w:r>
+        <w:rPr>
+          <w:lang w:val="nl"/>
+        </w:rPr>
+        <w:t xml:space="preserve"> </w:t>
+      </w:r>
+      <w:r>
+        <w:rPr>
+          <w:lang w:val="nl"/>
+        </w:rPr>
+        <w:t xml:space="preserve">dossier al verwerkt en gaat het dienstverband toch niet door, dan kan alleen iemand met het recht</w:t>
+      </w:r>
+      <w:r>
+        <w:rPr>
+          <w:lang w:val="nl"/>
+        </w:rPr>
+        <w:t xml:space="preserve"> </w:t>
+      </w:r>
+      <w:r>
+        <w:rPr>
+          <w:lang w:val="nl"/>
+        </w:rPr>
+        <w:t xml:space="preserve">om sollicitanten te verwijderen (standaard bestuur en admin) het dossier verwijderen. Het systeem</w:t>
+      </w:r>
+      <w:r>
+        <w:rPr>
+          <w:lang w:val="nl"/>
+        </w:rPr>
+        <w:t xml:space="preserve"> </w:t>
+      </w:r>
+      <w:r>
+        <w:rPr>
+          <w:lang w:val="nl"/>
+        </w:rPr>
+        <w:t xml:space="preserve">vraagt dan apart om te bevestigen dat het dienstverband niet is doorgegaan.</w:t>
+      </w:r>
+    </w:p>
+    <w:bookmarkEnd w:id="18"/>
+    <w:bookmarkStart w:id="19" w:name="wat-je-nooit-doet"/>
     <w:p>
       <w:pPr>
         <w:pStyle w:val="Heading1"/>
@@ -1656,6 +3685,43 @@
           <w:lang w:val="nl"/>
         </w:rPr>
         <w:t xml:space="preserve">Wat je nooit doet</w:t>
+      </w:r>
+    </w:p>
+    <w:p>
+      <w:pPr>
+        <w:pStyle w:val="BlockText"/>
+      </w:pPr>
+      <w:r>
+        <w:rPr>
+          <w:b/>
+          <w:bCs/>
+          <w:lang w:val="nl"/>
+        </w:rPr>
+        <w:t xml:space="preserve">In het kort:</w:t>
+      </w:r>
+      <w:r>
+        <w:rPr>
+          <w:lang w:val="nl"/>
+        </w:rPr>
+        <w:t xml:space="preserve"> </w:t>
+      </w:r>
+      <w:r>
+        <w:rPr>
+          <w:lang w:val="nl"/>
+        </w:rPr>
+        <w:t xml:space="preserve">stukken blijven in het beheer en in de loonadministratie. Niet mailen, niet</w:t>
+      </w:r>
+      <w:r>
+        <w:rPr>
+          <w:lang w:val="nl"/>
+        </w:rPr>
+        <w:t xml:space="preserve"> </w:t>
+      </w:r>
+      <w:r>
+        <w:rPr>
+          <w:lang w:val="nl"/>
+        </w:rPr>
+        <w:t xml:space="preserve">kopiëren, niet delen.</w:t>
       </w:r>
     </w:p>
     <w:p>
@@ -1663,7 +3729,7 @@
         <w:pStyle w:val="Compact"/>
         <w:numPr>
           <w:ilvl w:val="0"/>
-          <w:numId w:val="1006"/>
+          <w:numId w:val="1014"/>
         </w:numPr>
       </w:pPr>
       <w:r>
@@ -1678,14 +3744,26 @@
         <w:pStyle w:val="Compact"/>
         <w:numPr>
           <w:ilvl w:val="0"/>
-          <w:numId w:val="1006"/>
+          <w:numId w:val="1014"/>
         </w:numPr>
       </w:pPr>
       <w:r>
         <w:rPr>
           <w:lang w:val="nl"/>
         </w:rPr>
-        <w:t xml:space="preserve">Een BSN of IBAN in een spreadsheet, notitie of chat zetten buiten de loonadministratie.</w:t>
+        <w:t xml:space="preserve">Een BSN of rekeningnummer in een spreadsheet, notitie of chat zetten buiten de</w:t>
+      </w:r>
+      <w:r>
+        <w:rPr>
+          <w:lang w:val="nl"/>
+        </w:rPr>
+        <w:t xml:space="preserve"> </w:t>
+      </w:r>
+      <w:r>
+        <w:rPr>
+          <w:lang w:val="nl"/>
+        </w:rPr>
+        <w:t xml:space="preserve">loonadministratie.</w:t>
       </w:r>
     </w:p>
     <w:p>
@@ -1693,7 +3771,7 @@
         <w:pStyle w:val="Compact"/>
         <w:numPr>
           <w:ilvl w:val="0"/>
-          <w:numId w:val="1006"/>
+          <w:numId w:val="1014"/>
         </w:numPr>
       </w:pPr>
       <w:r>
@@ -1708,18 +3786,33 @@
         <w:pStyle w:val="Compact"/>
         <w:numPr>
           <w:ilvl w:val="0"/>
-          <w:numId w:val="1006"/>
+          <w:numId w:val="1014"/>
         </w:numPr>
       </w:pPr>
       <w:r>
         <w:rPr>
           <w:lang w:val="nl"/>
         </w:rPr>
-        <w:t xml:space="preserve">Screenshots maken van ID-kopieën.</w:t>
-      </w:r>
-    </w:p>
-    <w:bookmarkEnd w:id="18"/>
-    <w:bookmarkStart w:id="19" w:name="veelgestelde-vragen"/>
+        <w:t xml:space="preserve">Screenshots maken van kopieën van identiteitsbewijzen.</w:t>
+      </w:r>
+    </w:p>
+    <w:p>
+      <w:pPr>
+        <w:pStyle w:val="Compact"/>
+        <w:numPr>
+          <w:ilvl w:val="0"/>
+          <w:numId w:val="1014"/>
+        </w:numPr>
+      </w:pPr>
+      <w:r>
+        <w:rPr>
+          <w:lang w:val="nl"/>
+        </w:rPr>
+        <w:t xml:space="preserve">Gedownloade bestanden laten staan op je computer.</w:t>
+      </w:r>
+    </w:p>
+    <w:bookmarkEnd w:id="19"/>
+    <w:bookmarkStart w:id="20" w:name="veelgestelde-vragen"/>
     <w:p>
       <w:pPr>
         <w:pStyle w:val="Heading1"/>
@@ -1733,6 +3826,43 @@
     </w:p>
     <w:p>
       <w:pPr>
+        <w:pStyle w:val="BlockText"/>
+      </w:pPr>
+      <w:r>
+        <w:rPr>
+          <w:b/>
+          <w:bCs/>
+          <w:lang w:val="nl"/>
+        </w:rPr>
+        <w:t xml:space="preserve">In het kort:</w:t>
+      </w:r>
+      <w:r>
+        <w:rPr>
+          <w:lang w:val="nl"/>
+        </w:rPr>
+        <w:t xml:space="preserve"> </w:t>
+      </w:r>
+      <w:r>
+        <w:rPr>
+          <w:lang w:val="nl"/>
+        </w:rPr>
+        <w:t xml:space="preserve">de meeste vragen gaan over een dossier dat oranje blijft, een verificatiecode</w:t>
+      </w:r>
+      <w:r>
+        <w:rPr>
+          <w:lang w:val="nl"/>
+        </w:rPr>
+        <w:t xml:space="preserve"> </w:t>
+      </w:r>
+      <w:r>
+        <w:rPr>
+          <w:lang w:val="nl"/>
+        </w:rPr>
+        <w:t xml:space="preserve">die niet aankomt of het watermerk.</w:t>
+      </w:r>
+    </w:p>
+    <w:p>
+      <w:pPr>
         <w:pStyle w:val="FirstParagraph"/>
       </w:pPr>
       <w:r>
@@ -1750,19 +3880,31 @@
         <w:rPr>
           <w:lang w:val="nl"/>
         </w:rPr>
-        <w:t xml:space="preserve">Kijk welk stuk ontbreekt. Bij een ID-kaart moet ook de achterkant erbij; bij een paspoort niet. Het</w:t>
-      </w:r>
-      <w:r>
-        <w:rPr>
-          <w:lang w:val="nl"/>
-        </w:rPr>
-        <w:t xml:space="preserve"> </w:t>
-      </w:r>
-      <w:r>
-        <w:rPr>
-          <w:lang w:val="nl"/>
-        </w:rPr>
-        <w:t xml:space="preserve">loonheffingsformulier telt pas mee na de ondertekening met verificatiecode.</w:t>
+        <w:t xml:space="preserve">Kijk achter "Ontbreekt nog" welk stuk mist. Bij een identiteitskaart moet ook de achterkant erbij;</w:t>
+      </w:r>
+      <w:r>
+        <w:rPr>
+          <w:lang w:val="nl"/>
+        </w:rPr>
+        <w:t xml:space="preserve"> </w:t>
+      </w:r>
+      <w:r>
+        <w:rPr>
+          <w:lang w:val="nl"/>
+        </w:rPr>
+        <w:t xml:space="preserve">bij een paspoort niet. Het loonheffingsformulier telt pas mee na het ondertekenen met de</w:t>
+      </w:r>
+      <w:r>
+        <w:rPr>
+          <w:lang w:val="nl"/>
+        </w:rPr>
+        <w:t xml:space="preserve"> </w:t>
+      </w:r>
+      <w:r>
+        <w:rPr>
+          <w:lang w:val="nl"/>
+        </w:rPr>
+        <w:t xml:space="preserve">verificatiecode.</w:t>
       </w:r>
     </w:p>
     <w:p>
@@ -1775,6 +3917,52 @@
           <w:bCs/>
           <w:lang w:val="nl"/>
         </w:rPr>
+        <w:t xml:space="preserve">Het dossier is groen, maar ik heb geen mail gekregen.</w:t>
+      </w:r>
+      <w:r>
+        <w:br/>
+      </w:r>
+      <w:r>
+        <w:rPr>
+          <w:lang w:val="nl"/>
+        </w:rPr>
+        <w:t xml:space="preserve">Dat kan: de mail gaat alleen mee op het moment dat het loonheffingsformulier wordt ondertekend.</w:t>
+      </w:r>
+      <w:r>
+        <w:rPr>
+          <w:lang w:val="nl"/>
+        </w:rPr>
+        <w:t xml:space="preserve"> </w:t>
+      </w:r>
+      <w:r>
+        <w:rPr>
+          <w:lang w:val="nl"/>
+        </w:rPr>
+        <w:t xml:space="preserve">Kwam een kopie later binnen, dan komt er geen mail. Verwerk het dossier gewoon, of klik op</w:t>
+      </w:r>
+      <w:r>
+        <w:rPr>
+          <w:lang w:val="nl"/>
+        </w:rPr>
+        <w:t xml:space="preserve"> </w:t>
+      </w:r>
+      <w:r>
+        <w:rPr>
+          <w:lang w:val="nl"/>
+        </w:rPr>
+        <w:t xml:space="preserve">"Melding opnieuw naar de penningmeester" als je de mail toch wilt hebben.</w:t>
+      </w:r>
+    </w:p>
+    <w:p>
+      <w:pPr>
+        <w:pStyle w:val="BodyText"/>
+      </w:pPr>
+      <w:r>
+        <w:rPr>
+          <w:b/>
+          <w:bCs/>
+          <w:lang w:val="nl"/>
+        </w:rPr>
         <w:t xml:space="preserve">De strandwacht krijgt geen verificatiecode.</w:t>
       </w:r>
       <w:r>
@@ -1784,31 +3972,31 @@
         <w:rPr>
           <w:lang w:val="nl"/>
         </w:rPr>
-        <w:t xml:space="preserve">De code gaat naar het telefoonnummer uit het dossier (sms, anders WhatsApp, anders e-mail). Laat</w:t>
-      </w:r>
-      <w:r>
-        <w:rPr>
-          <w:lang w:val="nl"/>
-        </w:rPr>
-        <w:t xml:space="preserve"> </w:t>
-      </w:r>
-      <w:r>
-        <w:rPr>
-          <w:lang w:val="nl"/>
-        </w:rPr>
-        <w:t xml:space="preserve">het nummer controleren bij "Mijn gegevens" in het portaal. Blijft het misgaan, dan is dat iets</w:t>
-      </w:r>
-      <w:r>
-        <w:rPr>
-          <w:lang w:val="nl"/>
-        </w:rPr>
-        <w:t xml:space="preserve"> </w:t>
-      </w:r>
-      <w:r>
-        <w:rPr>
-          <w:lang w:val="nl"/>
-        </w:rPr>
-        <w:t xml:space="preserve">voor de admin (foutenlog).</w:t>
+        <w:t xml:space="preserve">De code gaat per sms naar het telefoonnummer uit het dossier; staat sms uit, dan via WhatsApp,</w:t>
+      </w:r>
+      <w:r>
+        <w:rPr>
+          <w:lang w:val="nl"/>
+        </w:rPr>
+        <w:t xml:space="preserve"> </w:t>
+      </w:r>
+      <w:r>
+        <w:rPr>
+          <w:lang w:val="nl"/>
+        </w:rPr>
+        <w:t xml:space="preserve">en anders per e-mail. Klopt het nummer niet, laat het bestuur het dan aanpassen in het dossier.</w:t>
+      </w:r>
+      <w:r>
+        <w:rPr>
+          <w:lang w:val="nl"/>
+        </w:rPr>
+        <w:t xml:space="preserve"> </w:t>
+      </w:r>
+      <w:r>
+        <w:rPr>
+          <w:lang w:val="nl"/>
+        </w:rPr>
+        <w:t xml:space="preserve">Blijft het misgaan, dan is het iets voor de admin (foutenlog).</w:t>
       </w:r>
     </w:p>
     <w:p>
@@ -1864,19 +4052,19 @@
         <w:rPr>
           <w:lang w:val="nl"/>
         </w:rPr>
-        <w:t xml:space="preserve">Het scherm toont het actieve seizoen. Stukken van eerdere seizoenen blijven in de kluis tot de</w:t>
-      </w:r>
-      <w:r>
-        <w:rPr>
-          <w:lang w:val="nl"/>
-        </w:rPr>
-        <w:t xml:space="preserve"> </w:t>
-      </w:r>
-      <w:r>
-        <w:rPr>
-          <w:lang w:val="nl"/>
-        </w:rPr>
-        <w:t xml:space="preserve">bewaartermijn is verstreken; vraag de admin als je ze nodig hebt.</w:t>
+        <w:t xml:space="preserve">Het scherm toont alleen het actieve seizoen. Stukken van eerdere seizoenen blijven in de kluis tot</w:t>
+      </w:r>
+      <w:r>
+        <w:rPr>
+          <w:lang w:val="nl"/>
+        </w:rPr>
+        <w:t xml:space="preserve"> </w:t>
+      </w:r>
+      <w:r>
+        <w:rPr>
+          <w:lang w:val="nl"/>
+        </w:rPr>
+        <w:t xml:space="preserve">de bewaartermijn voorbij is; vraag de admin als je ze nodig hebt.</w:t>
       </w:r>
     </w:p>
     <w:p>
@@ -1910,34 +4098,68 @@
         <w:rPr>
           <w:lang w:val="nl"/>
         </w:rPr>
-        <w:t xml:space="preserve">IP-adres, met welke code naar welk nummer, en een controlegetal. Acrobat toont bij het zegel dat het</w:t>
-      </w:r>
-      <w:r>
-        <w:rPr>
-          <w:lang w:val="nl"/>
-        </w:rPr>
-        <w:t xml:space="preserve"> </w:t>
-      </w:r>
-      <w:r>
-        <w:rPr>
-          <w:lang w:val="nl"/>
-        </w:rPr>
-        <w:t xml:space="preserve">document sinds de ondertekening niet is gewijzigd (met een melding dat de uitgever niet in de lijst</w:t>
-      </w:r>
-      <w:r>
-        <w:rPr>
-          <w:lang w:val="nl"/>
-        </w:rPr>
-        <w:t xml:space="preserve"> </w:t>
-      </w:r>
-      <w:r>
-        <w:rPr>
-          <w:lang w:val="nl"/>
-        </w:rPr>
-        <w:t xml:space="preserve">van Adobe staat; dat is normaal voor een eigen zegel).</w:t>
-      </w:r>
-    </w:p>
-    <w:bookmarkEnd w:id="19"/>
+        <w:t xml:space="preserve">IP-adres, met welke code naar welk nummer, en een controlegetal. Acrobat toont bij het zegel dat</w:t>
+      </w:r>
+      <w:r>
+        <w:rPr>
+          <w:lang w:val="nl"/>
+        </w:rPr>
+        <w:t xml:space="preserve"> </w:t>
+      </w:r>
+      <w:r>
+        <w:rPr>
+          <w:lang w:val="nl"/>
+        </w:rPr>
+        <w:t xml:space="preserve">het document sinds de ondertekening niet is gewijzigd, met een melding dat de uitgever niet in de</w:t>
+      </w:r>
+      <w:r>
+        <w:rPr>
+          <w:lang w:val="nl"/>
+        </w:rPr>
+        <w:t xml:space="preserve"> </w:t>
+      </w:r>
+      <w:r>
+        <w:rPr>
+          <w:lang w:val="nl"/>
+        </w:rPr>
+        <w:t xml:space="preserve">lijst van Adobe staat. Dat is normaal voor een eigen zegel.</w:t>
+      </w:r>
+    </w:p>
+    <w:p>
+      <w:pPr>
+        <w:pStyle w:val="BodyText"/>
+      </w:pPr>
+      <w:r>
+        <w:rPr>
+          <w:b/>
+          <w:bCs/>
+          <w:lang w:val="nl"/>
+        </w:rPr>
+        <w:t xml:space="preserve">Waarom krijgt het bestuur een mail als ik iets download?</w:t>
+      </w:r>
+      <w:r>
+        <w:br/>
+      </w:r>
+      <w:r>
+        <w:rPr>
+          <w:lang w:val="nl"/>
+        </w:rPr>
+        <w:t xml:space="preserve">Zo ziet iemand anders mee dat deze stukken worden ingezien. Dat beschermt de strandwacht en</w:t>
+      </w:r>
+      <w:r>
+        <w:rPr>
+          <w:lang w:val="nl"/>
+        </w:rPr>
+        <w:t xml:space="preserve"> </w:t>
+      </w:r>
+      <w:r>
+        <w:rPr>
+          <w:lang w:val="nl"/>
+        </w:rPr>
+        <w:t xml:space="preserve">jou. Alleen de technisch beheerder kan die melding uitzetten, en dat raden we af.</w:t>
+      </w:r>
+    </w:p>
+    <w:bookmarkEnd w:id="20"/>
     <w:sectPr>
       <w:footnotePr>
         <w:numRestart w:val="eachSect"/>
@@ -2127,6 +4349,82 @@
       <w:start w:val="1"/>
       <w:numFmt w:val="decimal"/>
       <w:lvlText w:val="%9."/>
+      <w:lvlJc w:val="left"/>
+      <w:pPr>
+        <w:ind w:left="6480" w:hanging="360"/>
+      </w:pPr>
+    </w:lvl>
+  </w:abstractNum>
+  <w:abstractNum w:abstractNumId="992">
+    <w:nsid w:val="0000A992"/>
+    <w:multiLevelType w:val="multilevel"/>
+    <w:lvl w:ilvl="0">
+      <w:numFmt w:val="bullet"/>
+      <w:lvlText w:val="☐"/>
+      <w:lvlJc w:val="left"/>
+      <w:pPr>
+        <w:ind w:left="720" w:hanging="360"/>
+      </w:pPr>
+    </w:lvl>
+    <w:lvl w:ilvl="1">
+      <w:numFmt w:val="bullet"/>
+      <w:lvlText w:val="☐"/>
+      <w:lvlJc w:val="left"/>
+      <w:pPr>
+        <w:ind w:left="1440" w:hanging="360"/>
+      </w:pPr>
+    </w:lvl>
+    <w:lvl w:ilvl="2">
+      <w:numFmt w:val="bullet"/>
+      <w:lvlText w:val="☐"/>
+      <w:lvlJc w:val="left"/>
+      <w:pPr>
+        <w:ind w:left="2160" w:hanging="360"/>
+      </w:pPr>
+    </w:lvl>
+    <w:lvl w:ilvl="3">
+      <w:numFmt w:val="bullet"/>
+      <w:lvlText w:val="☐"/>
+      <w:lvlJc w:val="left"/>
+      <w:pPr>
+        <w:ind w:left="2880" w:hanging="360"/>
+      </w:pPr>
+    </w:lvl>
+    <w:lvl w:ilvl="4">
+      <w:numFmt w:val="bullet"/>
+      <w:lvlText w:val="☐"/>
+      <w:lvlJc w:val="left"/>
+      <w:pPr>
+        <w:ind w:left="3600" w:hanging="360"/>
+      </w:pPr>
+    </w:lvl>
+    <w:lvl w:ilvl="5">
+      <w:numFmt w:val="bullet"/>
+      <w:lvlText w:val="☐"/>
+      <w:lvlJc w:val="left"/>
+      <w:pPr>
+        <w:ind w:left="4320" w:hanging="360"/>
+      </w:pPr>
+    </w:lvl>
+    <w:lvl w:ilvl="6">
+      <w:numFmt w:val="bullet"/>
+      <w:lvlText w:val="☐"/>
+      <w:lvlJc w:val="left"/>
+      <w:pPr>
+        <w:ind w:left="5040" w:hanging="360"/>
+      </w:pPr>
+    </w:lvl>
+    <w:lvl w:ilvl="7">
+      <w:numFmt w:val="bullet"/>
+      <w:lvlText w:val="☐"/>
+      <w:lvlJc w:val="left"/>
+      <w:pPr>
+        <w:ind w:left="5760" w:hanging="360"/>
+      </w:pPr>
+    </w:lvl>
+    <w:lvl w:ilvl="8">
+      <w:numFmt w:val="bullet"/>
+      <w:lvlText w:val="☐"/>
       <w:lvlJc w:val="left"/>
       <w:pPr>
         <w:ind w:left="6480" w:hanging="360"/>
@@ -2270,9 +4568,33 @@
     </w:lvlOverride>
   </w:num>
   <w:num w:numId="1002">
+    <w:abstractNumId w:val="992"/>
+  </w:num>
+  <w:num w:numId="1003">
+    <w:abstractNumId w:val="992"/>
+  </w:num>
+  <w:num w:numId="1004">
+    <w:abstractNumId w:val="992"/>
+  </w:num>
+  <w:num w:numId="1005">
+    <w:abstractNumId w:val="992"/>
+  </w:num>
+  <w:num w:numId="1006">
+    <w:abstractNumId w:val="992"/>
+  </w:num>
+  <w:num w:numId="1007">
+    <w:abstractNumId w:val="992"/>
+  </w:num>
+  <w:num w:numId="1008">
     <w:abstractNumId w:val="991"/>
   </w:num>
-  <w:num w:numId="1003">
+  <w:num w:numId="1009">
+    <w:abstractNumId w:val="991"/>
+  </w:num>
+  <w:num w:numId="1010">
+    <w:abstractNumId w:val="991"/>
+  </w:num>
+  <w:num w:numId="1011">
     <w:abstractNumId w:val="99411"/>
     <w:lvlOverride w:ilvl="0">
       <w:startOverride w:val="1"/>
@@ -2302,7 +4624,7 @@
       <w:startOverride w:val="1"/>
     </w:lvlOverride>
   </w:num>
-  <w:num w:numId="1004">
+  <w:num w:numId="1012">
     <w:abstractNumId w:val="99411"/>
     <w:lvlOverride w:ilvl="0">
       <w:startOverride w:val="1"/>
@@ -2332,10 +4654,10 @@
       <w:startOverride w:val="1"/>
     </w:lvlOverride>
   </w:num>
-  <w:num w:numId="1005">
+  <w:num w:numId="1013">
     <w:abstractNumId w:val="991"/>
   </w:num>
-  <w:num w:numId="1006">
+  <w:num w:numId="1014">
     <w:abstractNumId w:val="991"/>
   </w:num>
 </w:numbering>

</xml_diff>

<commit_message>
Handleidingen bijgewerkt naar 2.101
Alle vijf in lijn met de fixes van 2.101.0: begeleider checkt in en beoordeelt, loondossiers handmatig
vernietigen na de bewaarplicht (nieuwe paragrafen beheer + penningmeester), gegevens corrigeren, verwijderen
met tussenscherm, geheimen verborgen, cron via header, offboarding via Authentik, nieuwe opschoning.
HTML + Word opnieuw gegenereerd. Label 'Bezoekersstatistiek wervingspagina's' gelijkgetrokken.
</commit_message>
<xml_diff>
--- a/docs/handleiding/word/handleiding_penningmeester.docx
+++ b/docs/handleiding/word/handleiding_penningmeester.docx
@@ -21,7 +21,7 @@
         <w:rPr>
           <w:lang w:val="nl"/>
         </w:rPr>
-        <w:t xml:space="preserve">Versie 2.99 · september 2026</w:t>
+        <w:t xml:space="preserve">Versie 2.101 · september 2026</w:t>
       </w:r>
     </w:p>
     <w:p>
@@ -343,19 +343,19 @@
         <w:rPr>
           <w:lang w:val="nl"/>
         </w:rPr>
-        <w:t xml:space="preserve">downloadt de stukken uit Loondossiers, verwerkt ze en markeert het dossier als verwerkt. De rest</w:t>
-      </w:r>
-      <w:r>
-        <w:rPr>
-          <w:lang w:val="nl"/>
-        </w:rPr>
-        <w:t xml:space="preserve"> </w:t>
-      </w:r>
-      <w:r>
-        <w:rPr>
-          <w:lang w:val="nl"/>
-        </w:rPr>
-        <w:t xml:space="preserve">gaat automatisch.</w:t>
+        <w:t xml:space="preserve">downloadt de stukken uit Loondossiers, verwerkt ze en markeert het dossier als verwerkt. Na de</w:t>
+      </w:r>
+      <w:r>
+        <w:rPr>
+          <w:lang w:val="nl"/>
+        </w:rPr>
+        <w:t xml:space="preserve"> </w:t>
+      </w:r>
+      <w:r>
+        <w:rPr>
+          <w:lang w:val="nl"/>
+        </w:rPr>
+        <w:t xml:space="preserve">wettelijke bewaarplicht vernietig je de loondocumenten zelf; het systeem zet ze voor je klaar.</w:t>
       </w:r>
     </w:p>
     <w:p>
@@ -638,7 +638,40 @@
         <w:rPr>
           <w:lang w:val="nl"/>
         </w:rPr>
-        <w:t xml:space="preserve">van je computer.</w:t>
+        <w:t xml:space="preserve">van je computer. Staat automatisch opschonen uit (dat zegt het kader bovenaan Loondossiers),</w:t>
+      </w:r>
+      <w:r>
+        <w:rPr>
+          <w:lang w:val="nl"/>
+        </w:rPr>
+        <w:t xml:space="preserve"> </w:t>
+      </w:r>
+      <w:r>
+        <w:rPr>
+          <w:lang w:val="nl"/>
+        </w:rPr>
+        <w:t xml:space="preserve">vernietig dan ook de bankpasfoto zelf (zie</w:t>
+      </w:r>
+      <w:r>
+        <w:rPr>
+          <w:lang w:val="nl"/>
+        </w:rPr>
+        <w:t xml:space="preserve"> </w:t>
+      </w:r>
+      <w:hyperlink w:anchor="bankpas-vernietigen">
+        <w:r>
+          <w:rPr>
+            <w:rStyle w:val="Hyperlink"/>
+            <w:lang w:val="nl"/>
+          </w:rPr>
+          <w:t xml:space="preserve">Bankpas vernietigen</w:t>
+        </w:r>
+      </w:hyperlink>
+      <w:r>
+        <w:rPr>
+          <w:lang w:val="nl"/>
+        </w:rPr>
+        <w:t xml:space="preserve">).</w:t>
       </w:r>
     </w:p>
     <w:p>
@@ -708,33 +741,87 @@
           <w:bCs/>
           <w:lang w:val="nl"/>
         </w:rPr>
-        <w:t xml:space="preserve">Na het seizoen:</w:t>
-      </w:r>
-      <w:r>
-        <w:rPr>
-          <w:lang w:val="nl"/>
-        </w:rPr>
-        <w:t xml:space="preserve"> </w:t>
-      </w:r>
-      <w:r>
-        <w:rPr>
-          <w:lang w:val="nl"/>
-        </w:rPr>
-        <w:t xml:space="preserve">niets. Het bewaren en vernietigen gaat automatisch (zie</w:t>
-      </w:r>
-      <w:r>
-        <w:rPr>
-          <w:lang w:val="nl"/>
-        </w:rPr>
-        <w:t xml:space="preserve"> </w:t>
-      </w:r>
-      <w:hyperlink w:anchor="bewaartermijnen-en-verwijderen">
+        <w:t xml:space="preserve">Elk jaar, bijvoorbeeld in januari:</w:t>
+      </w:r>
+      <w:r>
+        <w:rPr>
+          <w:lang w:val="nl"/>
+        </w:rPr>
+        <w:t xml:space="preserve"> </w:t>
+      </w:r>
+      <w:r>
+        <w:rPr>
+          <w:lang w:val="nl"/>
+        </w:rPr>
+        <w:t xml:space="preserve">kijk onderaan Loondossiers of de kaart</w:t>
+      </w:r>
+      <w:r>
+        <w:rPr>
+          <w:lang w:val="nl"/>
+        </w:rPr>
+        <w:t xml:space="preserve"> </w:t>
+      </w:r>
+      <w:r>
+        <w:rPr>
+          <w:b/>
+          <w:bCs/>
+          <w:lang w:val="nl"/>
+        </w:rPr>
+        <w:t xml:space="preserve">Te beoordelen</w:t>
+      </w:r>
+      <w:r>
+        <w:rPr>
+          <w:b/>
+          <w:bCs/>
+          <w:lang w:val="nl"/>
+        </w:rPr>
+        <w:t xml:space="preserve"> </w:t>
+      </w:r>
+      <w:r>
+        <w:rPr>
+          <w:b/>
+          <w:bCs/>
+          <w:lang w:val="nl"/>
+        </w:rPr>
+        <w:t xml:space="preserve">voor vernietiging</w:t>
+      </w:r>
+      <w:r>
+        <w:rPr>
+          <w:lang w:val="nl"/>
+        </w:rPr>
+        <w:t xml:space="preserve"> </w:t>
+      </w:r>
+      <w:r>
+        <w:rPr>
+          <w:lang w:val="nl"/>
+        </w:rPr>
+        <w:t xml:space="preserve">er staat. Controleer die namen in de loonadministratie en vernietig wat over</w:t>
+      </w:r>
+      <w:r>
+        <w:rPr>
+          <w:lang w:val="nl"/>
+        </w:rPr>
+        <w:t xml:space="preserve"> </w:t>
+      </w:r>
+      <w:r>
+        <w:rPr>
+          <w:lang w:val="nl"/>
+        </w:rPr>
+        <w:t xml:space="preserve">de bewaarplicht is (zie</w:t>
+      </w:r>
+      <w:r>
+        <w:rPr>
+          <w:lang w:val="nl"/>
+        </w:rPr>
+        <w:t xml:space="preserve"> </w:t>
+      </w:r>
+      <w:hyperlink w:anchor="Xdc7c773732824be1d69fcb8a0df99476b4225db">
         <w:r>
           <w:rPr>
             <w:rStyle w:val="Hyperlink"/>
             <w:lang w:val="nl"/>
           </w:rPr>
-          <w:t xml:space="preserve">Bewaartermijnen en verwijderen</w:t>
+          <w:t xml:space="preserve">Loondossiers vernietigen na de bewaarplicht</w:t>
         </w:r>
       </w:hyperlink>
       <w:r>
@@ -1161,19 +1248,19 @@
         <w:rPr>
           <w:lang w:val="nl"/>
         </w:rPr>
-        <w:t xml:space="preserve">Zie je meer of minder, dan staat je account in Authentik in de verkeerde groep. Meld dat bij de</w:t>
-      </w:r>
-      <w:r>
-        <w:rPr>
-          <w:lang w:val="nl"/>
-        </w:rPr>
-        <w:t xml:space="preserve"> </w:t>
-      </w:r>
-      <w:r>
-        <w:rPr>
-          <w:lang w:val="nl"/>
-        </w:rPr>
-        <w:t xml:space="preserve">admin.</w:t>
+        <w:t xml:space="preserve">Zie je meer of minder, of krijg je de melding "Je Authentik-account heeft geen admin-toegang", dan</w:t>
+      </w:r>
+      <w:r>
+        <w:rPr>
+          <w:lang w:val="nl"/>
+        </w:rPr>
+        <w:t xml:space="preserve"> </w:t>
+      </w:r>
+      <w:r>
+        <w:rPr>
+          <w:lang w:val="nl"/>
+        </w:rPr>
+        <w:t xml:space="preserve">staat je account in Authentik in de verkeerde groep. Meld dat bij de admin.</w:t>
       </w:r>
     </w:p>
     <w:bookmarkEnd w:id="11"/>
@@ -1434,7 +1521,7 @@
               <w:rPr>
                 <w:lang w:val="nl"/>
               </w:rPr>
-              <w:t xml:space="preserve">Alleen om het rekeningnummer te controleren; wordt na verwerking vernietigd</w:t>
+              <w:t xml:space="preserve">Alleen om het rekeningnummer te controleren; wordt na verwerking vernietigd (automatisch, of door jou als opschonen uit staat)</w:t>
             </w:r>
           </w:p>
         </w:tc>
@@ -1685,59 +1772,21 @@
       </w:pPr>
       <w:r>
         <w:rPr>
-          <w:b/>
-          <w:bCs/>
-          <w:lang w:val="nl"/>
-        </w:rPr>
-        <w:t xml:space="preserve">Let op:</w:t>
-      </w:r>
-      <w:r>
-        <w:rPr>
-          <w:lang w:val="nl"/>
-        </w:rPr>
-        <w:t xml:space="preserve"> </w:t>
-      </w:r>
-      <w:r>
-        <w:rPr>
-          <w:lang w:val="nl"/>
-        </w:rPr>
-        <w:t xml:space="preserve">de mail wordt verstuurd op het moment dat de strandwacht het loonheffingsformulier</w:t>
-      </w:r>
-      <w:r>
-        <w:rPr>
-          <w:lang w:val="nl"/>
-        </w:rPr>
-        <w:t xml:space="preserve"> </w:t>
-      </w:r>
-      <w:r>
-        <w:rPr>
-          <w:lang w:val="nl"/>
-        </w:rPr>
-        <w:t xml:space="preserve">ondertekent. Uploadt iemand de kopie van het identiteitsbewijs of de bankpas pas daarna, dan komt</w:t>
-      </w:r>
-      <w:r>
-        <w:rPr>
-          <w:lang w:val="nl"/>
-        </w:rPr>
-        <w:t xml:space="preserve"> </w:t>
-      </w:r>
-      <w:r>
-        <w:rPr>
-          <w:lang w:val="nl"/>
-        </w:rPr>
-        <w:t xml:space="preserve">er geen automatische mail, ook al is het dossier dan wel compleet. Kijk daarom ook zelf af en toe</w:t>
-      </w:r>
-      <w:r>
-        <w:rPr>
-          <w:lang w:val="nl"/>
-        </w:rPr>
-        <w:t xml:space="preserve"> </w:t>
-      </w:r>
-      <w:r>
-        <w:rPr>
-          <w:lang w:val="nl"/>
-        </w:rPr>
-        <w:t xml:space="preserve">in Loondossiers.</w:t>
+          <w:lang w:val="nl"/>
+        </w:rPr>
+        <w:t xml:space="preserve">De mail komt zodra het laatste stuk binnen is, of dat nu het ondertekende loonheffingsformulier is</w:t>
+      </w:r>
+      <w:r>
+        <w:rPr>
+          <w:lang w:val="nl"/>
+        </w:rPr>
+        <w:t xml:space="preserve"> </w:t>
+      </w:r>
+      <w:r>
+        <w:rPr>
+          <w:lang w:val="nl"/>
+        </w:rPr>
+        <w:t xml:space="preserve">of een upload van de kopie ID of de bankpas. Per loonheffingsformulier krijg je hem één keer.</w:t>
       </w:r>
     </w:p>
     <w:p>
@@ -1832,6 +1881,18 @@
         </w:rPr>
         <w:t xml:space="preserve">kaart die je openklapt. Oranje is nog niet compleet, groen wacht op jou, grijs is verwerkt.</w:t>
       </w:r>
+      <w:r>
+        <w:rPr>
+          <w:lang w:val="nl"/>
+        </w:rPr>
+        <w:t xml:space="preserve"> </w:t>
+      </w:r>
+      <w:r>
+        <w:rPr>
+          <w:lang w:val="nl"/>
+        </w:rPr>
+        <w:t xml:space="preserve">Onderaan staat, als dat nodig is, wie in aanmerking komt voor vernietiging.</w:t>
+      </w:r>
     </w:p>
     <w:p>
       <w:pPr>
@@ -1903,19 +1964,98 @@
         <w:rPr>
           <w:lang w:val="nl"/>
         </w:rPr>
-        <w:t xml:space="preserve">identiteitsbewijzen, elke download wordt vastgelegd, en de bewaartermijnen. Dat kader staat er</w:t>
-      </w:r>
-      <w:r>
-        <w:rPr>
-          <w:lang w:val="nl"/>
-        </w:rPr>
-        <w:t xml:space="preserve"> </w:t>
-      </w:r>
-      <w:r>
-        <w:rPr>
-          <w:lang w:val="nl"/>
-        </w:rPr>
-        <w:t xml:space="preserve">altijd; het is geen waarschuwing.</w:t>
+        <w:t xml:space="preserve">identiteitsbewijzen, elke download wordt vastgelegd, wat er met de bankpasfoto gebeurt en hoe lang</w:t>
+      </w:r>
+      <w:r>
+        <w:rPr>
+          <w:lang w:val="nl"/>
+        </w:rPr>
+        <w:t xml:space="preserve"> </w:t>
+      </w:r>
+      <w:r>
+        <w:rPr>
+          <w:lang w:val="nl"/>
+        </w:rPr>
+        <w:t xml:space="preserve">het loonheffingsformulier en de kopie ID blijven. Komen er dossiers in aanmerking voor</w:t>
+      </w:r>
+      <w:r>
+        <w:rPr>
+          <w:lang w:val="nl"/>
+        </w:rPr>
+        <w:t xml:space="preserve"> </w:t>
+      </w:r>
+      <w:r>
+        <w:rPr>
+          <w:lang w:val="nl"/>
+        </w:rPr>
+        <w:t xml:space="preserve">vernietiging, dan staat daar ook een link naar</w:t>
+      </w:r>
+      <w:r>
+        <w:rPr>
+          <w:lang w:val="nl"/>
+        </w:rPr>
+        <w:t xml:space="preserve"> </w:t>
+      </w:r>
+      <w:r>
+        <w:rPr>
+          <w:b/>
+          <w:bCs/>
+          <w:lang w:val="nl"/>
+        </w:rPr>
+        <w:t xml:space="preserve">Te beoordelen voor vernietiging</w:t>
+      </w:r>
+      <w:r>
+        <w:rPr>
+          <w:lang w:val="nl"/>
+        </w:rPr>
+        <w:t xml:space="preserve">. Dat kader staat</w:t>
+      </w:r>
+      <w:r>
+        <w:rPr>
+          <w:lang w:val="nl"/>
+        </w:rPr>
+        <w:t xml:space="preserve"> </w:t>
+      </w:r>
+      <w:r>
+        <w:rPr>
+          <w:lang w:val="nl"/>
+        </w:rPr>
+        <w:t xml:space="preserve">er altijd; het is geen waarschuwing.</w:t>
+      </w:r>
+    </w:p>
+    <w:p>
+      <w:pPr>
+        <w:pStyle w:val="BodyText"/>
+      </w:pPr>
+      <w:r>
+        <w:rPr>
+          <w:lang w:val="nl"/>
+        </w:rPr>
+        <w:t xml:space="preserve">Let op de zin over de bankpasfoto. Staat daar "De bankpasfoto wordt ... dagen na "verwerkt"</w:t>
+      </w:r>
+      <w:r>
+        <w:rPr>
+          <w:lang w:val="nl"/>
+        </w:rPr>
+        <w:t xml:space="preserve"> </w:t>
+      </w:r>
+      <w:r>
+        <w:rPr>
+          <w:lang w:val="nl"/>
+        </w:rPr>
+        <w:t xml:space="preserve">automatisch vernietigd", dan hoef je niets te doen. Staat daar "Automatisch opschonen staat uit",</w:t>
+      </w:r>
+      <w:r>
+        <w:rPr>
+          <w:lang w:val="nl"/>
+        </w:rPr>
+        <w:t xml:space="preserve"> </w:t>
+      </w:r>
+      <w:r>
+        <w:rPr>
+          <w:lang w:val="nl"/>
+        </w:rPr>
+        <w:t xml:space="preserve">dan vernietig je de bankpasfoto zelf na het verwerken.</w:t>
       </w:r>
     </w:p>
     <w:p>
@@ -2262,19 +2402,37 @@
         <w:rPr>
           <w:lang w:val="nl"/>
         </w:rPr>
-        <w:t xml:space="preserve">: per stuk de bestandsnaam, de uploaddatum, de grootte en</w:t>
-      </w:r>
-      <w:r>
-        <w:rPr>
-          <w:lang w:val="nl"/>
-        </w:rPr>
-        <w:t xml:space="preserve"> </w:t>
-      </w:r>
-      <w:r>
-        <w:rPr>
-          <w:lang w:val="nl"/>
-        </w:rPr>
-        <w:t xml:space="preserve">wanneer het voor het laatst is ingezien, met de knop</w:t>
+        <w:t xml:space="preserve"> </w:t>
+      </w:r>
+      <w:r>
+        <w:rPr>
+          <w:lang w:val="nl"/>
+        </w:rPr>
+        <w:t xml:space="preserve">("Vernietigd ... dagen na verwerking" of "Na verwerking</w:t>
+      </w:r>
+      <w:r>
+        <w:rPr>
+          <w:lang w:val="nl"/>
+        </w:rPr>
+        <w:t xml:space="preserve"> </w:t>
+      </w:r>
+      <w:r>
+        <w:rPr>
+          <w:lang w:val="nl"/>
+        </w:rPr>
+        <w:t xml:space="preserve">zelf vernietigen"): per stuk de bestandsnaam, de uploaddatum, de grootte en wanneer het voor het</w:t>
+      </w:r>
+      <w:r>
+        <w:rPr>
+          <w:lang w:val="nl"/>
+        </w:rPr>
+        <w:t xml:space="preserve"> </w:t>
+      </w:r>
+      <w:r>
+        <w:rPr>
+          <w:lang w:val="nl"/>
+        </w:rPr>
+        <w:t xml:space="preserve">laatst is ingezien, met de knop</w:t>
       </w:r>
       <w:r>
         <w:rPr>
@@ -2575,6 +2733,90 @@
         <w:t xml:space="preserve">Staat er nog niemand op "Aangenomen", dan zie je "Nog geen loondossiers".</w:t>
       </w:r>
     </w:p>
+    <w:p>
+      <w:pPr>
+        <w:pStyle w:val="BodyText"/>
+      </w:pPr>
+      <w:r>
+        <w:rPr>
+          <w:b/>
+          <w:bCs/>
+          <w:lang w:val="nl"/>
+        </w:rPr>
+        <w:t xml:space="preserve">Onderaan</w:t>
+      </w:r>
+      <w:r>
+        <w:rPr>
+          <w:lang w:val="nl"/>
+        </w:rPr>
+        <w:t xml:space="preserve"> </w:t>
+      </w:r>
+      <w:r>
+        <w:rPr>
+          <w:lang w:val="nl"/>
+        </w:rPr>
+        <w:t xml:space="preserve">verschijnt de kaart</w:t>
+      </w:r>
+      <w:r>
+        <w:rPr>
+          <w:lang w:val="nl"/>
+        </w:rPr>
+        <w:t xml:space="preserve"> </w:t>
+      </w:r>
+      <w:r>
+        <w:rPr>
+          <w:b/>
+          <w:bCs/>
+          <w:lang w:val="nl"/>
+        </w:rPr>
+        <w:t xml:space="preserve">Te beoordelen voor vernietiging</w:t>
+      </w:r>
+      <w:r>
+        <w:rPr>
+          <w:lang w:val="nl"/>
+        </w:rPr>
+        <w:t xml:space="preserve"> </w:t>
+      </w:r>
+      <w:r>
+        <w:rPr>
+          <w:lang w:val="nl"/>
+        </w:rPr>
+        <w:t xml:space="preserve">zodra er iemand is van wie</w:t>
+      </w:r>
+      <w:r>
+        <w:rPr>
+          <w:lang w:val="nl"/>
+        </w:rPr>
+        <w:t xml:space="preserve"> </w:t>
+      </w:r>
+      <w:r>
+        <w:rPr>
+          <w:lang w:val="nl"/>
+        </w:rPr>
+        <w:t xml:space="preserve">de bewaarplicht mogelijk voorbij is. Zie</w:t>
+      </w:r>
+      <w:r>
+        <w:rPr>
+          <w:lang w:val="nl"/>
+        </w:rPr>
+        <w:t xml:space="preserve"> </w:t>
+      </w:r>
+      <w:hyperlink w:anchor="Xdc7c773732824be1d69fcb8a0df99476b4225db">
+        <w:r>
+          <w:rPr>
+            <w:rStyle w:val="Hyperlink"/>
+            <w:lang w:val="nl"/>
+          </w:rPr>
+          <w:t xml:space="preserve">Loondossiers vernietigen na de bewaarplicht</w:t>
+        </w:r>
+      </w:hyperlink>
+      <w:r>
+        <w:rPr>
+          <w:lang w:val="nl"/>
+        </w:rPr>
+        <w:t xml:space="preserve">.</w:t>
+      </w:r>
+    </w:p>
     <w:bookmarkEnd w:id="14"/>
     <w:bookmarkStart w:id="15" w:name="stukken-downloaden"/>
     <w:p>
@@ -2755,19 +2997,19 @@
         <w:rPr>
           <w:lang w:val="nl"/>
         </w:rPr>
-        <w:t xml:space="preserve">en het loonheffingsformulier krijgt het bestuur standaard een mail dat jij iets hebt gedownload.</w:t>
-      </w:r>
-      <w:r>
-        <w:rPr>
-          <w:lang w:val="nl"/>
-        </w:rPr>
-        <w:t xml:space="preserve"> </w:t>
-      </w:r>
-      <w:r>
-        <w:rPr>
-          <w:lang w:val="nl"/>
-        </w:rPr>
-        <w:t xml:space="preserve">Dat is normaal en hoort zo.</w:t>
+        <w:t xml:space="preserve">en het loonheffingsformulier krijgt het bestuur standaard een mail dat jij iets hebt gedownload,</w:t>
+      </w:r>
+      <w:r>
+        <w:rPr>
+          <w:lang w:val="nl"/>
+        </w:rPr>
+        <w:t xml:space="preserve"> </w:t>
+      </w:r>
+      <w:r>
+        <w:rPr>
+          <w:lang w:val="nl"/>
+        </w:rPr>
+        <w:t xml:space="preserve">met de naam van het document. Dat is normaal en hoort zo.</w:t>
       </w:r>
     </w:p>
     <w:p>
@@ -2993,7 +3235,52 @@
         <w:rPr>
           <w:lang w:val="nl"/>
         </w:rPr>
-        <w:t xml:space="preserve">De kopie van de bankpas wordt na de bewaartermijn (standaard 30 dagen) automatisch vernietigd.</w:t>
+        <w:t xml:space="preserve">De kopie van de bankpas wordt na de ingestelde termijn (standaard 30 dagen) automatisch</w:t>
+      </w:r>
+      <w:r>
+        <w:rPr>
+          <w:lang w:val="nl"/>
+        </w:rPr>
+        <w:t xml:space="preserve"> </w:t>
+      </w:r>
+      <w:r>
+        <w:rPr>
+          <w:lang w:val="nl"/>
+        </w:rPr>
+        <w:t xml:space="preserve">vernietigd, als automatisch opschonen aanstaat. Het tussenscherm zegt welke van de twee geldt.</w:t>
+      </w:r>
+      <w:r>
+        <w:rPr>
+          <w:lang w:val="nl"/>
+        </w:rPr>
+        <w:t xml:space="preserve"> </w:t>
+      </w:r>
+      <w:r>
+        <w:rPr>
+          <w:lang w:val="nl"/>
+        </w:rPr>
+        <w:t xml:space="preserve">Staat opschonen uit, vernietig de bankpasfoto dan zelf (zie</w:t>
+      </w:r>
+      <w:r>
+        <w:rPr>
+          <w:lang w:val="nl"/>
+        </w:rPr>
+        <w:t xml:space="preserve"> </w:t>
+      </w:r>
+      <w:hyperlink w:anchor="bankpas-vernietigen">
+        <w:r>
+          <w:rPr>
+            <w:rStyle w:val="Hyperlink"/>
+            <w:lang w:val="nl"/>
+          </w:rPr>
+          <w:t xml:space="preserve">Bankpas vernietigen</w:t>
+        </w:r>
+      </w:hyperlink>
+      <w:r>
+        <w:rPr>
+          <w:lang w:val="nl"/>
+        </w:rPr>
+        <w:t xml:space="preserve">).</w:t>
       </w:r>
     </w:p>
     <w:p>
@@ -3008,19 +3295,19 @@
         <w:rPr>
           <w:lang w:val="nl"/>
         </w:rPr>
-        <w:t xml:space="preserve">Het loonheffingsformulier en de kopie van het identiteitsbewijs blijven bewaard tot de wettelijke</w:t>
-      </w:r>
-      <w:r>
-        <w:rPr>
-          <w:lang w:val="nl"/>
-        </w:rPr>
-        <w:t xml:space="preserve"> </w:t>
-      </w:r>
-      <w:r>
-        <w:rPr>
-          <w:lang w:val="nl"/>
-        </w:rPr>
-        <w:t xml:space="preserve">termijn voorbij is (zie</w:t>
+        <w:t xml:space="preserve">Het loonheffingsformulier en de kopie van het identiteitsbewijs blijven staan tot jij ze na de</w:t>
+      </w:r>
+      <w:r>
+        <w:rPr>
+          <w:lang w:val="nl"/>
+        </w:rPr>
+        <w:t xml:space="preserve"> </w:t>
+      </w:r>
+      <w:r>
+        <w:rPr>
+          <w:lang w:val="nl"/>
+        </w:rPr>
+        <w:t xml:space="preserve">bewaarplicht vernietigt (zie</w:t>
       </w:r>
       <w:r>
         <w:rPr>
@@ -3129,19 +3416,19 @@
         <w:rPr>
           <w:lang w:val="nl"/>
         </w:rPr>
-        <w:t xml:space="preserve">de bankpasfoto verdwijnt normaal vanzelf. Moet hij eerder weg, klik dan op</w:t>
-      </w:r>
-      <w:r>
-        <w:rPr>
-          <w:lang w:val="nl"/>
-        </w:rPr>
-        <w:t xml:space="preserve"> </w:t>
-      </w:r>
-      <w:r>
-        <w:rPr>
-          <w:lang w:val="nl"/>
-        </w:rPr>
-        <w:t xml:space="preserve">"Vernietigen" en bevestig.</w:t>
+        <w:t xml:space="preserve">de bankpasfoto verdwijnt vanzelf als automatisch opschonen aanstaat. Staat dat</w:t>
+      </w:r>
+      <w:r>
+        <w:rPr>
+          <w:lang w:val="nl"/>
+        </w:rPr>
+        <w:t xml:space="preserve"> </w:t>
+      </w:r>
+      <w:r>
+        <w:rPr>
+          <w:lang w:val="nl"/>
+        </w:rPr>
+        <w:t xml:space="preserve">uit, of moet hij eerder weg, klik dan op "Vernietigen" en bevestig.</w:t>
       </w:r>
     </w:p>
     <w:p>
@@ -3245,11 +3532,44 @@
         <w:rPr>
           <w:lang w:val="nl"/>
         </w:rPr>
-        <w:t xml:space="preserve">Dit kan alleen bij de bankpas; de andere stukken vallen onder de bewaarplicht.</w:t>
+        <w:t xml:space="preserve">Dit kan per stuk alleen bij de bankpas. De andere stukken vallen onder de bewaarplicht; die</w:t>
+      </w:r>
+      <w:r>
+        <w:rPr>
+          <w:lang w:val="nl"/>
+        </w:rPr>
+        <w:t xml:space="preserve"> </w:t>
+      </w:r>
+      <w:r>
+        <w:rPr>
+          <w:lang w:val="nl"/>
+        </w:rPr>
+        <w:t xml:space="preserve">vernietig je pas daarna, in één keer per persoon (zie</w:t>
+      </w:r>
+      <w:r>
+        <w:rPr>
+          <w:lang w:val="nl"/>
+        </w:rPr>
+        <w:t xml:space="preserve"> </w:t>
+      </w:r>
+      <w:hyperlink w:anchor="Xdc7c773732824be1d69fcb8a0df99476b4225db">
+        <w:r>
+          <w:rPr>
+            <w:rStyle w:val="Hyperlink"/>
+            <w:lang w:val="nl"/>
+          </w:rPr>
+          <w:t xml:space="preserve">Loondossiers vernietigen na de bewaarplicht</w:t>
+        </w:r>
+      </w:hyperlink>
+      <w:r>
+        <w:rPr>
+          <w:lang w:val="nl"/>
+        </w:rPr>
+        <w:t xml:space="preserve">).</w:t>
       </w:r>
     </w:p>
     <w:bookmarkEnd w:id="17"/>
-    <w:bookmarkStart w:id="18" w:name="bewaartermijnen-en-verwijderen"/>
+    <w:bookmarkStart w:id="20" w:name="bewaartermijnen-en-verwijderen"/>
     <w:p>
       <w:pPr>
         <w:pStyle w:val="Heading1"/>
@@ -3283,31 +3603,43 @@
         <w:rPr>
           <w:lang w:val="nl"/>
         </w:rPr>
-        <w:t xml:space="preserve">loonheffing en kopie ID blijven 5 jaar na het einde van het dienstjaar, de</w:t>
-      </w:r>
-      <w:r>
-        <w:rPr>
-          <w:lang w:val="nl"/>
-        </w:rPr>
-        <w:t xml:space="preserve"> </w:t>
-      </w:r>
-      <w:r>
-        <w:rPr>
-          <w:lang w:val="nl"/>
-        </w:rPr>
-        <w:t xml:space="preserve">bankpasfoto 30 dagen na verwerking. Het systeem ruimt dat automatisch op, maar alleen als het</w:t>
-      </w:r>
-      <w:r>
-        <w:rPr>
-          <w:lang w:val="nl"/>
-        </w:rPr>
-        <w:t xml:space="preserve"> </w:t>
-      </w:r>
-      <w:r>
-        <w:rPr>
-          <w:lang w:val="nl"/>
-        </w:rPr>
-        <w:t xml:space="preserve">bestuur het automatisch opschonen heeft aangezet.</w:t>
+        <w:t xml:space="preserve">loonheffing en kopie ID moeten blijven tot 5 jaar na het einde van het jaar</w:t>
+      </w:r>
+      <w:r>
+        <w:rPr>
+          <w:lang w:val="nl"/>
+        </w:rPr>
+        <w:t xml:space="preserve"> </w:t>
+      </w:r>
+      <w:r>
+        <w:rPr>
+          <w:lang w:val="nl"/>
+        </w:rPr>
+        <w:t xml:space="preserve">waarin het dienstverband eindigde. Het systeem wist ze niet zelf: jij vernietigt ze daarna, vanuit</w:t>
+      </w:r>
+      <w:r>
+        <w:rPr>
+          <w:lang w:val="nl"/>
+        </w:rPr>
+        <w:t xml:space="preserve"> </w:t>
+      </w:r>
+      <w:r>
+        <w:rPr>
+          <w:lang w:val="nl"/>
+        </w:rPr>
+        <w:t xml:space="preserve">een lijst die het systeem klaarzet. De bankpasfoto verdwijnt 30 dagen na verwerking vanzelf, maar</w:t>
+      </w:r>
+      <w:r>
+        <w:rPr>
+          <w:lang w:val="nl"/>
+        </w:rPr>
+        <w:t xml:space="preserve"> </w:t>
+      </w:r>
+      <w:r>
+        <w:rPr>
+          <w:lang w:val="nl"/>
+        </w:rPr>
+        <w:t xml:space="preserve">alleen als het bestuur het automatisch opschonen heeft aangezet.</w:t>
       </w:r>
     </w:p>
     <w:tbl>
@@ -3363,7 +3695,7 @@
               <w:rPr>
                 <w:lang w:val="nl"/>
               </w:rPr>
-              <w:t xml:space="preserve">Grond</w:t>
+              <w:t xml:space="preserve">Wie ruimt op</w:t>
             </w:r>
           </w:p>
         </w:tc>
@@ -3393,7 +3725,7 @@
               <w:rPr>
                 <w:lang w:val="nl"/>
               </w:rPr>
-              <w:t xml:space="preserve">5 jaar na het einde van het kalenderjaar waarin de strandwacht werkte</w:t>
+              <w:t xml:space="preserve">5 jaar na het einde van het kalenderjaar waarin het dienstverband eindigde (wettelijke bewaarplicht loonadministratie)</w:t>
             </w:r>
           </w:p>
         </w:tc>
@@ -3407,7 +3739,7 @@
               <w:rPr>
                 <w:lang w:val="nl"/>
               </w:rPr>
-              <w:t xml:space="preserve">Wettelijke bewaarplicht loonadministratie</w:t>
+              <w:t xml:space="preserve">Jij, met de hand (zie hieronder)</w:t>
             </w:r>
           </w:p>
         </w:tc>
@@ -3437,7 +3769,7 @@
               <w:rPr>
                 <w:lang w:val="nl"/>
               </w:rPr>
-              <w:t xml:space="preserve">30 dagen nadat jij het dossier als verwerkt hebt gemarkeerd</w:t>
+              <w:t xml:space="preserve">30 dagen nadat jij het dossier als verwerkt hebt gemarkeerd (instelbaar)</w:t>
             </w:r>
           </w:p>
         </w:tc>
@@ -3451,7 +3783,7 @@
               <w:rPr>
                 <w:lang w:val="nl"/>
               </w:rPr>
-              <w:t xml:space="preserve">Alleen nodig om het rekeningnummer over te nemen</w:t>
+              <w:t xml:space="preserve">Het systeem, als automatisch opschonen aanstaat; anders jij</w:t>
             </w:r>
           </w:p>
         </w:tc>
@@ -3495,7 +3827,7 @@
               <w:rPr>
                 <w:lang w:val="nl"/>
               </w:rPr>
-              <w:t xml:space="preserve">Geen wettelijke termijn</w:t>
+              <w:t xml:space="preserve">Het systeem, als automatisch opschonen aanstaat</w:t>
             </w:r>
           </w:p>
         </w:tc>
@@ -3509,7 +3841,7 @@
         <w:rPr>
           <w:lang w:val="nl"/>
         </w:rPr>
-        <w:t xml:space="preserve">Het opruimen gebeurt één keer per dag automatisch,</w:t>
+        <w:t xml:space="preserve">Het automatische opruimen gebeurt één keer per dag,</w:t>
       </w:r>
       <w:r>
         <w:rPr>
@@ -3551,19 +3883,136 @@
         <w:rPr>
           <w:lang w:val="nl"/>
         </w:rPr>
-        <w:t xml:space="preserve">bij Instellingen › Bewaren &amp; opschonen. Dat staat standaard uit. Vraag</w:t>
-      </w:r>
-      <w:r>
-        <w:rPr>
-          <w:lang w:val="nl"/>
-        </w:rPr>
-        <w:t xml:space="preserve"> </w:t>
-      </w:r>
-      <w:r>
-        <w:rPr>
-          <w:lang w:val="nl"/>
-        </w:rPr>
-        <w:t xml:space="preserve">het bestuur of dat aan staat; anders blijft alles staan, ook de bankpasfoto's.</w:t>
+        <w:t xml:space="preserve">bij Instellingen › Bewaren &amp; opschonen. Dat staat standaard uit. Je ziet</w:t>
+      </w:r>
+      <w:r>
+        <w:rPr>
+          <w:lang w:val="nl"/>
+        </w:rPr>
+        <w:t xml:space="preserve"> </w:t>
+      </w:r>
+      <w:r>
+        <w:rPr>
+          <w:lang w:val="nl"/>
+        </w:rPr>
+        <w:t xml:space="preserve">op Loondossiers in het kader bovenaan welke van de twee geldt. De termijn voor de bankpas stelt het</w:t>
+      </w:r>
+      <w:r>
+        <w:rPr>
+          <w:lang w:val="nl"/>
+        </w:rPr>
+        <w:t xml:space="preserve"> </w:t>
+      </w:r>
+      <w:r>
+        <w:rPr>
+          <w:lang w:val="nl"/>
+        </w:rPr>
+        <w:t xml:space="preserve">bestuur in op hetzelfde tabblad (</w:t>
+      </w:r>
+      <w:r>
+        <w:rPr>
+          <w:b/>
+          <w:bCs/>
+          <w:lang w:val="nl"/>
+        </w:rPr>
+        <w:t xml:space="preserve">Kopie bankpas</w:t>
+      </w:r>
+      <w:r>
+        <w:rPr>
+          <w:lang w:val="nl"/>
+        </w:rPr>
+        <w:t xml:space="preserve">). Wat er is vernietigd, ziet de admin in het</w:t>
+      </w:r>
+      <w:r>
+        <w:rPr>
+          <w:lang w:val="nl"/>
+        </w:rPr>
+        <w:t xml:space="preserve"> </w:t>
+      </w:r>
+      <w:r>
+        <w:rPr>
+          <w:lang w:val="nl"/>
+        </w:rPr>
+        <w:t xml:space="preserve">Logboek.</w:t>
+      </w:r>
+    </w:p>
+    <w:bookmarkStart w:id="18" w:name="Xdc7c773732824be1d69fcb8a0df99476b4225db"/>
+    <w:p>
+      <w:pPr>
+        <w:pStyle w:val="Heading2"/>
+      </w:pPr>
+      <w:r>
+        <w:rPr>
+          <w:lang w:val="nl"/>
+        </w:rPr>
+        <w:t xml:space="preserve">Loondossiers vernietigen na de bewaarplicht</w:t>
+      </w:r>
+    </w:p>
+    <w:p>
+      <w:pPr>
+        <w:pStyle w:val="FirstParagraph"/>
+      </w:pPr>
+      <w:r>
+        <w:rPr>
+          <w:lang w:val="nl"/>
+        </w:rPr>
+        <w:t xml:space="preserve">Het systeem weet tot welk seizoen iemand hier voorkwam, maar niet wanneer het dienstverband</w:t>
+      </w:r>
+      <w:r>
+        <w:rPr>
+          <w:lang w:val="nl"/>
+        </w:rPr>
+        <w:t xml:space="preserve"> </w:t>
+      </w:r>
+      <w:r>
+        <w:rPr>
+          <w:lang w:val="nl"/>
+        </w:rPr>
+        <w:t xml:space="preserve">eindigde. Iemand kan na een pauze terugkomen. Daarom vernietigt het systeem het</w:t>
+      </w:r>
+      <w:r>
+        <w:rPr>
+          <w:lang w:val="nl"/>
+        </w:rPr>
+        <w:t xml:space="preserve"> </w:t>
+      </w:r>
+      <w:r>
+        <w:rPr>
+          <w:lang w:val="nl"/>
+        </w:rPr>
+        <w:t xml:space="preserve">loonheffingsformulier en de kopie ID nooit zelf. Het zet wel klaar wie in aanmerking komt, onderaan</w:t>
+      </w:r>
+      <w:r>
+        <w:rPr>
+          <w:lang w:val="nl"/>
+        </w:rPr>
+        <w:t xml:space="preserve"> </w:t>
+      </w:r>
+      <w:r>
+        <w:rPr>
+          <w:lang w:val="nl"/>
+        </w:rPr>
+        <w:t xml:space="preserve">Loondossiers in de kaart</w:t>
+      </w:r>
+      <w:r>
+        <w:rPr>
+          <w:lang w:val="nl"/>
+        </w:rPr>
+        <w:t xml:space="preserve"> </w:t>
+      </w:r>
+      <w:r>
+        <w:rPr>
+          <w:b/>
+          <w:bCs/>
+          <w:lang w:val="nl"/>
+        </w:rPr>
+        <w:t xml:space="preserve">Te beoordelen voor vernietiging</w:t>
+      </w:r>
+      <w:r>
+        <w:rPr>
+          <w:lang w:val="nl"/>
+        </w:rPr>
+        <w:t xml:space="preserve">.</w:t>
       </w:r>
     </w:p>
     <w:p>
@@ -3574,154 +4023,43 @@
         <w:rPr>
           <w:lang w:val="nl"/>
         </w:rPr>
-        <w:t xml:space="preserve">De termijnen van 5 jaar en 30 dagen zijn standaardwaarden. Ze staan niet als veld op het scherm</w:t>
-      </w:r>
-      <w:r>
-        <w:rPr>
-          <w:lang w:val="nl"/>
-        </w:rPr>
-        <w:t xml:space="preserve"> </w:t>
-      </w:r>
-      <w:r>
-        <w:rPr>
-          <w:lang w:val="nl"/>
-        </w:rPr>
-        <w:t xml:space="preserve">Bewaren &amp; opschonen; aanpassen kan alleen de technisch beheerder. Wat er is vernietigd, ziet de</w:t>
-      </w:r>
-      <w:r>
-        <w:rPr>
-          <w:lang w:val="nl"/>
-        </w:rPr>
-        <w:t xml:space="preserve"> </w:t>
-      </w:r>
-      <w:r>
-        <w:rPr>
-          <w:lang w:val="nl"/>
-        </w:rPr>
-        <w:t xml:space="preserve">admin in het Logboek.</w:t>
-      </w:r>
-    </w:p>
-    <w:p>
-      <w:pPr>
-        <w:pStyle w:val="BodyText"/>
-      </w:pPr>
-      <w:r>
-        <w:rPr>
-          <w:b/>
-          <w:bCs/>
-          <w:lang w:val="nl"/>
-        </w:rPr>
-        <w:t xml:space="preserve">Terugtrekken.</w:t>
-      </w:r>
-      <w:r>
-        <w:rPr>
-          <w:lang w:val="nl"/>
-        </w:rPr>
-        <w:t xml:space="preserve"> </w:t>
-      </w:r>
-      <w:r>
-        <w:rPr>
-          <w:lang w:val="nl"/>
-        </w:rPr>
-        <w:t xml:space="preserve">Trekt een strandwacht zich terug vóórdat het dossier verwerkt is, dan kan die</w:t>
-      </w:r>
-      <w:r>
-        <w:rPr>
-          <w:lang w:val="nl"/>
-        </w:rPr>
-        <w:t xml:space="preserve"> </w:t>
-      </w:r>
-      <w:r>
-        <w:rPr>
-          <w:lang w:val="nl"/>
-        </w:rPr>
-        <w:t xml:space="preserve">de gegevens zelf verwijderen in het portaal; de stukken worden dan meteen vernietigd. Is het</w:t>
-      </w:r>
-      <w:r>
-        <w:rPr>
-          <w:lang w:val="nl"/>
-        </w:rPr>
-        <w:t xml:space="preserve"> </w:t>
-      </w:r>
-      <w:r>
-        <w:rPr>
-          <w:lang w:val="nl"/>
-        </w:rPr>
-        <w:t xml:space="preserve">dossier al verwerkt en gaat het dienstverband toch niet door, dan kan alleen iemand met het recht</w:t>
-      </w:r>
-      <w:r>
-        <w:rPr>
-          <w:lang w:val="nl"/>
-        </w:rPr>
-        <w:t xml:space="preserve"> </w:t>
-      </w:r>
-      <w:r>
-        <w:rPr>
-          <w:lang w:val="nl"/>
-        </w:rPr>
-        <w:t xml:space="preserve">om sollicitanten te verwijderen (standaard bestuur en admin) het dossier verwijderen. Het systeem</w:t>
-      </w:r>
-      <w:r>
-        <w:rPr>
-          <w:lang w:val="nl"/>
-        </w:rPr>
-        <w:t xml:space="preserve"> </w:t>
-      </w:r>
-      <w:r>
-        <w:rPr>
-          <w:lang w:val="nl"/>
-        </w:rPr>
-        <w:t xml:space="preserve">vraagt dan apart om te bevestigen dat het dienstverband niet is doorgegaan.</w:t>
-      </w:r>
-    </w:p>
-    <w:bookmarkEnd w:id="18"/>
-    <w:bookmarkStart w:id="19" w:name="wat-je-nooit-doet"/>
-    <w:p>
-      <w:pPr>
-        <w:pStyle w:val="Heading1"/>
-      </w:pPr>
-      <w:r>
-        <w:rPr>
-          <w:lang w:val="nl"/>
-        </w:rPr>
-        <w:t xml:space="preserve">Wat je nooit doet</w:t>
-      </w:r>
-    </w:p>
-    <w:p>
-      <w:pPr>
-        <w:pStyle w:val="BlockText"/>
-      </w:pPr>
-      <w:r>
-        <w:rPr>
-          <w:b/>
-          <w:bCs/>
-          <w:lang w:val="nl"/>
-        </w:rPr>
-        <w:t xml:space="preserve">In het kort:</w:t>
-      </w:r>
-      <w:r>
-        <w:rPr>
-          <w:lang w:val="nl"/>
-        </w:rPr>
-        <w:t xml:space="preserve"> </w:t>
-      </w:r>
-      <w:r>
-        <w:rPr>
-          <w:lang w:val="nl"/>
-        </w:rPr>
-        <w:t xml:space="preserve">stukken blijven in het beheer en in de loonadministratie. Niet mailen, niet</w:t>
-      </w:r>
-      <w:r>
-        <w:rPr>
-          <w:lang w:val="nl"/>
-        </w:rPr>
-        <w:t xml:space="preserve"> </w:t>
-      </w:r>
-      <w:r>
-        <w:rPr>
-          <w:lang w:val="nl"/>
-        </w:rPr>
-        <w:t xml:space="preserve">kopiëren, niet delen.</w:t>
+        <w:t xml:space="preserve">Daarin staat iedereen van wie het laatste seizoen als aangenomen (of met loonstukken) minstens vijf</w:t>
+      </w:r>
+      <w:r>
+        <w:rPr>
+          <w:lang w:val="nl"/>
+        </w:rPr>
+        <w:t xml:space="preserve"> </w:t>
+      </w:r>
+      <w:r>
+        <w:rPr>
+          <w:lang w:val="nl"/>
+        </w:rPr>
+        <w:t xml:space="preserve">volle kalenderjaren terug ligt. Wie in 2020 voor het laatst werkte, verschijnt op 1 januari 2026.</w:t>
+      </w:r>
+      <w:r>
+        <w:rPr>
+          <w:lang w:val="nl"/>
+        </w:rPr>
+        <w:t xml:space="preserve"> </w:t>
+      </w:r>
+      <w:r>
+        <w:rPr>
+          <w:lang w:val="nl"/>
+        </w:rPr>
+        <w:t xml:space="preserve">Per persoon zie je "Laatste seizoen hier" en "Nog aanwezig" met de stukken die er nog zijn. Staat</w:t>
+      </w:r>
+      <w:r>
+        <w:rPr>
+          <w:lang w:val="nl"/>
+        </w:rPr>
+        <w:t xml:space="preserve"> </w:t>
+      </w:r>
+      <w:r>
+        <w:rPr>
+          <w:lang w:val="nl"/>
+        </w:rPr>
+        <w:t xml:space="preserve">er niemand in aanmerking, dan is de kaart er niet.</w:t>
       </w:r>
     </w:p>
     <w:p>
@@ -3736,7 +4074,19 @@
         <w:rPr>
           <w:lang w:val="nl"/>
         </w:rPr>
-        <w:t xml:space="preserve">Stukken per e-mail of WhatsApp doorsturen, ook niet naar jezelf. Gebruik het beheer.</w:t>
+        <w:t xml:space="preserve">Controleer in de loonadministratie of het dienstverband toen echt eindigde. Werkte iemand daarna</w:t>
+      </w:r>
+      <w:r>
+        <w:rPr>
+          <w:lang w:val="nl"/>
+        </w:rPr>
+        <w:t xml:space="preserve"> </w:t>
+      </w:r>
+      <w:r>
+        <w:rPr>
+          <w:lang w:val="nl"/>
+        </w:rPr>
+        <w:t xml:space="preserve">nog, vernietig dan niets.</w:t>
       </w:r>
     </w:p>
     <w:p>
@@ -3751,19 +4101,33 @@
         <w:rPr>
           <w:lang w:val="nl"/>
         </w:rPr>
-        <w:t xml:space="preserve">Een BSN of rekeningnummer in een spreadsheet, notitie of chat zetten buiten de</w:t>
-      </w:r>
-      <w:r>
-        <w:rPr>
-          <w:lang w:val="nl"/>
-        </w:rPr>
-        <w:t xml:space="preserve"> </w:t>
-      </w:r>
-      <w:r>
-        <w:rPr>
-          <w:lang w:val="nl"/>
-        </w:rPr>
-        <w:t xml:space="preserve">loonadministratie.</w:t>
+        <w:t xml:space="preserve">Klik op</w:t>
+      </w:r>
+      <w:r>
+        <w:rPr>
+          <w:lang w:val="nl"/>
+        </w:rPr>
+        <w:t xml:space="preserve"> </w:t>
+      </w:r>
+      <w:r>
+        <w:rPr>
+          <w:b/>
+          <w:bCs/>
+          <w:lang w:val="nl"/>
+        </w:rPr>
+        <w:t xml:space="preserve">Vernietigen…</w:t>
+      </w:r>
+      <w:r>
+        <w:rPr>
+          <w:lang w:val="nl"/>
+        </w:rPr>
+        <w:t xml:space="preserve"> </w:t>
+      </w:r>
+      <w:r>
+        <w:rPr>
+          <w:lang w:val="nl"/>
+        </w:rPr>
+        <w:t xml:space="preserve">bij de naam.</w:t>
       </w:r>
     </w:p>
     <w:p>
@@ -3778,7 +4142,54 @@
         <w:rPr>
           <w:lang w:val="nl"/>
         </w:rPr>
-        <w:t xml:space="preserve">Je inlog delen. Elke download staat op jouw naam.</w:t>
+        <w:t xml:space="preserve">Het tussenscherm noemt precies wat onherroepelijk weggaat. Klik op</w:t>
+      </w:r>
+      <w:r>
+        <w:rPr>
+          <w:lang w:val="nl"/>
+        </w:rPr>
+        <w:t xml:space="preserve"> </w:t>
+      </w:r>
+      <w:r>
+        <w:rPr>
+          <w:b/>
+          <w:bCs/>
+          <w:lang w:val="nl"/>
+        </w:rPr>
+        <w:t xml:space="preserve">Ja, loondossier</w:t>
+      </w:r>
+      <w:r>
+        <w:rPr>
+          <w:b/>
+          <w:bCs/>
+          <w:lang w:val="nl"/>
+        </w:rPr>
+        <w:t xml:space="preserve"> </w:t>
+      </w:r>
+      <w:r>
+        <w:rPr>
+          <w:b/>
+          <w:bCs/>
+          <w:lang w:val="nl"/>
+        </w:rPr>
+        <w:t xml:space="preserve">vernietigen</w:t>
+      </w:r>
+      <w:r>
+        <w:rPr>
+          <w:lang w:val="nl"/>
+        </w:rPr>
+        <w:t xml:space="preserve">.</w:t>
+      </w:r>
+    </w:p>
+    <w:p>
+      <w:pPr>
+        <w:pStyle w:val="FirstParagraph"/>
+      </w:pPr>
+      <w:r>
+        <w:rPr>
+          <w:lang w:val="nl"/>
+        </w:rPr>
+        <w:t xml:space="preserve">Wat er dan gebeurt:</w:t>
       </w:r>
     </w:p>
     <w:p>
@@ -3786,14 +4197,26 @@
         <w:pStyle w:val="Compact"/>
         <w:numPr>
           <w:ilvl w:val="0"/>
-          <w:numId w:val="1014"/>
+          <w:numId w:val="1015"/>
         </w:numPr>
       </w:pPr>
       <w:r>
         <w:rPr>
           <w:lang w:val="nl"/>
         </w:rPr>
-        <w:t xml:space="preserve">Screenshots maken van kopieën van identiteitsbewijzen.</w:t>
+        <w:t xml:space="preserve">De stukken worden uit de kluis gewist en zijn niet meer terug te halen, ook niet door een</w:t>
+      </w:r>
+      <w:r>
+        <w:rPr>
+          <w:lang w:val="nl"/>
+        </w:rPr>
+        <w:t xml:space="preserve"> </w:t>
+      </w:r>
+      <w:r>
+        <w:rPr>
+          <w:lang w:val="nl"/>
+        </w:rPr>
+        <w:t xml:space="preserve">beheerder.</w:t>
       </w:r>
     </w:p>
     <w:p>
@@ -3801,18 +4224,326 @@
         <w:pStyle w:val="Compact"/>
         <w:numPr>
           <w:ilvl w:val="0"/>
-          <w:numId w:val="1014"/>
+          <w:numId w:val="1015"/>
         </w:numPr>
       </w:pPr>
       <w:r>
         <w:rPr>
           <w:lang w:val="nl"/>
         </w:rPr>
+        <w:t xml:space="preserve">Van het loonheffingsformulier verdwijnen ook het BSN, de handtekening en de ingevulde gegevens.</w:t>
+      </w:r>
+      <w:r>
+        <w:rPr>
+          <w:lang w:val="nl"/>
+        </w:rPr>
+        <w:t xml:space="preserve"> </w:t>
+      </w:r>
+      <w:r>
+        <w:rPr>
+          <w:lang w:val="nl"/>
+        </w:rPr>
+        <w:t xml:space="preserve">Als bewijs blijft staan dát er getekend en geüpload is.</w:t>
+      </w:r>
+    </w:p>
+    <w:p>
+      <w:pPr>
+        <w:pStyle w:val="Compact"/>
+        <w:numPr>
+          <w:ilvl w:val="0"/>
+          <w:numId w:val="1015"/>
+        </w:numPr>
+      </w:pPr>
+      <w:r>
+        <w:rPr>
+          <w:lang w:val="nl"/>
+        </w:rPr>
+        <w:t xml:space="preserve">De rest van het dossier blijft staan: gegevens, sollicitaties en andere ondertekeningen.</w:t>
+      </w:r>
+    </w:p>
+    <w:p>
+      <w:pPr>
+        <w:pStyle w:val="Compact"/>
+        <w:numPr>
+          <w:ilvl w:val="0"/>
+          <w:numId w:val="1015"/>
+        </w:numPr>
+      </w:pPr>
+      <w:r>
+        <w:rPr>
+          <w:lang w:val="nl"/>
+        </w:rPr>
+        <w:t xml:space="preserve">In het logboek komt "Loondossier vernietigd (na de bewaarplicht)", met wie het deed, zonder de</w:t>
+      </w:r>
+      <w:r>
+        <w:rPr>
+          <w:lang w:val="nl"/>
+        </w:rPr>
+        <w:t xml:space="preserve"> </w:t>
+      </w:r>
+      <w:r>
+        <w:rPr>
+          <w:lang w:val="nl"/>
+        </w:rPr>
+        <w:t xml:space="preserve">inhoud.</w:t>
+      </w:r>
+    </w:p>
+    <w:p>
+      <w:pPr>
+        <w:pStyle w:val="FirstParagraph"/>
+      </w:pPr>
+      <w:r>
+        <w:rPr>
+          <w:lang w:val="nl"/>
+        </w:rPr>
+        <w:t xml:space="preserve">Doe deze controle één keer per jaar, bijvoorbeeld in januari. Zie de afvinklijst in</w:t>
+      </w:r>
+      <w:r>
+        <w:rPr>
+          <w:lang w:val="nl"/>
+        </w:rPr>
+        <w:t xml:space="preserve"> </w:t>
+      </w:r>
+      <w:hyperlink w:anchor="aan-de-slag">
+        <w:r>
+          <w:rPr>
+            <w:rStyle w:val="Hyperlink"/>
+            <w:lang w:val="nl"/>
+          </w:rPr>
+          <w:t xml:space="preserve">Aan de slag</w:t>
+        </w:r>
+      </w:hyperlink>
+      <w:r>
+        <w:rPr>
+          <w:lang w:val="nl"/>
+        </w:rPr>
+        <w:t xml:space="preserve">.</w:t>
+      </w:r>
+    </w:p>
+    <w:bookmarkEnd w:id="18"/>
+    <w:bookmarkStart w:id="19" w:name="terugtrekken"/>
+    <w:p>
+      <w:pPr>
+        <w:pStyle w:val="Heading2"/>
+      </w:pPr>
+      <w:r>
+        <w:rPr>
+          <w:lang w:val="nl"/>
+        </w:rPr>
+        <w:t xml:space="preserve">Terugtrekken</w:t>
+      </w:r>
+    </w:p>
+    <w:p>
+      <w:pPr>
+        <w:pStyle w:val="FirstParagraph"/>
+      </w:pPr>
+      <w:r>
+        <w:rPr>
+          <w:lang w:val="nl"/>
+        </w:rPr>
+        <w:t xml:space="preserve">Trekt een strandwacht zich terug vóórdat het dossier verwerkt is, dan kan die de gegevens zelf</w:t>
+      </w:r>
+      <w:r>
+        <w:rPr>
+          <w:lang w:val="nl"/>
+        </w:rPr>
+        <w:t xml:space="preserve"> </w:t>
+      </w:r>
+      <w:r>
+        <w:rPr>
+          <w:lang w:val="nl"/>
+        </w:rPr>
+        <w:t xml:space="preserve">verwijderen in het portaal; de stukken worden dan meteen vernietigd. Is het dossier al verwerkt en</w:t>
+      </w:r>
+      <w:r>
+        <w:rPr>
+          <w:lang w:val="nl"/>
+        </w:rPr>
+        <w:t xml:space="preserve"> </w:t>
+      </w:r>
+      <w:r>
+        <w:rPr>
+          <w:lang w:val="nl"/>
+        </w:rPr>
+        <w:t xml:space="preserve">gaat het dienstverband toch niet door, dan kan alleen iemand met zowel het recht om sollicitanten</w:t>
+      </w:r>
+      <w:r>
+        <w:rPr>
+          <w:lang w:val="nl"/>
+        </w:rPr>
+        <w:t xml:space="preserve"> </w:t>
+      </w:r>
+      <w:r>
+        <w:rPr>
+          <w:lang w:val="nl"/>
+        </w:rPr>
+        <w:t xml:space="preserve">te verwijderen als het recht om loondossiers te verwijderen het dossier verwijderen (standaard</w:t>
+      </w:r>
+      <w:r>
+        <w:rPr>
+          <w:lang w:val="nl"/>
+        </w:rPr>
+        <w:t xml:space="preserve"> </w:t>
+      </w:r>
+      <w:r>
+        <w:rPr>
+          <w:lang w:val="nl"/>
+        </w:rPr>
+        <w:t xml:space="preserve">alleen de admin). Het systeem vraagt dan met een apart vinkje om te bevestigen dat het</w:t>
+      </w:r>
+      <w:r>
+        <w:rPr>
+          <w:lang w:val="nl"/>
+        </w:rPr>
+        <w:t xml:space="preserve"> </w:t>
+      </w:r>
+      <w:r>
+        <w:rPr>
+          <w:lang w:val="nl"/>
+        </w:rPr>
+        <w:t xml:space="preserve">dienstverband niet is doorgegaan.</w:t>
+      </w:r>
+    </w:p>
+    <w:bookmarkEnd w:id="19"/>
+    <w:bookmarkEnd w:id="20"/>
+    <w:bookmarkStart w:id="21" w:name="wat-je-nooit-doet"/>
+    <w:p>
+      <w:pPr>
+        <w:pStyle w:val="Heading1"/>
+      </w:pPr>
+      <w:r>
+        <w:rPr>
+          <w:lang w:val="nl"/>
+        </w:rPr>
+        <w:t xml:space="preserve">Wat je nooit doet</w:t>
+      </w:r>
+    </w:p>
+    <w:p>
+      <w:pPr>
+        <w:pStyle w:val="BlockText"/>
+      </w:pPr>
+      <w:r>
+        <w:rPr>
+          <w:b/>
+          <w:bCs/>
+          <w:lang w:val="nl"/>
+        </w:rPr>
+        <w:t xml:space="preserve">In het kort:</w:t>
+      </w:r>
+      <w:r>
+        <w:rPr>
+          <w:lang w:val="nl"/>
+        </w:rPr>
+        <w:t xml:space="preserve"> </w:t>
+      </w:r>
+      <w:r>
+        <w:rPr>
+          <w:lang w:val="nl"/>
+        </w:rPr>
+        <w:t xml:space="preserve">stukken blijven in het beheer en in de loonadministratie. Niet mailen, niet</w:t>
+      </w:r>
+      <w:r>
+        <w:rPr>
+          <w:lang w:val="nl"/>
+        </w:rPr>
+        <w:t xml:space="preserve"> </w:t>
+      </w:r>
+      <w:r>
+        <w:rPr>
+          <w:lang w:val="nl"/>
+        </w:rPr>
+        <w:t xml:space="preserve">kopiëren, niet delen.</w:t>
+      </w:r>
+    </w:p>
+    <w:p>
+      <w:pPr>
+        <w:pStyle w:val="Compact"/>
+        <w:numPr>
+          <w:ilvl w:val="0"/>
+          <w:numId w:val="1016"/>
+        </w:numPr>
+      </w:pPr>
+      <w:r>
+        <w:rPr>
+          <w:lang w:val="nl"/>
+        </w:rPr>
+        <w:t xml:space="preserve">Stukken per e-mail of WhatsApp doorsturen, ook niet naar jezelf. Gebruik het beheer.</w:t>
+      </w:r>
+    </w:p>
+    <w:p>
+      <w:pPr>
+        <w:pStyle w:val="Compact"/>
+        <w:numPr>
+          <w:ilvl w:val="0"/>
+          <w:numId w:val="1016"/>
+        </w:numPr>
+      </w:pPr>
+      <w:r>
+        <w:rPr>
+          <w:lang w:val="nl"/>
+        </w:rPr>
+        <w:t xml:space="preserve">Een BSN of rekeningnummer in een spreadsheet, notitie of chat zetten buiten de</w:t>
+      </w:r>
+      <w:r>
+        <w:rPr>
+          <w:lang w:val="nl"/>
+        </w:rPr>
+        <w:t xml:space="preserve"> </w:t>
+      </w:r>
+      <w:r>
+        <w:rPr>
+          <w:lang w:val="nl"/>
+        </w:rPr>
+        <w:t xml:space="preserve">loonadministratie.</w:t>
+      </w:r>
+    </w:p>
+    <w:p>
+      <w:pPr>
+        <w:pStyle w:val="Compact"/>
+        <w:numPr>
+          <w:ilvl w:val="0"/>
+          <w:numId w:val="1016"/>
+        </w:numPr>
+      </w:pPr>
+      <w:r>
+        <w:rPr>
+          <w:lang w:val="nl"/>
+        </w:rPr>
+        <w:t xml:space="preserve">Je inlog delen. Elke download staat op jouw naam.</w:t>
+      </w:r>
+    </w:p>
+    <w:p>
+      <w:pPr>
+        <w:pStyle w:val="Compact"/>
+        <w:numPr>
+          <w:ilvl w:val="0"/>
+          <w:numId w:val="1016"/>
+        </w:numPr>
+      </w:pPr>
+      <w:r>
+        <w:rPr>
+          <w:lang w:val="nl"/>
+        </w:rPr>
+        <w:t xml:space="preserve">Screenshots maken van kopieën van identiteitsbewijzen.</w:t>
+      </w:r>
+    </w:p>
+    <w:p>
+      <w:pPr>
+        <w:pStyle w:val="Compact"/>
+        <w:numPr>
+          <w:ilvl w:val="0"/>
+          <w:numId w:val="1016"/>
+        </w:numPr>
+      </w:pPr>
+      <w:r>
+        <w:rPr>
+          <w:lang w:val="nl"/>
+        </w:rPr>
         <w:t xml:space="preserve">Gedownloade bestanden laten staan op je computer.</w:t>
       </w:r>
     </w:p>
-    <w:bookmarkEnd w:id="19"/>
-    <w:bookmarkStart w:id="20" w:name="veelgestelde-vragen"/>
+    <w:bookmarkEnd w:id="21"/>
+    <w:bookmarkStart w:id="22" w:name="veelgestelde-vragen"/>
     <w:p>
       <w:pPr>
         <w:pStyle w:val="Heading1"/>
@@ -3926,31 +4657,43 @@
         <w:rPr>
           <w:lang w:val="nl"/>
         </w:rPr>
-        <w:t xml:space="preserve">Dat kan: de mail gaat alleen mee op het moment dat het loonheffingsformulier wordt ondertekend.</w:t>
-      </w:r>
-      <w:r>
-        <w:rPr>
-          <w:lang w:val="nl"/>
-        </w:rPr>
-        <w:t xml:space="preserve"> </w:t>
-      </w:r>
-      <w:r>
-        <w:rPr>
-          <w:lang w:val="nl"/>
-        </w:rPr>
-        <w:t xml:space="preserve">Kwam een kopie later binnen, dan komt er geen mail. Verwerk het dossier gewoon, of klik op</w:t>
-      </w:r>
-      <w:r>
-        <w:rPr>
-          <w:lang w:val="nl"/>
-        </w:rPr>
-        <w:t xml:space="preserve"> </w:t>
-      </w:r>
-      <w:r>
-        <w:rPr>
-          <w:lang w:val="nl"/>
-        </w:rPr>
-        <w:t xml:space="preserve">"Melding opnieuw naar de penningmeester" als je de mail toch wilt hebben.</w:t>
+        <w:t xml:space="preserve">De mail gaat uit zodra het laatste stuk binnen is. Kijk eerst in je ongewenste mail en of het</w:t>
+      </w:r>
+      <w:r>
+        <w:rPr>
+          <w:lang w:val="nl"/>
+        </w:rPr>
+        <w:t xml:space="preserve"> </w:t>
+      </w:r>
+      <w:r>
+        <w:rPr>
+          <w:lang w:val="nl"/>
+        </w:rPr>
+        <w:t xml:space="preserve">penningmeester-adres in Instellingen › Afzender &amp; adressen klopt (leeg is: het bestuursadres).</w:t>
+      </w:r>
+      <w:r>
+        <w:rPr>
+          <w:lang w:val="nl"/>
+        </w:rPr>
+        <w:t xml:space="preserve"> </w:t>
+      </w:r>
+      <w:r>
+        <w:rPr>
+          <w:lang w:val="nl"/>
+        </w:rPr>
+        <w:t xml:space="preserve">Verwerk het dossier gewoon, of klik op "Melding opnieuw naar de penningmeester" als je de mail toch</w:t>
+      </w:r>
+      <w:r>
+        <w:rPr>
+          <w:lang w:val="nl"/>
+        </w:rPr>
+        <w:t xml:space="preserve"> </w:t>
+      </w:r>
+      <w:r>
+        <w:rPr>
+          <w:lang w:val="nl"/>
+        </w:rPr>
+        <w:t xml:space="preserve">wilt hebben.</w:t>
       </w:r>
     </w:p>
     <w:p>
@@ -4064,7 +4807,7 @@
         <w:rPr>
           <w:lang w:val="nl"/>
         </w:rPr>
-        <w:t xml:space="preserve">de bewaartermijn voorbij is; vraag de admin als je ze nodig hebt.</w:t>
+        <w:t xml:space="preserve">jij ze na de bewaarplicht vernietigt; vraag de admin als je ze nodig hebt.</w:t>
       </w:r>
     </w:p>
     <w:p>
@@ -4156,10 +4899,102 @@
         <w:rPr>
           <w:lang w:val="nl"/>
         </w:rPr>
-        <w:t xml:space="preserve">jou. Alleen de technisch beheerder kan die melding uitzetten, en dat raden we af.</w:t>
-      </w:r>
-    </w:p>
-    <w:bookmarkEnd w:id="20"/>
+        <w:t xml:space="preserve">jou. Het bestuur kan die melding uitzetten onder Instellingen › Bewaren &amp; opschonen, maar dat</w:t>
+      </w:r>
+      <w:r>
+        <w:rPr>
+          <w:lang w:val="nl"/>
+        </w:rPr>
+        <w:t xml:space="preserve"> </w:t>
+      </w:r>
+      <w:r>
+        <w:rPr>
+          <w:lang w:val="nl"/>
+        </w:rPr>
+        <w:t xml:space="preserve">raden we af.</w:t>
+      </w:r>
+    </w:p>
+    <w:p>
+      <w:pPr>
+        <w:pStyle w:val="BodyText"/>
+      </w:pPr>
+      <w:r>
+        <w:rPr>
+          <w:b/>
+          <w:bCs/>
+          <w:lang w:val="nl"/>
+        </w:rPr>
+        <w:t xml:space="preserve">Ik zie een naam bij "Te beoordelen voor vernietiging" die nog bij ons werkt.</w:t>
+      </w:r>
+      <w:r>
+        <w:br/>
+      </w:r>
+      <w:r>
+        <w:rPr>
+          <w:lang w:val="nl"/>
+        </w:rPr>
+        <w:t xml:space="preserve">Vernietig dan niets. Het systeem kijkt alleen naar het laatste seizoen waarin iemand hier als</w:t>
+      </w:r>
+      <w:r>
+        <w:rPr>
+          <w:lang w:val="nl"/>
+        </w:rPr>
+        <w:t xml:space="preserve"> </w:t>
+      </w:r>
+      <w:r>
+        <w:rPr>
+          <w:lang w:val="nl"/>
+        </w:rPr>
+        <w:t xml:space="preserve">aangenomen voorkwam. Werkte die persoon later nog, bijvoorbeeld zonder nieuwe sollicitatie, dan</w:t>
+      </w:r>
+      <w:r>
+        <w:rPr>
+          <w:lang w:val="nl"/>
+        </w:rPr>
+        <w:t xml:space="preserve"> </w:t>
+      </w:r>
+      <w:r>
+        <w:rPr>
+          <w:lang w:val="nl"/>
+        </w:rPr>
+        <w:t xml:space="preserve">loopt de bewaarplicht langer. De naam blijft in de lijst staan; dat is geen probleem.</w:t>
+      </w:r>
+    </w:p>
+    <w:p>
+      <w:pPr>
+        <w:pStyle w:val="BodyText"/>
+      </w:pPr>
+      <w:r>
+        <w:rPr>
+          <w:b/>
+          <w:bCs/>
+          <w:lang w:val="nl"/>
+        </w:rPr>
+        <w:t xml:space="preserve">Ik wil de loonplanning als CSV downloaden, maar dat mag niet.</w:t>
+      </w:r>
+      <w:r>
+        <w:br/>
+      </w:r>
+      <w:r>
+        <w:rPr>
+          <w:lang w:val="nl"/>
+        </w:rPr>
+        <w:t xml:space="preserve">Die download vraagt het recht Loonplanning, en dat heeft de penningmeester standaard niet. Vraag</w:t>
+      </w:r>
+      <w:r>
+        <w:rPr>
+          <w:lang w:val="nl"/>
+        </w:rPr>
+        <w:t xml:space="preserve"> </w:t>
+      </w:r>
+      <w:r>
+        <w:rPr>
+          <w:lang w:val="nl"/>
+        </w:rPr>
+        <w:t xml:space="preserve">de admin om dat recht als je het nodig hebt.</w:t>
+      </w:r>
+    </w:p>
+    <w:bookmarkEnd w:id="22"/>
     <w:sectPr>
       <w:footnotePr>
         <w:numRestart w:val="eachSect"/>
@@ -4658,6 +5493,39 @@
     <w:abstractNumId w:val="991"/>
   </w:num>
   <w:num w:numId="1014">
+    <w:abstractNumId w:val="99411"/>
+    <w:lvlOverride w:ilvl="0">
+      <w:startOverride w:val="1"/>
+    </w:lvlOverride>
+    <w:lvlOverride w:ilvl="1">
+      <w:startOverride w:val="1"/>
+    </w:lvlOverride>
+    <w:lvlOverride w:ilvl="2">
+      <w:startOverride w:val="1"/>
+    </w:lvlOverride>
+    <w:lvlOverride w:ilvl="3">
+      <w:startOverride w:val="1"/>
+    </w:lvlOverride>
+    <w:lvlOverride w:ilvl="4">
+      <w:startOverride w:val="1"/>
+    </w:lvlOverride>
+    <w:lvlOverride w:ilvl="5">
+      <w:startOverride w:val="1"/>
+    </w:lvlOverride>
+    <w:lvlOverride w:ilvl="6">
+      <w:startOverride w:val="1"/>
+    </w:lvlOverride>
+    <w:lvlOverride w:ilvl="7">
+      <w:startOverride w:val="1"/>
+    </w:lvlOverride>
+    <w:lvlOverride w:ilvl="8">
+      <w:startOverride w:val="1"/>
+    </w:lvlOverride>
+  </w:num>
+  <w:num w:numId="1015">
+    <w:abstractNumId w:val="991"/>
+  </w:num>
+  <w:num w:numId="1016">
     <w:abstractNumId w:val="991"/>
   </w:num>
 </w:numbering>

</xml_diff>

<commit_message>
Handleidingen bijgewerkt naar 2.102
Penningmeester: nieuw hoofdstuk Loonplanning. Beheer: tweestaps op de noodingang, kluissleutel wisselen,
AI-bezwaar en wat er naar Google gaat, volledige inzage, zelf verwijderen met bewaard loondossier,
verwerkingsregister. Sollicitant: download, verwijderen na aanname, bezwaar. Runbook: MFA noodingang,
bewijs-hash na kluisrotatie, fonts zelf gehost. HTML + Word opnieuw gegenereerd.
</commit_message>
<xml_diff>
--- a/docs/handleiding/word/handleiding_penningmeester.docx
+++ b/docs/handleiding/word/handleiding_penningmeester.docx
@@ -21,7 +21,7 @@
         <w:rPr>
           <w:lang w:val="nl"/>
         </w:rPr>
-        <w:t xml:space="preserve">Versie 2.101 · september 2026</w:t>
+        <w:t xml:space="preserve">Versie 2.102 · september 2026</w:t>
       </w:r>
     </w:p>
     <w:p>
@@ -32,7 +32,7 @@
         <w:rPr>
           <w:lang w:val="nl"/>
         </w:rPr>
-        <w:t xml:space="preserve">Deze handleiding is voor de penningmeester. Je werkt vooral op één scherm in het beheer:</w:t>
+        <w:t xml:space="preserve">Deze handleiding is voor de penningmeester. Je werkt vooral op twee schermen in het beheer:</w:t>
       </w:r>
       <w:r>
         <w:rPr>
@@ -52,31 +52,69 @@
         <w:rPr>
           <w:lang w:val="nl"/>
         </w:rPr>
-        <w:t xml:space="preserve">. Daar staat per aangenomen strandwacht alles wat de loonadministratie nodig</w:t>
-      </w:r>
-      <w:r>
-        <w:rPr>
-          <w:lang w:val="nl"/>
-        </w:rPr>
-        <w:t xml:space="preserve"> </w:t>
-      </w:r>
-      <w:r>
-        <w:rPr>
-          <w:lang w:val="nl"/>
-        </w:rPr>
-        <w:t xml:space="preserve">heeft. Alleen de penningmeester en de admin kunnen deze stukken inzien; het bestuur ziet dit</w:t>
-      </w:r>
-      <w:r>
-        <w:rPr>
-          <w:lang w:val="nl"/>
-        </w:rPr>
-        <w:t xml:space="preserve"> </w:t>
-      </w:r>
-      <w:r>
-        <w:rPr>
-          <w:lang w:val="nl"/>
-        </w:rPr>
-        <w:t xml:space="preserve">scherm niet.</w:t>
+        <w:t xml:space="preserve"> </w:t>
+      </w:r>
+      <w:r>
+        <w:rPr>
+          <w:lang w:val="nl"/>
+        </w:rPr>
+        <w:t xml:space="preserve">en</w:t>
+      </w:r>
+      <w:r>
+        <w:rPr>
+          <w:lang w:val="nl"/>
+        </w:rPr>
+        <w:t xml:space="preserve"> </w:t>
+      </w:r>
+      <w:r>
+        <w:rPr>
+          <w:b/>
+          <w:bCs/>
+          <w:lang w:val="nl"/>
+        </w:rPr>
+        <w:t xml:space="preserve">Loonplanning</w:t>
+      </w:r>
+      <w:r>
+        <w:rPr>
+          <w:lang w:val="nl"/>
+        </w:rPr>
+        <w:t xml:space="preserve">. In Loondossiers staat per aangenomen strandwacht alles wat</w:t>
+      </w:r>
+      <w:r>
+        <w:rPr>
+          <w:lang w:val="nl"/>
+        </w:rPr>
+        <w:t xml:space="preserve"> </w:t>
+      </w:r>
+      <w:r>
+        <w:rPr>
+          <w:lang w:val="nl"/>
+        </w:rPr>
+        <w:t xml:space="preserve">de loonadministratie nodig heeft. Alleen de penningmeester en de admin kunnen deze stukken</w:t>
+      </w:r>
+      <w:r>
+        <w:rPr>
+          <w:lang w:val="nl"/>
+        </w:rPr>
+        <w:t xml:space="preserve"> </w:t>
+      </w:r>
+      <w:r>
+        <w:rPr>
+          <w:lang w:val="nl"/>
+        </w:rPr>
+        <w:t xml:space="preserve">inzien; het bestuur ziet dit scherm niet. In de Loonplanning zie je wie er wordt ingezet en wat</w:t>
+      </w:r>
+      <w:r>
+        <w:rPr>
+          <w:lang w:val="nl"/>
+        </w:rPr>
+        <w:t xml:space="preserve"> </w:t>
+      </w:r>
+      <w:r>
+        <w:rPr>
+          <w:lang w:val="nl"/>
+        </w:rPr>
+        <w:t xml:space="preserve">dat kost; die deel je met het bestuur.</w:t>
       </w:r>
     </w:p>
     <w:bookmarkStart w:id="9" w:name="inhoud"/>
@@ -261,6 +299,24 @@
           <w:numId w:val="1001"/>
         </w:numPr>
       </w:pPr>
+      <w:hyperlink w:anchor="loonplanning">
+        <w:r>
+          <w:rPr>
+            <w:rStyle w:val="Hyperlink"/>
+            <w:lang w:val="nl"/>
+          </w:rPr>
+          <w:t xml:space="preserve">Loonplanning</w:t>
+        </w:r>
+      </w:hyperlink>
+    </w:p>
+    <w:p>
+      <w:pPr>
+        <w:pStyle w:val="Compact"/>
+        <w:numPr>
+          <w:ilvl w:val="0"/>
+          <w:numId w:val="1001"/>
+        </w:numPr>
+      </w:pPr>
       <w:hyperlink w:anchor="wat-je-nooit-doet">
         <w:r>
           <w:rPr>
@@ -357,6 +413,18 @@
         </w:rPr>
         <w:t xml:space="preserve">wettelijke bewaarplicht vernietig je de loondocumenten zelf; het systeem zet ze voor je klaar.</w:t>
       </w:r>
+      <w:r>
+        <w:rPr>
+          <w:lang w:val="nl"/>
+        </w:rPr>
+        <w:t xml:space="preserve"> </w:t>
+      </w:r>
+      <w:r>
+        <w:rPr>
+          <w:lang w:val="nl"/>
+        </w:rPr>
+        <w:t xml:space="preserve">In de Loonplanning houd je de loonkosten tegen het budget in de gaten.</w:t>
+      </w:r>
     </w:p>
     <w:p>
       <w:pPr>
@@ -417,6 +485,30 @@
           <w:lang w:val="nl"/>
         </w:rPr>
         <w:t xml:space="preserve">het dossier daarna als verwerkt. Je beslist niet over aannemen of afwijzen; dat doet het bestuur.</w:t>
+      </w:r>
+      <w:r>
+        <w:rPr>
+          <w:lang w:val="nl"/>
+        </w:rPr>
+        <w:t xml:space="preserve"> </w:t>
+      </w:r>
+      <w:r>
+        <w:rPr>
+          <w:lang w:val="nl"/>
+        </w:rPr>
+        <w:t xml:space="preserve">Daarnaast kijk je mee in de Loonplanning: wie wordt ingezet, wat kost dat en past het in het</w:t>
+      </w:r>
+      <w:r>
+        <w:rPr>
+          <w:lang w:val="nl"/>
+        </w:rPr>
+        <w:t xml:space="preserve"> </w:t>
+      </w:r>
+      <w:r>
+        <w:rPr>
+          <w:lang w:val="nl"/>
+        </w:rPr>
+        <w:t xml:space="preserve">budget.</w:t>
       </w:r>
     </w:p>
     <w:p>
@@ -491,31 +583,31 @@
         <w:rPr>
           <w:lang w:val="nl"/>
         </w:rPr>
-        <w:t xml:space="preserve">het menu-item Loondossiers ziet. Vraag het bestuur om jouw e-mailadres in te vullen als</w:t>
-      </w:r>
-      <w:r>
-        <w:rPr>
-          <w:lang w:val="nl"/>
-        </w:rPr>
-        <w:t xml:space="preserve"> </w:t>
-      </w:r>
-      <w:r>
-        <w:rPr>
-          <w:lang w:val="nl"/>
-        </w:rPr>
-        <w:t xml:space="preserve">penningmeester-adres (Instellingen › Afzender &amp; adressen). Anders gaan de meldingen naar het</w:t>
-      </w:r>
-      <w:r>
-        <w:rPr>
-          <w:lang w:val="nl"/>
-        </w:rPr>
-        <w:t xml:space="preserve"> </w:t>
-      </w:r>
-      <w:r>
-        <w:rPr>
-          <w:lang w:val="nl"/>
-        </w:rPr>
-        <w:t xml:space="preserve">bestuursadres.</w:t>
+        <w:t xml:space="preserve">de menu-items Loonplanning en Loondossiers ziet. Vraag het bestuur om jouw e-mailadres in te</w:t>
+      </w:r>
+      <w:r>
+        <w:rPr>
+          <w:lang w:val="nl"/>
+        </w:rPr>
+        <w:t xml:space="preserve"> </w:t>
+      </w:r>
+      <w:r>
+        <w:rPr>
+          <w:lang w:val="nl"/>
+        </w:rPr>
+        <w:t xml:space="preserve">vullen als penningmeester-adres (Instellingen › Afzender &amp; adressen). Anders gaan de meldingen</w:t>
+      </w:r>
+      <w:r>
+        <w:rPr>
+          <w:lang w:val="nl"/>
+        </w:rPr>
+        <w:t xml:space="preserve"> </w:t>
+      </w:r>
+      <w:r>
+        <w:rPr>
+          <w:lang w:val="nl"/>
+        </w:rPr>
+        <w:t xml:space="preserve">naar het bestuursadres.</w:t>
       </w:r>
     </w:p>
     <w:p>
@@ -532,31 +624,64 @@
           <w:bCs/>
           <w:lang w:val="nl"/>
         </w:rPr>
-        <w:t xml:space="preserve">Na het trainingsweekend (de aannames):</w:t>
-      </w:r>
-      <w:r>
-        <w:rPr>
-          <w:lang w:val="nl"/>
-        </w:rPr>
-        <w:t xml:space="preserve"> </w:t>
-      </w:r>
-      <w:r>
-        <w:rPr>
-          <w:lang w:val="nl"/>
-        </w:rPr>
-        <w:t xml:space="preserve">open Loondossiers. Elke aangenomen strandwacht</w:t>
-      </w:r>
-      <w:r>
-        <w:rPr>
-          <w:lang w:val="nl"/>
-        </w:rPr>
-        <w:t xml:space="preserve"> </w:t>
-      </w:r>
-      <w:r>
-        <w:rPr>
-          <w:lang w:val="nl"/>
-        </w:rPr>
-        <w:t xml:space="preserve">staat er, ook als er nog niets is ingeleverd.</w:t>
+        <w:t xml:space="preserve">Bij de begroting:</w:t>
+      </w:r>
+      <w:r>
+        <w:rPr>
+          <w:lang w:val="nl"/>
+        </w:rPr>
+        <w:t xml:space="preserve"> </w:t>
+      </w:r>
+      <w:r>
+        <w:rPr>
+          <w:lang w:val="nl"/>
+        </w:rPr>
+        <w:t xml:space="preserve">geef het bestuur het seizoensbudget voor loonkosten door. Het bestuur</w:t>
+      </w:r>
+      <w:r>
+        <w:rPr>
+          <w:lang w:val="nl"/>
+        </w:rPr>
+        <w:t xml:space="preserve"> </w:t>
+      </w:r>
+      <w:r>
+        <w:rPr>
+          <w:lang w:val="nl"/>
+        </w:rPr>
+        <w:t xml:space="preserve">vult dat in bij Instellingen › Lonen &amp; budget, samen met de minimumlonen. Daarna zie je in de</w:t>
+      </w:r>
+      <w:r>
+        <w:rPr>
+          <w:lang w:val="nl"/>
+        </w:rPr>
+        <w:t xml:space="preserve"> </w:t>
+      </w:r>
+      <w:r>
+        <w:rPr>
+          <w:lang w:val="nl"/>
+        </w:rPr>
+        <w:t xml:space="preserve">Loonplanning of de planning erbinnen past (zie</w:t>
+      </w:r>
+      <w:r>
+        <w:rPr>
+          <w:lang w:val="nl"/>
+        </w:rPr>
+        <w:t xml:space="preserve"> </w:t>
+      </w:r>
+      <w:hyperlink w:anchor="loonplanning">
+        <w:r>
+          <w:rPr>
+            <w:rStyle w:val="Hyperlink"/>
+            <w:lang w:val="nl"/>
+          </w:rPr>
+          <w:t xml:space="preserve">Loonplanning</w:t>
+        </w:r>
+      </w:hyperlink>
+      <w:r>
+        <w:rPr>
+          <w:lang w:val="nl"/>
+        </w:rPr>
+        <w:t xml:space="preserve">).</w:t>
       </w:r>
     </w:p>
     <w:p>
@@ -573,31 +698,31 @@
           <w:bCs/>
           <w:lang w:val="nl"/>
         </w:rPr>
-        <w:t xml:space="preserve">Zodra er een mail "Loondossier compleet" komt:</w:t>
-      </w:r>
-      <w:r>
-        <w:rPr>
-          <w:lang w:val="nl"/>
-        </w:rPr>
-        <w:t xml:space="preserve"> </w:t>
-      </w:r>
-      <w:r>
-        <w:rPr>
-          <w:lang w:val="nl"/>
-        </w:rPr>
-        <w:t xml:space="preserve">klik op de knop in de mail. Je komt direct</w:t>
-      </w:r>
-      <w:r>
-        <w:rPr>
-          <w:lang w:val="nl"/>
-        </w:rPr>
-        <w:t xml:space="preserve"> </w:t>
-      </w:r>
-      <w:r>
-        <w:rPr>
-          <w:lang w:val="nl"/>
-        </w:rPr>
-        <w:t xml:space="preserve">bij het juiste dossier. Download de stukken en zet ze in de loonadministratie.</w:t>
+        <w:t xml:space="preserve">Na het trainingsweekend (de aannames):</w:t>
+      </w:r>
+      <w:r>
+        <w:rPr>
+          <w:lang w:val="nl"/>
+        </w:rPr>
+        <w:t xml:space="preserve"> </w:t>
+      </w:r>
+      <w:r>
+        <w:rPr>
+          <w:lang w:val="nl"/>
+        </w:rPr>
+        <w:t xml:space="preserve">open Loondossiers. Elke aangenomen strandwacht</w:t>
+      </w:r>
+      <w:r>
+        <w:rPr>
+          <w:lang w:val="nl"/>
+        </w:rPr>
+        <w:t xml:space="preserve"> </w:t>
+      </w:r>
+      <w:r>
+        <w:rPr>
+          <w:lang w:val="nl"/>
+        </w:rPr>
+        <w:t xml:space="preserve">staat er, ook als er nog niets is ingeleverd.</w:t>
       </w:r>
     </w:p>
     <w:p>
@@ -606,6 +731,47 @@
         <w:numPr>
           <w:ilvl w:val="0"/>
           <w:numId w:val="1005"/>
+        </w:numPr>
+      </w:pPr>
+      <w:r>
+        <w:rPr>
+          <w:b/>
+          <w:bCs/>
+          <w:lang w:val="nl"/>
+        </w:rPr>
+        <w:t xml:space="preserve">Zodra er een mail "Loondossier compleet" komt:</w:t>
+      </w:r>
+      <w:r>
+        <w:rPr>
+          <w:lang w:val="nl"/>
+        </w:rPr>
+        <w:t xml:space="preserve"> </w:t>
+      </w:r>
+      <w:r>
+        <w:rPr>
+          <w:lang w:val="nl"/>
+        </w:rPr>
+        <w:t xml:space="preserve">klik op de knop in de mail. Je komt direct</w:t>
+      </w:r>
+      <w:r>
+        <w:rPr>
+          <w:lang w:val="nl"/>
+        </w:rPr>
+        <w:t xml:space="preserve"> </w:t>
+      </w:r>
+      <w:r>
+        <w:rPr>
+          <w:lang w:val="nl"/>
+        </w:rPr>
+        <w:t xml:space="preserve">bij het juiste dossier. Download de stukken en zet ze in de loonadministratie.</w:t>
+      </w:r>
+    </w:p>
+    <w:p>
+      <w:pPr>
+        <w:pStyle w:val="Compact"/>
+        <w:numPr>
+          <w:ilvl w:val="0"/>
+          <w:numId w:val="1006"/>
         </w:numPr>
       </w:pPr>
       <w:r>
@@ -679,7 +845,7 @@
         <w:pStyle w:val="Compact"/>
         <w:numPr>
           <w:ilvl w:val="0"/>
-          <w:numId w:val="1006"/>
+          <w:numId w:val="1007"/>
         </w:numPr>
       </w:pPr>
       <w:r>
@@ -732,7 +898,60 @@
         <w:pStyle w:val="Compact"/>
         <w:numPr>
           <w:ilvl w:val="0"/>
-          <w:numId w:val="1007"/>
+          <w:numId w:val="1008"/>
+        </w:numPr>
+      </w:pPr>
+      <w:r>
+        <w:rPr>
+          <w:b/>
+          <w:bCs/>
+          <w:lang w:val="nl"/>
+        </w:rPr>
+        <w:t xml:space="preserve">Tijdens het seizoen, bijvoorbeeld elke maand:</w:t>
+      </w:r>
+      <w:r>
+        <w:rPr>
+          <w:lang w:val="nl"/>
+        </w:rPr>
+        <w:t xml:space="preserve"> </w:t>
+      </w:r>
+      <w:r>
+        <w:rPr>
+          <w:lang w:val="nl"/>
+        </w:rPr>
+        <w:t xml:space="preserve">open de Loonplanning en kijk onderaan naar</w:t>
+      </w:r>
+      <w:r>
+        <w:rPr>
+          <w:lang w:val="nl"/>
+        </w:rPr>
+        <w:t xml:space="preserve"> </w:t>
+      </w:r>
+      <w:r>
+        <w:rPr>
+          <w:lang w:val="nl"/>
+        </w:rPr>
+        <w:t xml:space="preserve">de totale loonkosten en het restant van het budget. Download zo nodig een CSV als tussenstand</w:t>
+      </w:r>
+      <w:r>
+        <w:rPr>
+          <w:lang w:val="nl"/>
+        </w:rPr>
+        <w:t xml:space="preserve"> </w:t>
+      </w:r>
+      <w:r>
+        <w:rPr>
+          <w:lang w:val="nl"/>
+        </w:rPr>
+        <w:t xml:space="preserve">voor het bestuur of de loonadministratie.</w:t>
+      </w:r>
+    </w:p>
+    <w:p>
+      <w:pPr>
+        <w:pStyle w:val="Compact"/>
+        <w:numPr>
+          <w:ilvl w:val="0"/>
+          <w:numId w:val="1009"/>
         </w:numPr>
       </w:pPr>
       <w:r>
@@ -853,19 +1072,19 @@
         <w:rPr>
           <w:lang w:val="nl"/>
         </w:rPr>
-        <w:t xml:space="preserve">In het beheer staat een interactieve rondleiding "Penningmeester: loondossiers".</w:t>
-      </w:r>
-      <w:r>
-        <w:rPr>
-          <w:lang w:val="nl"/>
-        </w:rPr>
-        <w:t xml:space="preserve"> </w:t>
-      </w:r>
-      <w:r>
-        <w:rPr>
-          <w:lang w:val="nl"/>
-        </w:rPr>
-        <w:t xml:space="preserve">Die loopt met je langs de echte schermen en wijst aan wat waar staat en wat jij moet doen. De</w:t>
+        <w:t xml:space="preserve">In het beheer staat een interactieve rondleiding "Penningmeester: loondossiers en</w:t>
+      </w:r>
+      <w:r>
+        <w:rPr>
+          <w:lang w:val="nl"/>
+        </w:rPr>
+        <w:t xml:space="preserve"> </w:t>
+      </w:r>
+      <w:r>
+        <w:rPr>
+          <w:lang w:val="nl"/>
+        </w:rPr>
+        <w:t xml:space="preserve">loonplanning". Die loopt met je langs de echte schermen en wijst aan wat waar staat en wat jij moet doen. De</w:t>
       </w:r>
       <w:r>
         <w:rPr>
@@ -1077,19 +1296,19 @@
         <w:rPr>
           <w:lang w:val="nl"/>
         </w:rPr>
-        <w:t xml:space="preserve">log in via Authentik op het beheer. Je ziet drie menu-items: Vandaag,</w:t>
-      </w:r>
-      <w:r>
-        <w:rPr>
-          <w:lang w:val="nl"/>
-        </w:rPr>
-        <w:t xml:space="preserve"> </w:t>
-      </w:r>
-      <w:r>
-        <w:rPr>
-          <w:lang w:val="nl"/>
-        </w:rPr>
-        <w:t xml:space="preserve">Sollicitanten en Loondossiers.</w:t>
+        <w:t xml:space="preserve">log in via Authentik op het beheer. Je ziet vier menu-items: Vandaag,</w:t>
+      </w:r>
+      <w:r>
+        <w:rPr>
+          <w:lang w:val="nl"/>
+        </w:rPr>
+        <w:t xml:space="preserve"> </w:t>
+      </w:r>
+      <w:r>
+        <w:rPr>
+          <w:lang w:val="nl"/>
+        </w:rPr>
+        <w:t xml:space="preserve">Sollicitanten, Loonplanning en Loondossiers.</w:t>
       </w:r>
     </w:p>
     <w:p>
@@ -1176,7 +1395,7 @@
         <w:pStyle w:val="Compact"/>
         <w:numPr>
           <w:ilvl w:val="0"/>
-          <w:numId w:val="1008"/>
+          <w:numId w:val="1010"/>
         </w:numPr>
       </w:pPr>
       <w:r>
@@ -1199,7 +1418,7 @@
         <w:pStyle w:val="Compact"/>
         <w:numPr>
           <w:ilvl w:val="0"/>
-          <w:numId w:val="1008"/>
+          <w:numId w:val="1010"/>
         </w:numPr>
       </w:pPr>
       <w:r>
@@ -1222,7 +1441,7 @@
         <w:pStyle w:val="Compact"/>
         <w:numPr>
           <w:ilvl w:val="0"/>
-          <w:numId w:val="1008"/>
+          <w:numId w:val="1010"/>
         </w:numPr>
       </w:pPr>
       <w:r>
@@ -1231,13 +1450,69 @@
           <w:bCs/>
           <w:lang w:val="nl"/>
         </w:rPr>
+        <w:t xml:space="preserve">Loonplanning</w:t>
+      </w:r>
+      <w:r>
+        <w:rPr>
+          <w:lang w:val="nl"/>
+        </w:rPr>
+        <w:t xml:space="preserve"> </w:t>
+      </w:r>
+      <w:r>
+        <w:rPr>
+          <w:lang w:val="nl"/>
+        </w:rPr>
+        <w:t xml:space="preserve">(in de groep Inzet &amp; loon): wie er wordt ingezet en wat dat kost; zie</w:t>
+      </w:r>
+      <w:r>
+        <w:rPr>
+          <w:lang w:val="nl"/>
+        </w:rPr>
+        <w:t xml:space="preserve"> </w:t>
+      </w:r>
+      <w:hyperlink w:anchor="loonplanning">
+        <w:r>
+          <w:rPr>
+            <w:rStyle w:val="Hyperlink"/>
+            <w:lang w:val="nl"/>
+          </w:rPr>
+          <w:t xml:space="preserve">Loonplanning</w:t>
+        </w:r>
+      </w:hyperlink>
+      <w:r>
+        <w:rPr>
+          <w:lang w:val="nl"/>
+        </w:rPr>
+        <w:t xml:space="preserve">;</w:t>
+      </w:r>
+    </w:p>
+    <w:p>
+      <w:pPr>
+        <w:pStyle w:val="Compact"/>
+        <w:numPr>
+          <w:ilvl w:val="0"/>
+          <w:numId w:val="1010"/>
+        </w:numPr>
+      </w:pPr>
+      <w:r>
+        <w:rPr>
+          <w:b/>
+          <w:bCs/>
+          <w:lang w:val="nl"/>
+        </w:rPr>
         <w:t xml:space="preserve">Loondossiers</w:t>
       </w:r>
       <w:r>
         <w:rPr>
           <w:lang w:val="nl"/>
         </w:rPr>
-        <w:t xml:space="preserve">: jouw werkscherm.</w:t>
+        <w:t xml:space="preserve"> </w:t>
+      </w:r>
+      <w:r>
+        <w:rPr>
+          <w:lang w:val="nl"/>
+        </w:rPr>
+        <w:t xml:space="preserve">(ook in Inzet &amp; loon): jouw werkscherm voor de loonadministratie.</w:t>
       </w:r>
     </w:p>
     <w:p>
@@ -2123,7 +2398,7 @@
         <w:pStyle w:val="Compact"/>
         <w:numPr>
           <w:ilvl w:val="0"/>
-          <w:numId w:val="1009"/>
+          <w:numId w:val="1011"/>
         </w:numPr>
       </w:pPr>
       <w:r>
@@ -2152,7 +2427,7 @@
         <w:pStyle w:val="Compact"/>
         <w:numPr>
           <w:ilvl w:val="0"/>
-          <w:numId w:val="1009"/>
+          <w:numId w:val="1011"/>
         </w:numPr>
       </w:pPr>
       <w:r>
@@ -2181,7 +2456,7 @@
         <w:pStyle w:val="Compact"/>
         <w:numPr>
           <w:ilvl w:val="0"/>
-          <w:numId w:val="1009"/>
+          <w:numId w:val="1011"/>
         </w:numPr>
       </w:pPr>
       <w:r>
@@ -2221,7 +2496,7 @@
         <w:pStyle w:val="Compact"/>
         <w:numPr>
           <w:ilvl w:val="0"/>
-          <w:numId w:val="1010"/>
+          <w:numId w:val="1012"/>
         </w:numPr>
       </w:pPr>
       <w:r>
@@ -2256,7 +2531,7 @@
         <w:pStyle w:val="Compact"/>
         <w:numPr>
           <w:ilvl w:val="0"/>
-          <w:numId w:val="1010"/>
+          <w:numId w:val="1012"/>
         </w:numPr>
       </w:pPr>
       <w:r>
@@ -2323,7 +2598,7 @@
         <w:pStyle w:val="Compact"/>
         <w:numPr>
           <w:ilvl w:val="0"/>
-          <w:numId w:val="1010"/>
+          <w:numId w:val="1012"/>
         </w:numPr>
       </w:pPr>
       <w:r>
@@ -2460,7 +2735,7 @@
         <w:pStyle w:val="Compact"/>
         <w:numPr>
           <w:ilvl w:val="0"/>
-          <w:numId w:val="1010"/>
+          <w:numId w:val="1012"/>
         </w:numPr>
       </w:pPr>
       <w:r>
@@ -2503,7 +2778,7 @@
         <w:pStyle w:val="Compact"/>
         <w:numPr>
           <w:ilvl w:val="0"/>
-          <w:numId w:val="1010"/>
+          <w:numId w:val="1012"/>
         </w:numPr>
       </w:pPr>
       <w:r>
@@ -2872,7 +3147,7 @@
         <w:pStyle w:val="Compact"/>
         <w:numPr>
           <w:ilvl w:val="0"/>
-          <w:numId w:val="1011"/>
+          <w:numId w:val="1013"/>
         </w:numPr>
       </w:pPr>
       <w:r>
@@ -2932,280 +3207,6 @@
           <w:lang w:val="nl"/>
         </w:rPr>
         <w:t xml:space="preserve">achter het stuk.</w:t>
-      </w:r>
-    </w:p>
-    <w:p>
-      <w:pPr>
-        <w:pStyle w:val="Compact"/>
-        <w:numPr>
-          <w:ilvl w:val="0"/>
-          <w:numId w:val="1011"/>
-        </w:numPr>
-      </w:pPr>
-      <w:r>
-        <w:rPr>
-          <w:lang w:val="nl"/>
-        </w:rPr>
-        <w:t xml:space="preserve">Op foto's (JPG of PNG) van het identiteitsbewijs en de bankpas staat een watermerk: "Kopie voor</w:t>
-      </w:r>
-      <w:r>
-        <w:rPr>
-          <w:lang w:val="nl"/>
-        </w:rPr>
-        <w:t xml:space="preserve"> </w:t>
-      </w:r>
-      <w:r>
-        <w:rPr>
-          <w:lang w:val="nl"/>
-        </w:rPr>
-        <w:t xml:space="preserve">loonadministratie Reddingsbrigade Paal 13", de datum en jouw naam. Het origineel in de kluis</w:t>
-      </w:r>
-      <w:r>
-        <w:rPr>
-          <w:lang w:val="nl"/>
-        </w:rPr>
-        <w:t xml:space="preserve"> </w:t>
-      </w:r>
-      <w:r>
-        <w:rPr>
-          <w:lang w:val="nl"/>
-        </w:rPr>
-        <w:t xml:space="preserve">blijft ongewijzigd. Een kopie die als PDF is geüpload krijgt geen watermerk.</w:t>
-      </w:r>
-    </w:p>
-    <w:p>
-      <w:pPr>
-        <w:pStyle w:val="Compact"/>
-        <w:numPr>
-          <w:ilvl w:val="0"/>
-          <w:numId w:val="1011"/>
-        </w:numPr>
-      </w:pPr>
-      <w:r>
-        <w:rPr>
-          <w:lang w:val="nl"/>
-        </w:rPr>
-        <w:t xml:space="preserve">Elke download wordt vastgelegd (wie, wanneer, welk stuk). Bij het identiteitsbewijs, de bankpas</w:t>
-      </w:r>
-      <w:r>
-        <w:rPr>
-          <w:lang w:val="nl"/>
-        </w:rPr>
-        <w:t xml:space="preserve"> </w:t>
-      </w:r>
-      <w:r>
-        <w:rPr>
-          <w:lang w:val="nl"/>
-        </w:rPr>
-        <w:t xml:space="preserve">en het loonheffingsformulier krijgt het bestuur standaard een mail dat jij iets hebt gedownload,</w:t>
-      </w:r>
-      <w:r>
-        <w:rPr>
-          <w:lang w:val="nl"/>
-        </w:rPr>
-        <w:t xml:space="preserve"> </w:t>
-      </w:r>
-      <w:r>
-        <w:rPr>
-          <w:lang w:val="nl"/>
-        </w:rPr>
-        <w:t xml:space="preserve">met de naam van het document. Dat is normaal en hoort zo.</w:t>
-      </w:r>
-    </w:p>
-    <w:p>
-      <w:pPr>
-        <w:pStyle w:val="Compact"/>
-        <w:numPr>
-          <w:ilvl w:val="0"/>
-          <w:numId w:val="1011"/>
-        </w:numPr>
-      </w:pPr>
-      <w:r>
-        <w:rPr>
-          <w:lang w:val="nl"/>
-        </w:rPr>
-        <w:t xml:space="preserve">Je kunt maximaal 30 stukken per uur downloaden.</w:t>
-      </w:r>
-    </w:p>
-    <w:p>
-      <w:pPr>
-        <w:pStyle w:val="Compact"/>
-        <w:numPr>
-          <w:ilvl w:val="0"/>
-          <w:numId w:val="1011"/>
-        </w:numPr>
-      </w:pPr>
-      <w:r>
-        <w:rPr>
-          <w:lang w:val="nl"/>
-        </w:rPr>
-        <w:t xml:space="preserve">Een downloadlink werkt alleen vanuit het beheer. Een link doorsturen heeft geen zin.</w:t>
-      </w:r>
-    </w:p>
-    <w:p>
-      <w:pPr>
-        <w:pStyle w:val="FirstParagraph"/>
-      </w:pPr>
-      <w:r>
-        <w:rPr>
-          <w:lang w:val="nl"/>
-        </w:rPr>
-        <w:t xml:space="preserve">Zet de stukken direct in de loonadministratie. Verwijder daarna de gedownloade bestanden van je</w:t>
-      </w:r>
-      <w:r>
-        <w:rPr>
-          <w:lang w:val="nl"/>
-        </w:rPr>
-        <w:t xml:space="preserve"> </w:t>
-      </w:r>
-      <w:r>
-        <w:rPr>
-          <w:lang w:val="nl"/>
-        </w:rPr>
-        <w:t xml:space="preserve">computer, ook uit je downloadmap en de prullenbak.</w:t>
-      </w:r>
-    </w:p>
-    <w:bookmarkEnd w:id="15"/>
-    <w:bookmarkStart w:id="16" w:name="een-dossier-verwerken"/>
-    <w:p>
-      <w:pPr>
-        <w:pStyle w:val="Heading1"/>
-      </w:pPr>
-      <w:r>
-        <w:rPr>
-          <w:lang w:val="nl"/>
-        </w:rPr>
-        <w:t xml:space="preserve">Een dossier verwerken</w:t>
-      </w:r>
-    </w:p>
-    <w:p>
-      <w:pPr>
-        <w:pStyle w:val="BlockText"/>
-      </w:pPr>
-      <w:r>
-        <w:rPr>
-          <w:b/>
-          <w:bCs/>
-          <w:lang w:val="nl"/>
-        </w:rPr>
-        <w:t xml:space="preserve">In het kort:</w:t>
-      </w:r>
-      <w:r>
-        <w:rPr>
-          <w:lang w:val="nl"/>
-        </w:rPr>
-        <w:t xml:space="preserve"> </w:t>
-      </w:r>
-      <w:r>
-        <w:rPr>
-          <w:lang w:val="nl"/>
-        </w:rPr>
-        <w:t xml:space="preserve">staan de gegevens in de loonadministratie, klik dan op "Verwerkt in de</w:t>
-      </w:r>
-      <w:r>
-        <w:rPr>
-          <w:lang w:val="nl"/>
-        </w:rPr>
-        <w:t xml:space="preserve"> </w:t>
-      </w:r>
-      <w:r>
-        <w:rPr>
-          <w:lang w:val="nl"/>
-        </w:rPr>
-        <w:t xml:space="preserve">loonadministratie" en bevestig. Dat is niet terug te draaien.</w:t>
-      </w:r>
-    </w:p>
-    <w:p>
-      <w:pPr>
-        <w:pStyle w:val="Compact"/>
-        <w:numPr>
-          <w:ilvl w:val="0"/>
-          <w:numId w:val="1012"/>
-        </w:numPr>
-      </w:pPr>
-      <w:r>
-        <w:rPr>
-          <w:lang w:val="nl"/>
-        </w:rPr>
-        <w:t xml:space="preserve">Klik in de kaart op</w:t>
-      </w:r>
-      <w:r>
-        <w:rPr>
-          <w:lang w:val="nl"/>
-        </w:rPr>
-        <w:t xml:space="preserve"> </w:t>
-      </w:r>
-      <w:r>
-        <w:rPr>
-          <w:b/>
-          <w:bCs/>
-          <w:lang w:val="nl"/>
-        </w:rPr>
-        <w:t xml:space="preserve">Verwerkt in de loonadministratie</w:t>
-      </w:r>
-      <w:r>
-        <w:rPr>
-          <w:lang w:val="nl"/>
-        </w:rPr>
-        <w:t xml:space="preserve">. Die knop staat er alleen bij een</w:t>
-      </w:r>
-      <w:r>
-        <w:rPr>
-          <w:lang w:val="nl"/>
-        </w:rPr>
-        <w:t xml:space="preserve"> </w:t>
-      </w:r>
-      <w:r>
-        <w:rPr>
-          <w:lang w:val="nl"/>
-        </w:rPr>
-        <w:t xml:space="preserve">compleet dossier.</w:t>
-      </w:r>
-    </w:p>
-    <w:p>
-      <w:pPr>
-        <w:pStyle w:val="Compact"/>
-        <w:numPr>
-          <w:ilvl w:val="0"/>
-          <w:numId w:val="1012"/>
-        </w:numPr>
-      </w:pPr>
-      <w:r>
-        <w:rPr>
-          <w:lang w:val="nl"/>
-        </w:rPr>
-        <w:t xml:space="preserve">Je krijgt een apart scherm dat uitlegt wat er gebeurt. Klik op</w:t>
-      </w:r>
-      <w:r>
-        <w:rPr>
-          <w:lang w:val="nl"/>
-        </w:rPr>
-        <w:t xml:space="preserve"> </w:t>
-      </w:r>
-      <w:r>
-        <w:rPr>
-          <w:b/>
-          <w:bCs/>
-          <w:lang w:val="nl"/>
-        </w:rPr>
-        <w:t xml:space="preserve">Ja, verwerkt</w:t>
-      </w:r>
-      <w:r>
-        <w:rPr>
-          <w:lang w:val="nl"/>
-        </w:rPr>
-        <w:t xml:space="preserve">.</w:t>
-      </w:r>
-    </w:p>
-    <w:p>
-      <w:pPr>
-        <w:pStyle w:val="FirstParagraph"/>
-      </w:pPr>
-      <w:r>
-        <w:rPr>
-          <w:lang w:val="nl"/>
-        </w:rPr>
-        <w:t xml:space="preserve">Wat er dan gebeurt:</w:t>
       </w:r>
     </w:p>
     <w:p>
@@ -3220,7 +3221,31 @@
         <w:rPr>
           <w:lang w:val="nl"/>
         </w:rPr>
-        <w:t xml:space="preserve">De strandwacht kan de stukken niet meer vervangen of verwijderen.</w:t>
+        <w:t xml:space="preserve">Op foto's (JPG of PNG) van het identiteitsbewijs en de bankpas staat een watermerk: "Kopie voor</w:t>
+      </w:r>
+      <w:r>
+        <w:rPr>
+          <w:lang w:val="nl"/>
+        </w:rPr>
+        <w:t xml:space="preserve"> </w:t>
+      </w:r>
+      <w:r>
+        <w:rPr>
+          <w:lang w:val="nl"/>
+        </w:rPr>
+        <w:t xml:space="preserve">loonadministratie Reddingsbrigade Paal 13", de datum en jouw naam. Het origineel in de kluis</w:t>
+      </w:r>
+      <w:r>
+        <w:rPr>
+          <w:lang w:val="nl"/>
+        </w:rPr>
+        <w:t xml:space="preserve"> </w:t>
+      </w:r>
+      <w:r>
+        <w:rPr>
+          <w:lang w:val="nl"/>
+        </w:rPr>
+        <w:t xml:space="preserve">blijft ongewijzigd. Een kopie die als PDF is geüpload krijgt geen watermerk.</w:t>
       </w:r>
     </w:p>
     <w:p>
@@ -3229,6 +3254,256 @@
         <w:numPr>
           <w:ilvl w:val="0"/>
           <w:numId w:val="1013"/>
+        </w:numPr>
+      </w:pPr>
+      <w:r>
+        <w:rPr>
+          <w:lang w:val="nl"/>
+        </w:rPr>
+        <w:t xml:space="preserve">Elke download wordt vastgelegd (wie, wanneer, welk stuk). Bij het identiteitsbewijs, de bankpas</w:t>
+      </w:r>
+      <w:r>
+        <w:rPr>
+          <w:lang w:val="nl"/>
+        </w:rPr>
+        <w:t xml:space="preserve"> </w:t>
+      </w:r>
+      <w:r>
+        <w:rPr>
+          <w:lang w:val="nl"/>
+        </w:rPr>
+        <w:t xml:space="preserve">en het loonheffingsformulier krijgt het bestuur standaard een mail dat jij iets hebt gedownload,</w:t>
+      </w:r>
+      <w:r>
+        <w:rPr>
+          <w:lang w:val="nl"/>
+        </w:rPr>
+        <w:t xml:space="preserve"> </w:t>
+      </w:r>
+      <w:r>
+        <w:rPr>
+          <w:lang w:val="nl"/>
+        </w:rPr>
+        <w:t xml:space="preserve">met de naam van het document. Dat is normaal en hoort zo.</w:t>
+      </w:r>
+    </w:p>
+    <w:p>
+      <w:pPr>
+        <w:pStyle w:val="Compact"/>
+        <w:numPr>
+          <w:ilvl w:val="0"/>
+          <w:numId w:val="1013"/>
+        </w:numPr>
+      </w:pPr>
+      <w:r>
+        <w:rPr>
+          <w:lang w:val="nl"/>
+        </w:rPr>
+        <w:t xml:space="preserve">Je kunt maximaal 30 stukken per uur downloaden.</w:t>
+      </w:r>
+    </w:p>
+    <w:p>
+      <w:pPr>
+        <w:pStyle w:val="Compact"/>
+        <w:numPr>
+          <w:ilvl w:val="0"/>
+          <w:numId w:val="1013"/>
+        </w:numPr>
+      </w:pPr>
+      <w:r>
+        <w:rPr>
+          <w:lang w:val="nl"/>
+        </w:rPr>
+        <w:t xml:space="preserve">Een downloadlink werkt alleen vanuit het beheer. Een link doorsturen heeft geen zin.</w:t>
+      </w:r>
+    </w:p>
+    <w:p>
+      <w:pPr>
+        <w:pStyle w:val="FirstParagraph"/>
+      </w:pPr>
+      <w:r>
+        <w:rPr>
+          <w:lang w:val="nl"/>
+        </w:rPr>
+        <w:t xml:space="preserve">Zet de stukken direct in de loonadministratie. Verwijder daarna de gedownloade bestanden van je</w:t>
+      </w:r>
+      <w:r>
+        <w:rPr>
+          <w:lang w:val="nl"/>
+        </w:rPr>
+        <w:t xml:space="preserve"> </w:t>
+      </w:r>
+      <w:r>
+        <w:rPr>
+          <w:lang w:val="nl"/>
+        </w:rPr>
+        <w:t xml:space="preserve">computer, ook uit je downloadmap en de prullenbak.</w:t>
+      </w:r>
+    </w:p>
+    <w:bookmarkEnd w:id="15"/>
+    <w:bookmarkStart w:id="16" w:name="een-dossier-verwerken"/>
+    <w:p>
+      <w:pPr>
+        <w:pStyle w:val="Heading1"/>
+      </w:pPr>
+      <w:r>
+        <w:rPr>
+          <w:lang w:val="nl"/>
+        </w:rPr>
+        <w:t xml:space="preserve">Een dossier verwerken</w:t>
+      </w:r>
+    </w:p>
+    <w:p>
+      <w:pPr>
+        <w:pStyle w:val="BlockText"/>
+      </w:pPr>
+      <w:r>
+        <w:rPr>
+          <w:b/>
+          <w:bCs/>
+          <w:lang w:val="nl"/>
+        </w:rPr>
+        <w:t xml:space="preserve">In het kort:</w:t>
+      </w:r>
+      <w:r>
+        <w:rPr>
+          <w:lang w:val="nl"/>
+        </w:rPr>
+        <w:t xml:space="preserve"> </w:t>
+      </w:r>
+      <w:r>
+        <w:rPr>
+          <w:lang w:val="nl"/>
+        </w:rPr>
+        <w:t xml:space="preserve">staan de gegevens in de loonadministratie, klik dan op "Verwerkt in de</w:t>
+      </w:r>
+      <w:r>
+        <w:rPr>
+          <w:lang w:val="nl"/>
+        </w:rPr>
+        <w:t xml:space="preserve"> </w:t>
+      </w:r>
+      <w:r>
+        <w:rPr>
+          <w:lang w:val="nl"/>
+        </w:rPr>
+        <w:t xml:space="preserve">loonadministratie" en bevestig. Dat is niet terug te draaien.</w:t>
+      </w:r>
+    </w:p>
+    <w:p>
+      <w:pPr>
+        <w:pStyle w:val="Compact"/>
+        <w:numPr>
+          <w:ilvl w:val="0"/>
+          <w:numId w:val="1014"/>
+        </w:numPr>
+      </w:pPr>
+      <w:r>
+        <w:rPr>
+          <w:lang w:val="nl"/>
+        </w:rPr>
+        <w:t xml:space="preserve">Klik in de kaart op</w:t>
+      </w:r>
+      <w:r>
+        <w:rPr>
+          <w:lang w:val="nl"/>
+        </w:rPr>
+        <w:t xml:space="preserve"> </w:t>
+      </w:r>
+      <w:r>
+        <w:rPr>
+          <w:b/>
+          <w:bCs/>
+          <w:lang w:val="nl"/>
+        </w:rPr>
+        <w:t xml:space="preserve">Verwerkt in de loonadministratie</w:t>
+      </w:r>
+      <w:r>
+        <w:rPr>
+          <w:lang w:val="nl"/>
+        </w:rPr>
+        <w:t xml:space="preserve">. Die knop staat er alleen bij een</w:t>
+      </w:r>
+      <w:r>
+        <w:rPr>
+          <w:lang w:val="nl"/>
+        </w:rPr>
+        <w:t xml:space="preserve"> </w:t>
+      </w:r>
+      <w:r>
+        <w:rPr>
+          <w:lang w:val="nl"/>
+        </w:rPr>
+        <w:t xml:space="preserve">compleet dossier.</w:t>
+      </w:r>
+    </w:p>
+    <w:p>
+      <w:pPr>
+        <w:pStyle w:val="Compact"/>
+        <w:numPr>
+          <w:ilvl w:val="0"/>
+          <w:numId w:val="1014"/>
+        </w:numPr>
+      </w:pPr>
+      <w:r>
+        <w:rPr>
+          <w:lang w:val="nl"/>
+        </w:rPr>
+        <w:t xml:space="preserve">Je krijgt een apart scherm dat uitlegt wat er gebeurt. Klik op</w:t>
+      </w:r>
+      <w:r>
+        <w:rPr>
+          <w:lang w:val="nl"/>
+        </w:rPr>
+        <w:t xml:space="preserve"> </w:t>
+      </w:r>
+      <w:r>
+        <w:rPr>
+          <w:b/>
+          <w:bCs/>
+          <w:lang w:val="nl"/>
+        </w:rPr>
+        <w:t xml:space="preserve">Ja, verwerkt</w:t>
+      </w:r>
+      <w:r>
+        <w:rPr>
+          <w:lang w:val="nl"/>
+        </w:rPr>
+        <w:t xml:space="preserve">.</w:t>
+      </w:r>
+    </w:p>
+    <w:p>
+      <w:pPr>
+        <w:pStyle w:val="FirstParagraph"/>
+      </w:pPr>
+      <w:r>
+        <w:rPr>
+          <w:lang w:val="nl"/>
+        </w:rPr>
+        <w:t xml:space="preserve">Wat er dan gebeurt:</w:t>
+      </w:r>
+    </w:p>
+    <w:p>
+      <w:pPr>
+        <w:pStyle w:val="Compact"/>
+        <w:numPr>
+          <w:ilvl w:val="0"/>
+          <w:numId w:val="1015"/>
+        </w:numPr>
+      </w:pPr>
+      <w:r>
+        <w:rPr>
+          <w:lang w:val="nl"/>
+        </w:rPr>
+        <w:t xml:space="preserve">De strandwacht kan de stukken niet meer vervangen of verwijderen.</w:t>
+      </w:r>
+    </w:p>
+    <w:p>
+      <w:pPr>
+        <w:pStyle w:val="Compact"/>
+        <w:numPr>
+          <w:ilvl w:val="0"/>
+          <w:numId w:val="1015"/>
         </w:numPr>
       </w:pPr>
       <w:r>
@@ -3288,7 +3563,7 @@
         <w:pStyle w:val="Compact"/>
         <w:numPr>
           <w:ilvl w:val="0"/>
-          <w:numId w:val="1013"/>
+          <w:numId w:val="1015"/>
         </w:numPr>
       </w:pPr>
       <w:r>
@@ -3336,26 +3611,98 @@
         <w:pStyle w:val="Compact"/>
         <w:numPr>
           <w:ilvl w:val="0"/>
-          <w:numId w:val="1013"/>
+          <w:numId w:val="1015"/>
         </w:numPr>
       </w:pPr>
       <w:r>
         <w:rPr>
           <w:lang w:val="nl"/>
         </w:rPr>
-        <w:t xml:space="preserve">De strandwacht kan het account niet meer zelf verwijderen, omdat de wettelijke bewaarplicht</w:t>
-      </w:r>
-      <w:r>
-        <w:rPr>
-          <w:lang w:val="nl"/>
-        </w:rPr>
-        <w:t xml:space="preserve"> </w:t>
-      </w:r>
-      <w:r>
-        <w:rPr>
-          <w:lang w:val="nl"/>
-        </w:rPr>
-        <w:t xml:space="preserve">voorgaat. Het portaal legt dat uit.</w:t>
+        <w:t xml:space="preserve">Verwijdert de strandwacht daarna zelf het account, dan blijft het loondossier staan omdat de</w:t>
+      </w:r>
+      <w:r>
+        <w:rPr>
+          <w:lang w:val="nl"/>
+        </w:rPr>
+        <w:t xml:space="preserve"> </w:t>
+      </w:r>
+      <w:r>
+        <w:rPr>
+          <w:lang w:val="nl"/>
+        </w:rPr>
+        <w:t xml:space="preserve">wettelijke bewaarplicht voorgaat: het loonheffingsformulier, de kopie ID, de naam en de</w:t>
+      </w:r>
+      <w:r>
+        <w:rPr>
+          <w:lang w:val="nl"/>
+        </w:rPr>
+        <w:t xml:space="preserve"> </w:t>
+      </w:r>
+      <w:r>
+        <w:rPr>
+          <w:lang w:val="nl"/>
+        </w:rPr>
+        <w:t xml:space="preserve">geboortedatum. Al het andere verdwijnt. Het portaal legt dat vooraf uit. In het overzicht van het</w:t>
+      </w:r>
+      <w:r>
+        <w:rPr>
+          <w:lang w:val="nl"/>
+        </w:rPr>
+        <w:t xml:space="preserve"> </w:t>
+      </w:r>
+      <w:r>
+        <w:rPr>
+          <w:lang w:val="nl"/>
+        </w:rPr>
+        <w:t xml:space="preserve">seizoen staat de persoon dan niet meer, maar na de bewaarplicht verschijnt die gewoon in</w:t>
+      </w:r>
+      <w:r>
+        <w:rPr>
+          <w:lang w:val="nl"/>
+        </w:rPr>
+        <w:t xml:space="preserve"> </w:t>
+      </w:r>
+      <w:r>
+        <w:rPr>
+          <w:b/>
+          <w:bCs/>
+          <w:lang w:val="nl"/>
+        </w:rPr>
+        <w:t xml:space="preserve">Te</w:t>
+      </w:r>
+      <w:r>
+        <w:rPr>
+          <w:b/>
+          <w:bCs/>
+          <w:lang w:val="nl"/>
+        </w:rPr>
+        <w:t xml:space="preserve"> </w:t>
+      </w:r>
+      <w:r>
+        <w:rPr>
+          <w:b/>
+          <w:bCs/>
+          <w:lang w:val="nl"/>
+        </w:rPr>
+        <w:t xml:space="preserve">beoordelen voor vernietiging</w:t>
+      </w:r>
+      <w:r>
+        <w:rPr>
+          <w:lang w:val="nl"/>
+        </w:rPr>
+        <w:t xml:space="preserve">. Vernietig je het loondossier, dan verdwijnen ook naam en</w:t>
+      </w:r>
+      <w:r>
+        <w:rPr>
+          <w:lang w:val="nl"/>
+        </w:rPr>
+        <w:t xml:space="preserve"> </w:t>
+      </w:r>
+      <w:r>
+        <w:rPr>
+          <w:lang w:val="nl"/>
+        </w:rPr>
+        <w:t xml:space="preserve">geboortedatum.</w:t>
       </w:r>
     </w:p>
     <w:p>
@@ -4067,7 +4414,7 @@
         <w:pStyle w:val="Compact"/>
         <w:numPr>
           <w:ilvl w:val="0"/>
-          <w:numId w:val="1014"/>
+          <w:numId w:val="1016"/>
         </w:numPr>
       </w:pPr>
       <w:r>
@@ -4094,7 +4441,7 @@
         <w:pStyle w:val="Compact"/>
         <w:numPr>
           <w:ilvl w:val="0"/>
-          <w:numId w:val="1014"/>
+          <w:numId w:val="1016"/>
         </w:numPr>
       </w:pPr>
       <w:r>
@@ -4135,7 +4482,7 @@
         <w:pStyle w:val="Compact"/>
         <w:numPr>
           <w:ilvl w:val="0"/>
-          <w:numId w:val="1014"/>
+          <w:numId w:val="1016"/>
         </w:numPr>
       </w:pPr>
       <w:r>
@@ -4197,7 +4544,7 @@
         <w:pStyle w:val="Compact"/>
         <w:numPr>
           <w:ilvl w:val="0"/>
-          <w:numId w:val="1015"/>
+          <w:numId w:val="1017"/>
         </w:numPr>
       </w:pPr>
       <w:r>
@@ -4224,7 +4571,7 @@
         <w:pStyle w:val="Compact"/>
         <w:numPr>
           <w:ilvl w:val="0"/>
-          <w:numId w:val="1015"/>
+          <w:numId w:val="1017"/>
         </w:numPr>
       </w:pPr>
       <w:r>
@@ -4251,7 +4598,7 @@
         <w:pStyle w:val="Compact"/>
         <w:numPr>
           <w:ilvl w:val="0"/>
-          <w:numId w:val="1015"/>
+          <w:numId w:val="1017"/>
         </w:numPr>
       </w:pPr>
       <w:r>
@@ -4266,7 +4613,7 @@
         <w:pStyle w:val="Compact"/>
         <w:numPr>
           <w:ilvl w:val="0"/>
-          <w:numId w:val="1015"/>
+          <w:numId w:val="1017"/>
         </w:numPr>
       </w:pPr>
       <w:r>
@@ -4353,19 +4700,52 @@
         <w:rPr>
           <w:lang w:val="nl"/>
         </w:rPr>
-        <w:t xml:space="preserve">verwijderen in het portaal; de stukken worden dan meteen vernietigd. Is het dossier al verwerkt en</w:t>
-      </w:r>
-      <w:r>
-        <w:rPr>
-          <w:lang w:val="nl"/>
-        </w:rPr>
-        <w:t xml:space="preserve"> </w:t>
-      </w:r>
-      <w:r>
-        <w:rPr>
-          <w:lang w:val="nl"/>
-        </w:rPr>
-        <w:t xml:space="preserve">gaat het dienstverband toch niet door, dan kan alleen iemand met zowel het recht om sollicitanten</w:t>
+        <w:t xml:space="preserve">verwijderen in het portaal; de stukken worden dan meteen vernietigd. Na het verwerken kan dat ook,</w:t>
+      </w:r>
+      <w:r>
+        <w:rPr>
+          <w:lang w:val="nl"/>
+        </w:rPr>
+        <w:t xml:space="preserve"> </w:t>
+      </w:r>
+      <w:r>
+        <w:rPr>
+          <w:lang w:val="nl"/>
+        </w:rPr>
+        <w:t xml:space="preserve">maar dan blijft het loondossier staan (zie</w:t>
+      </w:r>
+      <w:r>
+        <w:rPr>
+          <w:lang w:val="nl"/>
+        </w:rPr>
+        <w:t xml:space="preserve"> </w:t>
+      </w:r>
+      <w:hyperlink w:anchor="een-dossier-verwerken">
+        <w:r>
+          <w:rPr>
+            <w:rStyle w:val="Hyperlink"/>
+            <w:lang w:val="nl"/>
+          </w:rPr>
+          <w:t xml:space="preserve">Een dossier verwerken</w:t>
+        </w:r>
+      </w:hyperlink>
+      <w:r>
+        <w:rPr>
+          <w:lang w:val="nl"/>
+        </w:rPr>
+        <w:t xml:space="preserve">). Is</w:t>
+      </w:r>
+      <w:r>
+        <w:rPr>
+          <w:lang w:val="nl"/>
+        </w:rPr>
+        <w:t xml:space="preserve"> </w:t>
+      </w:r>
+      <w:r>
+        <w:rPr>
+          <w:lang w:val="nl"/>
+        </w:rPr>
+        <w:t xml:space="preserve">het dossier al verwerkt en gaat het dienstverband toch niet door, dan kan alleen iemand met zowel het recht om sollicitanten</w:t>
       </w:r>
       <w:r>
         <w:rPr>
@@ -4406,7 +4786,7 @@
     </w:p>
     <w:bookmarkEnd w:id="19"/>
     <w:bookmarkEnd w:id="20"/>
-    <w:bookmarkStart w:id="21" w:name="wat-je-nooit-doet"/>
+    <w:bookmarkStart w:id="21" w:name="loonplanning"/>
     <w:p>
       <w:pPr>
         <w:pStyle w:val="Heading1"/>
@@ -4415,7 +4795,55 @@
         <w:rPr>
           <w:lang w:val="nl"/>
         </w:rPr>
-        <w:t xml:space="preserve">Wat je nooit doet</w:t>
+        <w:t xml:space="preserve">Loonplanning</w:t>
+      </w:r>
+    </w:p>
+    <w:p>
+      <w:pPr>
+        <w:pStyle w:val="FirstParagraph"/>
+      </w:pPr>
+      <w:r>
+        <w:rPr>
+          <w:b/>
+          <w:bCs/>
+          <w:lang w:val="nl"/>
+        </w:rPr>
+        <w:t xml:space="preserve">Waar:</w:t>
+      </w:r>
+      <w:r>
+        <w:rPr>
+          <w:lang w:val="nl"/>
+        </w:rPr>
+        <w:t xml:space="preserve"> </w:t>
+      </w:r>
+      <w:r>
+        <w:rPr>
+          <w:lang w:val="nl"/>
+        </w:rPr>
+        <w:t xml:space="preserve">Beheer › Loonplanning (in de menugroep Inzet &amp; loon)</w:t>
+      </w:r>
+      <w:r>
+        <w:br/>
+      </w:r>
+      <w:r>
+        <w:rPr>
+          <w:b/>
+          <w:bCs/>
+          <w:lang w:val="nl"/>
+        </w:rPr>
+        <w:t xml:space="preserve">Wie:</w:t>
+      </w:r>
+      <w:r>
+        <w:rPr>
+          <w:lang w:val="nl"/>
+        </w:rPr>
+        <w:t xml:space="preserve"> </w:t>
+      </w:r>
+      <w:r>
+        <w:rPr>
+          <w:lang w:val="nl"/>
+        </w:rPr>
+        <w:t xml:space="preserve">penningmeester, bestuur en admin. Jij mag de planning bekijken en bewerken.</w:t>
       </w:r>
     </w:p>
     <w:p>
@@ -4440,19 +4868,282 @@
         <w:rPr>
           <w:lang w:val="nl"/>
         </w:rPr>
-        <w:t xml:space="preserve">stukken blijven in het beheer en in de loonadministratie. Niet mailen, niet</w:t>
-      </w:r>
-      <w:r>
-        <w:rPr>
-          <w:lang w:val="nl"/>
-        </w:rPr>
-        <w:t xml:space="preserve"> </w:t>
-      </w:r>
-      <w:r>
-        <w:rPr>
-          <w:lang w:val="nl"/>
-        </w:rPr>
-        <w:t xml:space="preserve">kopiëren, niet delen.</w:t>
+        <w:t xml:space="preserve">de loonplanning laat per persoon en per week zien wie er wordt ingezet en wat</w:t>
+      </w:r>
+      <w:r>
+        <w:rPr>
+          <w:lang w:val="nl"/>
+        </w:rPr>
+        <w:t xml:space="preserve"> </w:t>
+      </w:r>
+      <w:r>
+        <w:rPr>
+          <w:lang w:val="nl"/>
+        </w:rPr>
+        <w:t xml:space="preserve">dat kost, in één of meer scenario's. Jij gebruikt hem om de loonkosten tegen het budget te</w:t>
+      </w:r>
+      <w:r>
+        <w:rPr>
+          <w:lang w:val="nl"/>
+        </w:rPr>
+        <w:t xml:space="preserve"> </w:t>
+      </w:r>
+      <w:r>
+        <w:rPr>
+          <w:lang w:val="nl"/>
+        </w:rPr>
+        <w:t xml:space="preserve">houden en als tussenstand voor de begroting. Het budget en de lonen zelf stelt het bestuur in.</w:t>
+      </w:r>
+    </w:p>
+    <w:p>
+      <w:pPr>
+        <w:pStyle w:val="FirstParagraph"/>
+      </w:pPr>
+      <w:r>
+        <w:rPr>
+          <w:lang w:val="nl"/>
+        </w:rPr>
+        <w:t xml:space="preserve">Het bestuur maakt meestal de planning; jij kijkt vooral naar de kosten. Je kunt ook zelf dagen</w:t>
+      </w:r>
+      <w:r>
+        <w:rPr>
+          <w:lang w:val="nl"/>
+        </w:rPr>
+        <w:t xml:space="preserve"> </w:t>
+      </w:r>
+      <w:r>
+        <w:rPr>
+          <w:lang w:val="nl"/>
+        </w:rPr>
+        <w:t xml:space="preserve">aanpassen of een scenario maken. Elke wijziging wordt meteen opgeslagen en het bestuur ziet hem</w:t>
+      </w:r>
+      <w:r>
+        <w:rPr>
+          <w:lang w:val="nl"/>
+        </w:rPr>
+        <w:t xml:space="preserve"> </w:t>
+      </w:r>
+      <w:r>
+        <w:rPr>
+          <w:lang w:val="nl"/>
+        </w:rPr>
+        <w:t xml:space="preserve">ook. Stem dus af voordat je iets in de actieve planning verandert.</w:t>
+      </w:r>
+    </w:p>
+    <w:p>
+      <w:pPr>
+        <w:pStyle w:val="BodyText"/>
+      </w:pPr>
+      <w:r>
+        <w:rPr>
+          <w:b/>
+          <w:bCs/>
+          <w:lang w:val="nl"/>
+        </w:rPr>
+        <w:t xml:space="preserve">Scenario's.</w:t>
+      </w:r>
+      <w:r>
+        <w:rPr>
+          <w:lang w:val="nl"/>
+        </w:rPr>
+        <w:t xml:space="preserve"> </w:t>
+      </w:r>
+      <w:r>
+        <w:rPr>
+          <w:lang w:val="nl"/>
+        </w:rPr>
+        <w:t xml:space="preserve">Bovenaan staan de scenario's. De ster met het woord</w:t>
+      </w:r>
+      <w:r>
+        <w:rPr>
+          <w:lang w:val="nl"/>
+        </w:rPr>
+        <w:t xml:space="preserve"> </w:t>
+      </w:r>
+      <w:r>
+        <w:rPr>
+          <w:b/>
+          <w:bCs/>
+          <w:lang w:val="nl"/>
+        </w:rPr>
+        <w:t xml:space="preserve">Actief</w:t>
+      </w:r>
+      <w:r>
+        <w:rPr>
+          <w:lang w:val="nl"/>
+        </w:rPr>
+        <w:t xml:space="preserve"> </w:t>
+      </w:r>
+      <w:r>
+        <w:rPr>
+          <w:lang w:val="nl"/>
+        </w:rPr>
+        <w:t xml:space="preserve">wijst de planning</w:t>
+      </w:r>
+      <w:r>
+        <w:rPr>
+          <w:lang w:val="nl"/>
+        </w:rPr>
+        <w:t xml:space="preserve"> </w:t>
+      </w:r>
+      <w:r>
+        <w:rPr>
+          <w:lang w:val="nl"/>
+        </w:rPr>
+        <w:t xml:space="preserve">aan die geldt. Wil je een alternatief doorrekenen, bijvoorbeeld "wat als we in juni twee mensen</w:t>
+      </w:r>
+      <w:r>
+        <w:rPr>
+          <w:lang w:val="nl"/>
+        </w:rPr>
+        <w:t xml:space="preserve"> </w:t>
+      </w:r>
+      <w:r>
+        <w:rPr>
+          <w:lang w:val="nl"/>
+        </w:rPr>
+        <w:t xml:space="preserve">minder inzetten?", klik dan op</w:t>
+      </w:r>
+      <w:r>
+        <w:rPr>
+          <w:lang w:val="nl"/>
+        </w:rPr>
+        <w:t xml:space="preserve"> </w:t>
+      </w:r>
+      <w:r>
+        <w:rPr>
+          <w:b/>
+          <w:bCs/>
+          <w:lang w:val="nl"/>
+        </w:rPr>
+        <w:t xml:space="preserve">+ Dupliceren</w:t>
+      </w:r>
+      <w:r>
+        <w:rPr>
+          <w:lang w:val="nl"/>
+        </w:rPr>
+        <w:t xml:space="preserve">, geef het scenario een naam en klik op</w:t>
+      </w:r>
+      <w:r>
+        <w:rPr>
+          <w:lang w:val="nl"/>
+        </w:rPr>
+        <w:t xml:space="preserve"> </w:t>
+      </w:r>
+      <w:r>
+        <w:rPr>
+          <w:b/>
+          <w:bCs/>
+          <w:lang w:val="nl"/>
+        </w:rPr>
+        <w:t xml:space="preserve">Dupliceren</w:t>
+      </w:r>
+      <w:r>
+        <w:rPr>
+          <w:lang w:val="nl"/>
+        </w:rPr>
+        <w:t xml:space="preserve">. Je werkt dan in een kopie; de actieve planning blijft zoals hij was. Bij een</w:t>
+      </w:r>
+      <w:r>
+        <w:rPr>
+          <w:lang w:val="nl"/>
+        </w:rPr>
+        <w:t xml:space="preserve"> </w:t>
+      </w:r>
+      <w:r>
+        <w:rPr>
+          <w:lang w:val="nl"/>
+        </w:rPr>
+        <w:t xml:space="preserve">scenario dat niet actief is staan</w:t>
+      </w:r>
+      <w:r>
+        <w:rPr>
+          <w:lang w:val="nl"/>
+        </w:rPr>
+        <w:t xml:space="preserve"> </w:t>
+      </w:r>
+      <w:r>
+        <w:rPr>
+          <w:b/>
+          <w:bCs/>
+          <w:lang w:val="nl"/>
+        </w:rPr>
+        <w:t xml:space="preserve">Maak actief</w:t>
+      </w:r>
+      <w:r>
+        <w:rPr>
+          <w:lang w:val="nl"/>
+        </w:rPr>
+        <w:t xml:space="preserve"> </w:t>
+      </w:r>
+      <w:r>
+        <w:rPr>
+          <w:lang w:val="nl"/>
+        </w:rPr>
+        <w:t xml:space="preserve">en</w:t>
+      </w:r>
+      <w:r>
+        <w:rPr>
+          <w:lang w:val="nl"/>
+        </w:rPr>
+        <w:t xml:space="preserve"> </w:t>
+      </w:r>
+      <w:r>
+        <w:rPr>
+          <w:b/>
+          <w:bCs/>
+          <w:lang w:val="nl"/>
+        </w:rPr>
+        <w:t xml:space="preserve">Verwijderen</w:t>
+      </w:r>
+      <w:r>
+        <w:rPr>
+          <w:lang w:val="nl"/>
+        </w:rPr>
+        <w:t xml:space="preserve"> </w:t>
+      </w:r>
+      <w:r>
+        <w:rPr>
+          <w:lang w:val="nl"/>
+        </w:rPr>
+        <w:t xml:space="preserve">(met bevestiging). Maak een</w:t>
+      </w:r>
+      <w:r>
+        <w:rPr>
+          <w:lang w:val="nl"/>
+        </w:rPr>
+        <w:t xml:space="preserve"> </w:t>
+      </w:r>
+      <w:r>
+        <w:rPr>
+          <w:lang w:val="nl"/>
+        </w:rPr>
+        <w:t xml:space="preserve">scenario alleen actief als het bestuur dat heeft besloten.</w:t>
+      </w:r>
+    </w:p>
+    <w:p>
+      <w:pPr>
+        <w:pStyle w:val="BodyText"/>
+      </w:pPr>
+      <w:r>
+        <w:rPr>
+          <w:b/>
+          <w:bCs/>
+          <w:lang w:val="nl"/>
+        </w:rPr>
+        <w:t xml:space="preserve">Kosten per persoon en per week.</w:t>
+      </w:r>
+      <w:r>
+        <w:rPr>
+          <w:lang w:val="nl"/>
+        </w:rPr>
+        <w:t xml:space="preserve"> </w:t>
+      </w:r>
+      <w:r>
+        <w:rPr>
+          <w:lang w:val="nl"/>
+        </w:rPr>
+        <w:t xml:space="preserve">In de tabel staat per persoon een rij en per week een kolom:</w:t>
       </w:r>
     </w:p>
     <w:p>
@@ -4460,14 +5151,26 @@
         <w:pStyle w:val="Compact"/>
         <w:numPr>
           <w:ilvl w:val="0"/>
-          <w:numId w:val="1016"/>
+          <w:numId w:val="1018"/>
         </w:numPr>
       </w:pPr>
       <w:r>
         <w:rPr>
           <w:lang w:val="nl"/>
         </w:rPr>
-        <w:t xml:space="preserve">Stukken per e-mail of WhatsApp doorsturen, ook niet naar jezelf. Gebruik het beheer.</w:t>
+        <w:t xml:space="preserve">met een vinkje neem je iemand die week op; het systeem vult dan vijf dagen in, en dat aantal</w:t>
+      </w:r>
+      <w:r>
+        <w:rPr>
+          <w:lang w:val="nl"/>
+        </w:rPr>
+        <w:t xml:space="preserve"> </w:t>
+      </w:r>
+      <w:r>
+        <w:rPr>
+          <w:lang w:val="nl"/>
+        </w:rPr>
+        <w:t xml:space="preserve">kun je aanpassen. Een "–" betekent dat de persoon die week niet beschikbaar is;</w:t>
       </w:r>
     </w:p>
     <w:p>
@@ -4475,26 +5178,26 @@
         <w:pStyle w:val="Compact"/>
         <w:numPr>
           <w:ilvl w:val="0"/>
-          <w:numId w:val="1016"/>
+          <w:numId w:val="1018"/>
         </w:numPr>
       </w:pPr>
       <w:r>
         <w:rPr>
           <w:lang w:val="nl"/>
         </w:rPr>
-        <w:t xml:space="preserve">Een BSN of rekeningnummer in een spreadsheet, notitie of chat zetten buiten de</w:t>
-      </w:r>
-      <w:r>
-        <w:rPr>
-          <w:lang w:val="nl"/>
-        </w:rPr>
-        <w:t xml:space="preserve"> </w:t>
-      </w:r>
-      <w:r>
-        <w:rPr>
-          <w:lang w:val="nl"/>
-        </w:rPr>
-        <w:t xml:space="preserve">loonadministratie.</w:t>
+        <w:t xml:space="preserve">in elke cel staan de kosten van die week, rechts in de rij de totale kosten en dagen van die</w:t>
+      </w:r>
+      <w:r>
+        <w:rPr>
+          <w:lang w:val="nl"/>
+        </w:rPr>
+        <w:t xml:space="preserve"> </w:t>
+      </w:r>
+      <w:r>
+        <w:rPr>
+          <w:lang w:val="nl"/>
+        </w:rPr>
+        <w:t xml:space="preserve">persoon;</w:t>
       </w:r>
     </w:p>
     <w:p>
@@ -4502,14 +5205,40 @@
         <w:pStyle w:val="Compact"/>
         <w:numPr>
           <w:ilvl w:val="0"/>
-          <w:numId w:val="1016"/>
+          <w:numId w:val="1018"/>
         </w:numPr>
       </w:pPr>
       <w:r>
         <w:rPr>
           <w:lang w:val="nl"/>
         </w:rPr>
-        <w:t xml:space="preserve">Je inlog delen. Elke download staat op jouw naam.</w:t>
+        <w:t xml:space="preserve">de</w:t>
+      </w:r>
+      <w:r>
+        <w:rPr>
+          <w:lang w:val="nl"/>
+        </w:rPr>
+        <w:t xml:space="preserve"> </w:t>
+      </w:r>
+      <w:r>
+        <w:rPr>
+          <w:b/>
+          <w:bCs/>
+          <w:lang w:val="nl"/>
+        </w:rPr>
+        <w:t xml:space="preserve">Functie</w:t>
+      </w:r>
+      <w:r>
+        <w:rPr>
+          <w:lang w:val="nl"/>
+        </w:rPr>
+        <w:t xml:space="preserve"> </w:t>
+      </w:r>
+      <w:r>
+        <w:rPr>
+          <w:lang w:val="nl"/>
+        </w:rPr>
+        <w:t xml:space="preserve">per persoon (keuzelijst) bepaalt mee het dagloon;</w:t>
       </w:r>
     </w:p>
     <w:p>
@@ -4517,14 +5246,445 @@
         <w:pStyle w:val="Compact"/>
         <w:numPr>
           <w:ilvl w:val="0"/>
-          <w:numId w:val="1016"/>
+          <w:numId w:val="1018"/>
         </w:numPr>
       </w:pPr>
       <w:r>
         <w:rPr>
           <w:lang w:val="nl"/>
         </w:rPr>
-        <w:t xml:space="preserve">Screenshots maken van kopieën van identiteitsbewijzen.</w:t>
+        <w:t xml:space="preserve">de onderste rijen tonen de dekking per week en de regel</w:t>
+      </w:r>
+      <w:r>
+        <w:rPr>
+          <w:lang w:val="nl"/>
+        </w:rPr>
+        <w:t xml:space="preserve"> </w:t>
+      </w:r>
+      <w:r>
+        <w:rPr>
+          <w:b/>
+          <w:bCs/>
+          <w:lang w:val="nl"/>
+        </w:rPr>
+        <w:t xml:space="preserve">Kosten p/w</w:t>
+      </w:r>
+      <w:r>
+        <w:rPr>
+          <w:lang w:val="nl"/>
+        </w:rPr>
+        <w:t xml:space="preserve">: de loonkosten van die</w:t>
+      </w:r>
+      <w:r>
+        <w:rPr>
+          <w:lang w:val="nl"/>
+        </w:rPr>
+        <w:t xml:space="preserve"> </w:t>
+      </w:r>
+      <w:r>
+        <w:rPr>
+          <w:lang w:val="nl"/>
+        </w:rPr>
+        <w:t xml:space="preserve">week voor iedereen samen.</w:t>
+      </w:r>
+    </w:p>
+    <w:p>
+      <w:pPr>
+        <w:pStyle w:val="FirstParagraph"/>
+      </w:pPr>
+      <w:r>
+        <w:rPr>
+          <w:lang w:val="nl"/>
+        </w:rPr>
+        <w:t xml:space="preserve">Het dagloon hangt af van de leeftijd, de functie en de maand (juni heeft andere lonen dan juli</w:t>
+      </w:r>
+      <w:r>
+        <w:rPr>
+          <w:lang w:val="nl"/>
+        </w:rPr>
+        <w:t xml:space="preserve"> </w:t>
+      </w:r>
+      <w:r>
+        <w:rPr>
+          <w:lang w:val="nl"/>
+        </w:rPr>
+        <w:t xml:space="preserve">tot en met september). Klap</w:t>
+      </w:r>
+      <w:r>
+        <w:rPr>
+          <w:lang w:val="nl"/>
+        </w:rPr>
+        <w:t xml:space="preserve"> </w:t>
+      </w:r>
+      <w:r>
+        <w:rPr>
+          <w:b/>
+          <w:bCs/>
+          <w:lang w:val="nl"/>
+        </w:rPr>
+        <w:t xml:space="preserve">Loontabel (dagloon per leeftijd &amp; functie)</w:t>
+      </w:r>
+      <w:r>
+        <w:rPr>
+          <w:lang w:val="nl"/>
+        </w:rPr>
+        <w:t xml:space="preserve"> </w:t>
+      </w:r>
+      <w:r>
+        <w:rPr>
+          <w:lang w:val="nl"/>
+        </w:rPr>
+        <w:t xml:space="preserve">open om te zien welk</w:t>
+      </w:r>
+      <w:r>
+        <w:rPr>
+          <w:lang w:val="nl"/>
+        </w:rPr>
+        <w:t xml:space="preserve"> </w:t>
+      </w:r>
+      <w:r>
+        <w:rPr>
+          <w:lang w:val="nl"/>
+        </w:rPr>
+        <w:t xml:space="preserve">dagloon het systeem gebruikt. Boven de tabel staan eventueel</w:t>
+      </w:r>
+      <w:r>
+        <w:rPr>
+          <w:lang w:val="nl"/>
+        </w:rPr>
+        <w:t xml:space="preserve"> </w:t>
+      </w:r>
+      <w:r>
+        <w:rPr>
+          <w:b/>
+          <w:bCs/>
+          <w:lang w:val="nl"/>
+        </w:rPr>
+        <w:t xml:space="preserve">Signalen</w:t>
+      </w:r>
+      <w:r>
+        <w:rPr>
+          <w:lang w:val="nl"/>
+        </w:rPr>
+        <w:t xml:space="preserve">, bijvoorbeeld iemand</w:t>
+      </w:r>
+      <w:r>
+        <w:rPr>
+          <w:lang w:val="nl"/>
+        </w:rPr>
+        <w:t xml:space="preserve"> </w:t>
+      </w:r>
+      <w:r>
+        <w:rPr>
+          <w:lang w:val="nl"/>
+        </w:rPr>
+        <w:t xml:space="preserve">die meer dagen staat ingepland dan die kan. Dat zijn aandachtspunten, geen blokkades.</w:t>
+      </w:r>
+    </w:p>
+    <w:p>
+      <w:pPr>
+        <w:pStyle w:val="BodyText"/>
+      </w:pPr>
+      <w:r>
+        <w:rPr>
+          <w:b/>
+          <w:bCs/>
+          <w:lang w:val="nl"/>
+        </w:rPr>
+        <w:t xml:space="preserve">Budget.</w:t>
+      </w:r>
+      <w:r>
+        <w:rPr>
+          <w:lang w:val="nl"/>
+        </w:rPr>
+        <w:t xml:space="preserve"> </w:t>
+      </w:r>
+      <w:r>
+        <w:rPr>
+          <w:lang w:val="nl"/>
+        </w:rPr>
+        <w:t xml:space="preserve">Onderaan staan de</w:t>
+      </w:r>
+      <w:r>
+        <w:rPr>
+          <w:lang w:val="nl"/>
+        </w:rPr>
+        <w:t xml:space="preserve"> </w:t>
+      </w:r>
+      <w:r>
+        <w:rPr>
+          <w:b/>
+          <w:bCs/>
+          <w:lang w:val="nl"/>
+        </w:rPr>
+        <w:t xml:space="preserve">Totale loonkosten</w:t>
+      </w:r>
+      <w:r>
+        <w:rPr>
+          <w:lang w:val="nl"/>
+        </w:rPr>
+        <w:t xml:space="preserve"> </w:t>
+      </w:r>
+      <w:r>
+        <w:rPr>
+          <w:lang w:val="nl"/>
+        </w:rPr>
+        <w:t xml:space="preserve">en de mandagen. Is er een budget ingesteld, dan</w:t>
+      </w:r>
+      <w:r>
+        <w:rPr>
+          <w:lang w:val="nl"/>
+        </w:rPr>
+        <w:t xml:space="preserve"> </w:t>
+      </w:r>
+      <w:r>
+        <w:rPr>
+          <w:lang w:val="nl"/>
+        </w:rPr>
+        <w:t xml:space="preserve">zie je een balk met</w:t>
+      </w:r>
+      <w:r>
+        <w:rPr>
+          <w:lang w:val="nl"/>
+        </w:rPr>
+        <w:t xml:space="preserve"> </w:t>
+      </w:r>
+      <w:r>
+        <w:rPr>
+          <w:b/>
+          <w:bCs/>
+          <w:lang w:val="nl"/>
+        </w:rPr>
+        <w:t xml:space="preserve">Restant</w:t>
+      </w:r>
+      <w:r>
+        <w:rPr>
+          <w:lang w:val="nl"/>
+        </w:rPr>
+        <w:t xml:space="preserve"> </w:t>
+      </w:r>
+      <w:r>
+        <w:rPr>
+          <w:lang w:val="nl"/>
+        </w:rPr>
+        <w:t xml:space="preserve">of</w:t>
+      </w:r>
+      <w:r>
+        <w:rPr>
+          <w:lang w:val="nl"/>
+        </w:rPr>
+        <w:t xml:space="preserve"> </w:t>
+      </w:r>
+      <w:r>
+        <w:rPr>
+          <w:b/>
+          <w:bCs/>
+          <w:lang w:val="nl"/>
+        </w:rPr>
+        <w:t xml:space="preserve">Over budget</w:t>
+      </w:r>
+      <w:r>
+        <w:rPr>
+          <w:lang w:val="nl"/>
+        </w:rPr>
+        <w:t xml:space="preserve">. Staat er "Geen budget ingesteld", dan moet het</w:t>
+      </w:r>
+      <w:r>
+        <w:rPr>
+          <w:lang w:val="nl"/>
+        </w:rPr>
+        <w:t xml:space="preserve"> </w:t>
+      </w:r>
+      <w:r>
+        <w:rPr>
+          <w:lang w:val="nl"/>
+        </w:rPr>
+        <w:t xml:space="preserve">bestuur het budget nog invullen bij Instellingen › Lonen &amp; budget. Daar staan ook de minimumuurlonen</w:t>
+      </w:r>
+      <w:r>
+        <w:rPr>
+          <w:lang w:val="nl"/>
+        </w:rPr>
+        <w:t xml:space="preserve"> </w:t>
+      </w:r>
+      <w:r>
+        <w:rPr>
+          <w:lang w:val="nl"/>
+        </w:rPr>
+        <w:t xml:space="preserve">per leeftijd, het vakantietoeslagpercentage en de werkuren per dag. Die instellingen kun jij niet</w:t>
+      </w:r>
+      <w:r>
+        <w:rPr>
+          <w:lang w:val="nl"/>
+        </w:rPr>
+        <w:t xml:space="preserve"> </w:t>
+      </w:r>
+      <w:r>
+        <w:rPr>
+          <w:lang w:val="nl"/>
+        </w:rPr>
+        <w:t xml:space="preserve">wijzigen; klopt er iets niet, bijvoorbeeld na een nieuwe verhoging van het wettelijk minimumloon,</w:t>
+      </w:r>
+      <w:r>
+        <w:rPr>
+          <w:lang w:val="nl"/>
+        </w:rPr>
+        <w:t xml:space="preserve"> </w:t>
+      </w:r>
+      <w:r>
+        <w:rPr>
+          <w:lang w:val="nl"/>
+        </w:rPr>
+        <w:t xml:space="preserve">geef het dan door aan het bestuur.</w:t>
+      </w:r>
+    </w:p>
+    <w:p>
+      <w:pPr>
+        <w:pStyle w:val="BodyText"/>
+      </w:pPr>
+      <w:r>
+        <w:rPr>
+          <w:b/>
+          <w:bCs/>
+          <w:lang w:val="nl"/>
+        </w:rPr>
+        <w:t xml:space="preserve">CSV-export.</w:t>
+      </w:r>
+      <w:r>
+        <w:rPr>
+          <w:lang w:val="nl"/>
+        </w:rPr>
+        <w:t xml:space="preserve"> </w:t>
+      </w:r>
+      <w:r>
+        <w:rPr>
+          <w:lang w:val="nl"/>
+        </w:rPr>
+        <w:t xml:space="preserve">De knop</w:t>
+      </w:r>
+      <w:r>
+        <w:rPr>
+          <w:lang w:val="nl"/>
+        </w:rPr>
+        <w:t xml:space="preserve"> </w:t>
+      </w:r>
+      <w:r>
+        <w:rPr>
+          <w:b/>
+          <w:bCs/>
+          <w:lang w:val="nl"/>
+        </w:rPr>
+        <w:t xml:space="preserve">CSV</w:t>
+      </w:r>
+      <w:r>
+        <w:rPr>
+          <w:lang w:val="nl"/>
+        </w:rPr>
+        <w:t xml:space="preserve"> </w:t>
+      </w:r>
+      <w:r>
+        <w:rPr>
+          <w:lang w:val="nl"/>
+        </w:rPr>
+        <w:t xml:space="preserve">bij de scenario's downloadt het getoonde scenario als bestand voor</w:t>
+      </w:r>
+      <w:r>
+        <w:rPr>
+          <w:lang w:val="nl"/>
+        </w:rPr>
+        <w:t xml:space="preserve"> </w:t>
+      </w:r>
+      <w:r>
+        <w:rPr>
+          <w:lang w:val="nl"/>
+        </w:rPr>
+        <w:t xml:space="preserve">Excel: per persoon de naam, de leeftijd, de functie, de beschikbare en ingeplande weken, de</w:t>
+      </w:r>
+      <w:r>
+        <w:rPr>
+          <w:lang w:val="nl"/>
+        </w:rPr>
+        <w:t xml:space="preserve"> </w:t>
+      </w:r>
+      <w:r>
+        <w:rPr>
+          <w:lang w:val="nl"/>
+        </w:rPr>
+        <w:t xml:space="preserve">ingeplande dagen en de totale kosten. Gebruik het als tussenstand voor de begroting of als</w:t>
+      </w:r>
+      <w:r>
+        <w:rPr>
+          <w:lang w:val="nl"/>
+        </w:rPr>
+        <w:t xml:space="preserve"> </w:t>
+      </w:r>
+      <w:r>
+        <w:rPr>
+          <w:lang w:val="nl"/>
+        </w:rPr>
+        <w:t xml:space="preserve">controle bij de loonadministratie. Er staan geen BSN of rekeningnummers in, maar wel namen:</w:t>
+      </w:r>
+      <w:r>
+        <w:rPr>
+          <w:lang w:val="nl"/>
+        </w:rPr>
+        <w:t xml:space="preserve"> </w:t>
+      </w:r>
+      <w:r>
+        <w:rPr>
+          <w:lang w:val="nl"/>
+        </w:rPr>
+        <w:t xml:space="preserve">bewaar het bestand niet langer dan nodig.</w:t>
+      </w:r>
+    </w:p>
+    <w:bookmarkEnd w:id="21"/>
+    <w:bookmarkStart w:id="22" w:name="wat-je-nooit-doet"/>
+    <w:p>
+      <w:pPr>
+        <w:pStyle w:val="Heading1"/>
+      </w:pPr>
+      <w:r>
+        <w:rPr>
+          <w:lang w:val="nl"/>
+        </w:rPr>
+        <w:t xml:space="preserve">Wat je nooit doet</w:t>
+      </w:r>
+    </w:p>
+    <w:p>
+      <w:pPr>
+        <w:pStyle w:val="BlockText"/>
+      </w:pPr>
+      <w:r>
+        <w:rPr>
+          <w:b/>
+          <w:bCs/>
+          <w:lang w:val="nl"/>
+        </w:rPr>
+        <w:t xml:space="preserve">In het kort:</w:t>
+      </w:r>
+      <w:r>
+        <w:rPr>
+          <w:lang w:val="nl"/>
+        </w:rPr>
+        <w:t xml:space="preserve"> </w:t>
+      </w:r>
+      <w:r>
+        <w:rPr>
+          <w:lang w:val="nl"/>
+        </w:rPr>
+        <w:t xml:space="preserve">stukken blijven in het beheer en in de loonadministratie. Niet mailen, niet</w:t>
+      </w:r>
+      <w:r>
+        <w:rPr>
+          <w:lang w:val="nl"/>
+        </w:rPr>
+        <w:t xml:space="preserve"> </w:t>
+      </w:r>
+      <w:r>
+        <w:rPr>
+          <w:lang w:val="nl"/>
+        </w:rPr>
+        <w:t xml:space="preserve">kopiëren, niet delen.</w:t>
       </w:r>
     </w:p>
     <w:p>
@@ -4532,18 +5692,90 @@
         <w:pStyle w:val="Compact"/>
         <w:numPr>
           <w:ilvl w:val="0"/>
-          <w:numId w:val="1016"/>
+          <w:numId w:val="1019"/>
         </w:numPr>
       </w:pPr>
       <w:r>
         <w:rPr>
           <w:lang w:val="nl"/>
         </w:rPr>
+        <w:t xml:space="preserve">Stukken per e-mail of WhatsApp doorsturen, ook niet naar jezelf. Gebruik het beheer.</w:t>
+      </w:r>
+    </w:p>
+    <w:p>
+      <w:pPr>
+        <w:pStyle w:val="Compact"/>
+        <w:numPr>
+          <w:ilvl w:val="0"/>
+          <w:numId w:val="1019"/>
+        </w:numPr>
+      </w:pPr>
+      <w:r>
+        <w:rPr>
+          <w:lang w:val="nl"/>
+        </w:rPr>
+        <w:t xml:space="preserve">Een BSN of rekeningnummer in een spreadsheet, notitie of chat zetten buiten de</w:t>
+      </w:r>
+      <w:r>
+        <w:rPr>
+          <w:lang w:val="nl"/>
+        </w:rPr>
+        <w:t xml:space="preserve"> </w:t>
+      </w:r>
+      <w:r>
+        <w:rPr>
+          <w:lang w:val="nl"/>
+        </w:rPr>
+        <w:t xml:space="preserve">loonadministratie.</w:t>
+      </w:r>
+    </w:p>
+    <w:p>
+      <w:pPr>
+        <w:pStyle w:val="Compact"/>
+        <w:numPr>
+          <w:ilvl w:val="0"/>
+          <w:numId w:val="1019"/>
+        </w:numPr>
+      </w:pPr>
+      <w:r>
+        <w:rPr>
+          <w:lang w:val="nl"/>
+        </w:rPr>
+        <w:t xml:space="preserve">Je inlog delen. Elke download staat op jouw naam.</w:t>
+      </w:r>
+    </w:p>
+    <w:p>
+      <w:pPr>
+        <w:pStyle w:val="Compact"/>
+        <w:numPr>
+          <w:ilvl w:val="0"/>
+          <w:numId w:val="1019"/>
+        </w:numPr>
+      </w:pPr>
+      <w:r>
+        <w:rPr>
+          <w:lang w:val="nl"/>
+        </w:rPr>
+        <w:t xml:space="preserve">Screenshots maken van kopieën van identiteitsbewijzen.</w:t>
+      </w:r>
+    </w:p>
+    <w:p>
+      <w:pPr>
+        <w:pStyle w:val="Compact"/>
+        <w:numPr>
+          <w:ilvl w:val="0"/>
+          <w:numId w:val="1019"/>
+        </w:numPr>
+      </w:pPr>
+      <w:r>
+        <w:rPr>
+          <w:lang w:val="nl"/>
+        </w:rPr>
         <w:t xml:space="preserve">Gedownloade bestanden laten staan op je computer.</w:t>
       </w:r>
     </w:p>
-    <w:bookmarkEnd w:id="21"/>
-    <w:bookmarkStart w:id="22" w:name="veelgestelde-vragen"/>
+    <w:bookmarkEnd w:id="22"/>
+    <w:bookmarkStart w:id="23" w:name="veelgestelde-vragen"/>
     <w:p>
       <w:pPr>
         <w:pStyle w:val="Heading1"/>
@@ -4970,7 +6202,7 @@
           <w:bCs/>
           <w:lang w:val="nl"/>
         </w:rPr>
-        <w:t xml:space="preserve">Ik wil de loonplanning als CSV downloaden, maar dat mag niet.</w:t>
+        <w:t xml:space="preserve">Ik zie Loonplanning niet in het menu.</w:t>
       </w:r>
       <w:r>
         <w:br/>
@@ -4979,22 +6211,22 @@
         <w:rPr>
           <w:lang w:val="nl"/>
         </w:rPr>
-        <w:t xml:space="preserve">Die download vraagt het recht Loonplanning, en dat heeft de penningmeester standaard niet. Vraag</w:t>
-      </w:r>
-      <w:r>
-        <w:rPr>
-          <w:lang w:val="nl"/>
-        </w:rPr>
-        <w:t xml:space="preserve"> </w:t>
-      </w:r>
-      <w:r>
-        <w:rPr>
-          <w:lang w:val="nl"/>
-        </w:rPr>
-        <w:t xml:space="preserve">de admin om dat recht als je het nodig hebt.</w:t>
-      </w:r>
-    </w:p>
-    <w:bookmarkEnd w:id="22"/>
+        <w:t xml:space="preserve">De penningmeester heeft het recht Loonplanning standaard. Een admin kan het bij Rollen &amp; rechten</w:t>
+      </w:r>
+      <w:r>
+        <w:rPr>
+          <w:lang w:val="nl"/>
+        </w:rPr>
+        <w:t xml:space="preserve"> </w:t>
+      </w:r>
+      <w:r>
+        <w:rPr>
+          <w:lang w:val="nl"/>
+        </w:rPr>
+        <w:t xml:space="preserve">hebben weggehaald; vraag de admin om het terug te zetten als je het nodig hebt.</w:t>
+      </w:r>
+    </w:p>
+    <w:bookmarkEnd w:id="23"/>
     <w:sectPr>
       <w:footnotePr>
         <w:numRestart w:val="eachSect"/>
@@ -5421,15 +6653,21 @@
     <w:abstractNumId w:val="992"/>
   </w:num>
   <w:num w:numId="1008">
-    <w:abstractNumId w:val="991"/>
+    <w:abstractNumId w:val="992"/>
   </w:num>
   <w:num w:numId="1009">
-    <w:abstractNumId w:val="991"/>
+    <w:abstractNumId w:val="992"/>
   </w:num>
   <w:num w:numId="1010">
     <w:abstractNumId w:val="991"/>
   </w:num>
   <w:num w:numId="1011">
+    <w:abstractNumId w:val="991"/>
+  </w:num>
+  <w:num w:numId="1012">
+    <w:abstractNumId w:val="991"/>
+  </w:num>
+  <w:num w:numId="1013">
     <w:abstractNumId w:val="99411"/>
     <w:lvlOverride w:ilvl="0">
       <w:startOverride w:val="1"/>
@@ -5458,39 +6696,6 @@
     <w:lvlOverride w:ilvl="8">
       <w:startOverride w:val="1"/>
     </w:lvlOverride>
-  </w:num>
-  <w:num w:numId="1012">
-    <w:abstractNumId w:val="99411"/>
-    <w:lvlOverride w:ilvl="0">
-      <w:startOverride w:val="1"/>
-    </w:lvlOverride>
-    <w:lvlOverride w:ilvl="1">
-      <w:startOverride w:val="1"/>
-    </w:lvlOverride>
-    <w:lvlOverride w:ilvl="2">
-      <w:startOverride w:val="1"/>
-    </w:lvlOverride>
-    <w:lvlOverride w:ilvl="3">
-      <w:startOverride w:val="1"/>
-    </w:lvlOverride>
-    <w:lvlOverride w:ilvl="4">
-      <w:startOverride w:val="1"/>
-    </w:lvlOverride>
-    <w:lvlOverride w:ilvl="5">
-      <w:startOverride w:val="1"/>
-    </w:lvlOverride>
-    <w:lvlOverride w:ilvl="6">
-      <w:startOverride w:val="1"/>
-    </w:lvlOverride>
-    <w:lvlOverride w:ilvl="7">
-      <w:startOverride w:val="1"/>
-    </w:lvlOverride>
-    <w:lvlOverride w:ilvl="8">
-      <w:startOverride w:val="1"/>
-    </w:lvlOverride>
-  </w:num>
-  <w:num w:numId="1013">
-    <w:abstractNumId w:val="991"/>
   </w:num>
   <w:num w:numId="1014">
     <w:abstractNumId w:val="99411"/>
@@ -5526,6 +6731,42 @@
     <w:abstractNumId w:val="991"/>
   </w:num>
   <w:num w:numId="1016">
+    <w:abstractNumId w:val="99411"/>
+    <w:lvlOverride w:ilvl="0">
+      <w:startOverride w:val="1"/>
+    </w:lvlOverride>
+    <w:lvlOverride w:ilvl="1">
+      <w:startOverride w:val="1"/>
+    </w:lvlOverride>
+    <w:lvlOverride w:ilvl="2">
+      <w:startOverride w:val="1"/>
+    </w:lvlOverride>
+    <w:lvlOverride w:ilvl="3">
+      <w:startOverride w:val="1"/>
+    </w:lvlOverride>
+    <w:lvlOverride w:ilvl="4">
+      <w:startOverride w:val="1"/>
+    </w:lvlOverride>
+    <w:lvlOverride w:ilvl="5">
+      <w:startOverride w:val="1"/>
+    </w:lvlOverride>
+    <w:lvlOverride w:ilvl="6">
+      <w:startOverride w:val="1"/>
+    </w:lvlOverride>
+    <w:lvlOverride w:ilvl="7">
+      <w:startOverride w:val="1"/>
+    </w:lvlOverride>
+    <w:lvlOverride w:ilvl="8">
+      <w:startOverride w:val="1"/>
+    </w:lvlOverride>
+  </w:num>
+  <w:num w:numId="1017">
+    <w:abstractNumId w:val="991"/>
+  </w:num>
+  <w:num w:numId="1018">
+    <w:abstractNumId w:val="991"/>
+  </w:num>
+  <w:num w:numId="1019">
     <w:abstractNumId w:val="991"/>
   </w:num>
 </w:numbering>

</xml_diff>

<commit_message>
Loontarieven per jaar, loondossiers per seizoen, ontbrekende instellingsvelden
- loon_tarieven.jaar + tabel loon_jaar (VT, werkuren, postcommandant, budget per kalenderjaar); jaar van een seizoen = jaar eerste werkdag; terugval op vorig jaar met melding
- Instellingen > Lonen & budget: jaarkeuze, Nieuw jaar op basis van vorig jaar; alle berekeningen via loon_tarieven_voor_seizoen()
- Migratie in loon_tarieven_auto_setup() (schema_actueel-guard, in db_failsafe)
- Loondossiers: seizoenkeuze; vernietiglijst blijft over alle seizoenen
- Velden voor bewaar.loondocumenten_jaar, privacy.url, ondertekenen.2fa_typen, tw.bericht_afgewezen_niet_gekomen
</commit_message>
<xml_diff>
--- a/docs/handleiding/word/handleiding_penningmeester.docx
+++ b/docs/handleiding/word/handleiding_penningmeester.docx
@@ -636,19 +636,19 @@
         <w:rPr>
           <w:lang w:val="nl"/>
         </w:rPr>
-        <w:t xml:space="preserve">geef het bestuur het seizoensbudget voor loonkosten door. Het bestuur</w:t>
-      </w:r>
-      <w:r>
-        <w:rPr>
-          <w:lang w:val="nl"/>
-        </w:rPr>
-        <w:t xml:space="preserve"> </w:t>
-      </w:r>
-      <w:r>
-        <w:rPr>
-          <w:lang w:val="nl"/>
-        </w:rPr>
-        <w:t xml:space="preserve">vult dat in bij Instellingen › Lonen &amp; budget, samen met de minimumlonen. Daarna zie je in de</w:t>
+        <w:t xml:space="preserve">geef het bestuur het budget voor loonkosten van dat jaar door. Het bestuur</w:t>
+      </w:r>
+      <w:r>
+        <w:rPr>
+          <w:lang w:val="nl"/>
+        </w:rPr>
+        <w:t xml:space="preserve"> </w:t>
+      </w:r>
+      <w:r>
+        <w:rPr>
+          <w:lang w:val="nl"/>
+        </w:rPr>
+        <w:t xml:space="preserve">vult dat in bij Instellingen › Lonen &amp; budget (per jaar), samen met de minimumlonen van dat jaar. Daarna zie je in de</w:t>
       </w:r>
       <w:r>
         <w:rPr>

</xml_diff>

<commit_message>
Handleidingen: HTML en Word bijgewerkt (2.146 t/m 2.157)
</commit_message>
<xml_diff>
--- a/docs/handleiding/word/handleiding_penningmeester.docx
+++ b/docs/handleiding/word/handleiding_penningmeester.docx
@@ -7968,7 +7968,69 @@
         <w:rPr>
           <w:lang w:val="nl"/>
         </w:rPr>
-        <w:t xml:space="preserve">er "Vast na het gesprek op het trainingsweekend: dit is met de sollicitant besproken." Aanpassen kan dan niet.</w:t>
+        <w:t xml:space="preserve">er "Vast na het gesprek op het trainingsweekend: dit is met de sollicitant besproken. Aanpassen kan</w:t>
+      </w:r>
+      <w:r>
+        <w:rPr>
+          <w:lang w:val="nl"/>
+        </w:rPr>
+        <w:t xml:space="preserve"> </w:t>
+      </w:r>
+      <w:r>
+        <w:rPr>
+          <w:lang w:val="nl"/>
+        </w:rPr>
+        <w:t xml:space="preserve">via de persoon (naam aanklikken) → Ontgrendelen." Zolang het slot erop zit, kun je de weken niet</w:t>
+      </w:r>
+      <w:r>
+        <w:rPr>
+          <w:lang w:val="nl"/>
+        </w:rPr>
+        <w:t xml:space="preserve"> </w:t>
+      </w:r>
+      <w:r>
+        <w:rPr>
+          <w:lang w:val="nl"/>
+        </w:rPr>
+        <w:t xml:space="preserve">wijzigen. Klik je op de naam, dan staat onder</w:t>
+      </w:r>
+      <w:r>
+        <w:rPr>
+          <w:lang w:val="nl"/>
+        </w:rPr>
+        <w:t xml:space="preserve"> </w:t>
+      </w:r>
+      <w:r>
+        <w:rPr>
+          <w:b/>
+          <w:bCs/>
+          <w:lang w:val="nl"/>
+        </w:rPr>
+        <w:t xml:space="preserve">Vast in alle scenario's</w:t>
+      </w:r>
+      <w:r>
+        <w:rPr>
+          <w:lang w:val="nl"/>
+        </w:rPr>
+        <w:t xml:space="preserve"> </w:t>
+      </w:r>
+      <w:r>
+        <w:rPr>
+          <w:lang w:val="nl"/>
+        </w:rPr>
+        <w:t xml:space="preserve">"Vastgezet op ..., in alle</w:t>
+      </w:r>
+      <w:r>
+        <w:rPr>
+          <w:lang w:val="nl"/>
+        </w:rPr>
+        <w:t xml:space="preserve"> </w:t>
+      </w:r>
+      <w:r>
+        <w:rPr>
+          <w:lang w:val="nl"/>
+        </w:rPr>
+        <w:t xml:space="preserve">scenario's."</w:t>
       </w:r>
     </w:p>
     <w:p>
@@ -7994,45 +8056,75 @@
         <w:rPr>
           <w:lang w:val="nl"/>
         </w:rPr>
-        <w:t xml:space="preserve">Klik op de naam. Vul bij</w:t>
-      </w:r>
-      <w:r>
-        <w:rPr>
-          <w:lang w:val="nl"/>
-        </w:rPr>
-        <w:t xml:space="preserve"> </w:t>
-      </w:r>
-      <w:r>
-        <w:rPr>
-          <w:b/>
-          <w:bCs/>
-          <w:lang w:val="nl"/>
-        </w:rPr>
-        <w:t xml:space="preserve">Waarom pas je het aan? (komt in het logboek)</w:t>
-      </w:r>
-      <w:r>
-        <w:rPr>
-          <w:lang w:val="nl"/>
-        </w:rPr>
-        <w:t xml:space="preserve"> </w:t>
-      </w:r>
-      <w:r>
-        <w:rPr>
-          <w:lang w:val="nl"/>
-        </w:rPr>
-        <w:t xml:space="preserve">een reden in en klik</w:t>
-      </w:r>
-      <w:r>
-        <w:rPr>
-          <w:lang w:val="nl"/>
-        </w:rPr>
-        <w:t xml:space="preserve"> </w:t>
-      </w:r>
-      <w:r>
-        <w:rPr>
-          <w:lang w:val="nl"/>
-        </w:rPr>
-        <w:t xml:space="preserve">op</w:t>
+        <w:t xml:space="preserve">Klik op de naam. Vul onder</w:t>
+      </w:r>
+      <w:r>
+        <w:rPr>
+          <w:lang w:val="nl"/>
+        </w:rPr>
+        <w:t xml:space="preserve"> </w:t>
+      </w:r>
+      <w:r>
+        <w:rPr>
+          <w:b/>
+          <w:bCs/>
+          <w:lang w:val="nl"/>
+        </w:rPr>
+        <w:t xml:space="preserve">Vast in alle scenario's</w:t>
+      </w:r>
+      <w:r>
+        <w:rPr>
+          <w:lang w:val="nl"/>
+        </w:rPr>
+        <w:t xml:space="preserve"> </w:t>
+      </w:r>
+      <w:r>
+        <w:rPr>
+          <w:lang w:val="nl"/>
+        </w:rPr>
+        <w:t xml:space="preserve">bij</w:t>
+      </w:r>
+      <w:r>
+        <w:rPr>
+          <w:lang w:val="nl"/>
+        </w:rPr>
+        <w:t xml:space="preserve"> </w:t>
+      </w:r>
+      <w:r>
+        <w:rPr>
+          <w:b/>
+          <w:bCs/>
+          <w:lang w:val="nl"/>
+        </w:rPr>
+        <w:t xml:space="preserve">Waarom pas je het aan? (komt in het</w:t>
+      </w:r>
+      <w:r>
+        <w:rPr>
+          <w:b/>
+          <w:bCs/>
+          <w:lang w:val="nl"/>
+        </w:rPr>
+        <w:t xml:space="preserve"> </w:t>
+      </w:r>
+      <w:r>
+        <w:rPr>
+          <w:b/>
+          <w:bCs/>
+          <w:lang w:val="nl"/>
+        </w:rPr>
+        <w:t xml:space="preserve">logboek)</w:t>
+      </w:r>
+      <w:r>
+        <w:rPr>
+          <w:lang w:val="nl"/>
+        </w:rPr>
+        <w:t xml:space="preserve"> </w:t>
+      </w:r>
+      <w:r>
+        <w:rPr>
+          <w:lang w:val="nl"/>
+        </w:rPr>
+        <w:t xml:space="preserve">een reden in en klik op</w:t>
       </w:r>
       <w:r>
         <w:rPr>
@@ -11560,7 +11652,19 @@
         <w:rPr>
           <w:lang w:val="nl"/>
         </w:rPr>
-        <w:t xml:space="preserve">gemarkeerd. Alles staat versleuteld in de kluis; alleen jij en de beheerder kunnen het openen.</w:t>
+        <w:t xml:space="preserve">gemarkeerd. Alles staat versleuteld in de kluis; alleen jij kunt het openen. De beheerder ziet wel</w:t>
+      </w:r>
+      <w:r>
+        <w:rPr>
+          <w:lang w:val="nl"/>
+        </w:rPr>
+        <w:t xml:space="preserve"> </w:t>
+      </w:r>
+      <w:r>
+        <w:rPr>
+          <w:lang w:val="nl"/>
+        </w:rPr>
+        <w:t xml:space="preserve">of de stukken er zijn en kan ze vernietigen, maar opent de inhoud niet.</w:t>
       </w:r>
     </w:p>
     <w:bookmarkEnd w:id="37"/>
@@ -11984,7 +12088,77 @@
         <w:rPr>
           <w:lang w:val="nl"/>
         </w:rPr>
-        <w:t xml:space="preserve">penningmeester en beheerder. Het bestuur ziet dit scherm niet.</w:t>
+        <w:t xml:space="preserve">penningmeester en beheerder. Het bestuur ziet dit scherm niet. De beheerder ziet de stand</w:t>
+      </w:r>
+      <w:r>
+        <w:rPr>
+          <w:lang w:val="nl"/>
+        </w:rPr>
+        <w:t xml:space="preserve"> </w:t>
+      </w:r>
+      <w:r>
+        <w:rPr>
+          <w:lang w:val="nl"/>
+        </w:rPr>
+        <w:t xml:space="preserve">en kan vernietigen, maar krijgt geen knoppen</w:t>
+      </w:r>
+      <w:r>
+        <w:rPr>
+          <w:lang w:val="nl"/>
+        </w:rPr>
+        <w:t xml:space="preserve"> </w:t>
+      </w:r>
+      <w:r>
+        <w:rPr>
+          <w:b/>
+          <w:bCs/>
+          <w:lang w:val="nl"/>
+        </w:rPr>
+        <w:t xml:space="preserve">PDF</w:t>
+      </w:r>
+      <w:r>
+        <w:rPr>
+          <w:lang w:val="nl"/>
+        </w:rPr>
+        <w:t xml:space="preserve"> </w:t>
+      </w:r>
+      <w:r>
+        <w:rPr>
+          <w:lang w:val="nl"/>
+        </w:rPr>
+        <w:t xml:space="preserve">en</w:t>
+      </w:r>
+      <w:r>
+        <w:rPr>
+          <w:lang w:val="nl"/>
+        </w:rPr>
+        <w:t xml:space="preserve"> </w:t>
+      </w:r>
+      <w:r>
+        <w:rPr>
+          <w:b/>
+          <w:bCs/>
+          <w:lang w:val="nl"/>
+        </w:rPr>
+        <w:t xml:space="preserve">Download</w:t>
+      </w:r>
+      <w:r>
+        <w:rPr>
+          <w:lang w:val="nl"/>
+        </w:rPr>
+        <w:t xml:space="preserve">: de inhoud opent alleen de</w:t>
+      </w:r>
+      <w:r>
+        <w:rPr>
+          <w:lang w:val="nl"/>
+        </w:rPr>
+        <w:t xml:space="preserve"> </w:t>
+      </w:r>
+      <w:r>
+        <w:rPr>
+          <w:lang w:val="nl"/>
+        </w:rPr>
+        <w:t xml:space="preserve">penningmeester.</w:t>
       </w:r>
     </w:p>
     <w:p>
@@ -13039,7 +13213,7 @@
         <w:rPr>
           <w:lang w:val="nl"/>
         </w:rPr>
-        <w:t xml:space="preserve">download wordt vastgelegd en foto's krijgen een watermerk met jouw naam.</w:t>
+        <w:t xml:space="preserve">download wordt vastgelegd en een foto van de bankpas krijgt een watermerk met jouw naam.</w:t>
       </w:r>
     </w:p>
     <w:p>
@@ -13121,31 +13295,69 @@
         <w:rPr>
           <w:lang w:val="nl"/>
         </w:rPr>
-        <w:t xml:space="preserve">Op foto's (JPG of PNG) van het identiteitsbewijs en de bankpas staat een watermerk: "Kopie voor</w:t>
-      </w:r>
-      <w:r>
-        <w:rPr>
-          <w:lang w:val="nl"/>
-        </w:rPr>
-        <w:t xml:space="preserve"> </w:t>
-      </w:r>
-      <w:r>
-        <w:rPr>
-          <w:lang w:val="nl"/>
-        </w:rPr>
-        <w:t xml:space="preserve">loonadministratie Reddingsbrigade Paal 13", de datum en jouw naam. Het origineel in de kluis</w:t>
-      </w:r>
-      <w:r>
-        <w:rPr>
-          <w:lang w:val="nl"/>
-        </w:rPr>
-        <w:t xml:space="preserve"> </w:t>
-      </w:r>
-      <w:r>
-        <w:rPr>
-          <w:lang w:val="nl"/>
-        </w:rPr>
-        <w:t xml:space="preserve">blijft ongewijzigd. Een kopie die als PDF is geüpload krijgt geen watermerk.</w:t>
+        <w:t xml:space="preserve">Op een foto (JPG of PNG) van de bankpas staat een watermerk: "Kopie voor loonadministratie</w:t>
+      </w:r>
+      <w:r>
+        <w:rPr>
+          <w:lang w:val="nl"/>
+        </w:rPr>
+        <w:t xml:space="preserve"> </w:t>
+      </w:r>
+      <w:r>
+        <w:rPr>
+          <w:lang w:val="nl"/>
+        </w:rPr>
+        <w:t xml:space="preserve">Reddingsbrigade Paal 13", de datum en jouw naam. De kopie van het identiteitsbewijs krijgt</w:t>
+      </w:r>
+      <w:r>
+        <w:rPr>
+          <w:lang w:val="nl"/>
+        </w:rPr>
+        <w:t xml:space="preserve"> </w:t>
+      </w:r>
+      <w:r>
+        <w:rPr>
+          <w:b/>
+          <w:bCs/>
+          <w:lang w:val="nl"/>
+        </w:rPr>
+        <w:t xml:space="preserve">geen</w:t>
+      </w:r>
+      <w:r>
+        <w:rPr>
+          <w:lang w:val="nl"/>
+        </w:rPr>
+        <w:t xml:space="preserve"> </w:t>
+      </w:r>
+      <w:r>
+        <w:rPr>
+          <w:lang w:val="nl"/>
+        </w:rPr>
+        <w:t xml:space="preserve">watermerk: die bewaar je wettelijk verplicht in de loonadministratie, en de foto en alle</w:t>
+      </w:r>
+      <w:r>
+        <w:rPr>
+          <w:lang w:val="nl"/>
+        </w:rPr>
+        <w:t xml:space="preserve"> </w:t>
+      </w:r>
+      <w:r>
+        <w:rPr>
+          <w:lang w:val="nl"/>
+        </w:rPr>
+        <w:t xml:space="preserve">gegevens moeten dan volledig leesbaar zijn. Het origineel in de kluis blijft altijd ongewijzigd.</w:t>
+      </w:r>
+      <w:r>
+        <w:rPr>
+          <w:lang w:val="nl"/>
+        </w:rPr>
+        <w:t xml:space="preserve"> </w:t>
+      </w:r>
+      <w:r>
+        <w:rPr>
+          <w:lang w:val="nl"/>
+        </w:rPr>
+        <w:t xml:space="preserve">Een kopie die als PDF is geüpload krijgt geen watermerk.</w:t>
       </w:r>
     </w:p>
     <w:p>
@@ -15922,7 +16134,7 @@
           <w:bCs/>
           <w:lang w:val="nl"/>
         </w:rPr>
-        <w:t xml:space="preserve">Ik zie een watermerk op de ID-kopie. Kan dat weg?</w:t>
+        <w:t xml:space="preserve">Waarom heeft de ID-kopie geen watermerk en de bankpas wel?</w:t>
       </w:r>
       <w:r>
         <w:br/>
@@ -15931,19 +16143,43 @@
         <w:rPr>
           <w:lang w:val="nl"/>
         </w:rPr>
-        <w:t xml:space="preserve">Nee. Het watermerk is bewust en beschermt tegen misbruik van de kopie. Voor de loonadministratie</w:t>
-      </w:r>
-      <w:r>
-        <w:rPr>
-          <w:lang w:val="nl"/>
-        </w:rPr>
-        <w:t xml:space="preserve"> </w:t>
-      </w:r>
-      <w:r>
-        <w:rPr>
-          <w:lang w:val="nl"/>
-        </w:rPr>
-        <w:t xml:space="preserve">is een kopie mét watermerk gewoon geldig.</w:t>
+        <w:t xml:space="preserve">De kopie van het identiteitsbewijs is een verplicht stuk in de loonadministratie. Bij een controle</w:t>
+      </w:r>
+      <w:r>
+        <w:rPr>
+          <w:lang w:val="nl"/>
+        </w:rPr>
+        <w:t xml:space="preserve"> </w:t>
+      </w:r>
+      <w:r>
+        <w:rPr>
+          <w:lang w:val="nl"/>
+        </w:rPr>
+        <w:t xml:space="preserve">moeten de foto en alle gegevens volledig leesbaar zijn; anders kan de Belastingdienst het</w:t>
+      </w:r>
+      <w:r>
+        <w:rPr>
+          <w:lang w:val="nl"/>
+        </w:rPr>
+        <w:t xml:space="preserve"> </w:t>
+      </w:r>
+      <w:r>
+        <w:rPr>
+          <w:lang w:val="nl"/>
+        </w:rPr>
+        <w:t xml:space="preserve">anoniementarief toepassen. Daarom staat er sinds versie 2.150 geen watermerk meer op. De bankpas is</w:t>
+      </w:r>
+      <w:r>
+        <w:rPr>
+          <w:lang w:val="nl"/>
+        </w:rPr>
+        <w:t xml:space="preserve"> </w:t>
+      </w:r>
+      <w:r>
+        <w:rPr>
+          <w:lang w:val="nl"/>
+        </w:rPr>
+        <w:t xml:space="preserve">niet wettelijk verplicht en houdt het watermerk als bescherming tegen misbruik.</w:t>
       </w:r>
     </w:p>
     <w:p>

</xml_diff>